<commit_message>
Strengthen Lab2 coverage and rollback handling
</commit_message>
<xml_diff>
--- a/DesignFiles/Report/EcoLab2_Report.docx
+++ b/DesignFiles/Report/EcoLab2_Report.docx
@@ -1278,7 +1278,7 @@
     </w:p>
     <w:p>
       <w:r>
-        <w:t>При создании B, E и Eco.Lab1 фабрика получает pIUnknownOuter, которым является controlling unknown Eco.Lab2. Запрос IEcoUnknown агрегированной части возвращает identity внешнего объекта. Eco.Lab2 хранит интерфейсы дочерних объектов и освобождает их до освобождения собственного allocator и system.</w:t>
+        <w:t>При создании B, E и Eco.Lab1 фабрика получает pIUnknownOuter, которым является controlling unknown Eco.Lab2. Запрос IEcoUnknown агрегированной части возвращает identity внешнего объекта. Eco.Lab2 хранит обычные A/C/D-интерфейсы как владеемые ссылки, а агрегированные Lab1/B/E views — как borrowed views; при завершении он освобождает агрегированные объекты через owner-aware destroy до освобождения allocator и system.</w:t>
       </w:r>
     </w:p>
     <w:p>
@@ -1900,7 +1900,7 @@
                 <w:b w:val="0"/>
                 <w:sz w:val="19"/>
               </w:rPr>
-              <w:t>103/0</w:t>
+              <w:t>108/0</w:t>
             </w:r>
           </w:p>
         </w:tc>
@@ -1937,7 +1937,7 @@
         <w:pStyle w:val="ListBullet"/>
       </w:pPr>
       <w:r>
-        <w:t>make ECO_FRAMEWORK=/Users/danial2006/Downloads/Eco.Framework eco-test — 103 проверки, ошибок 0.</w:t>
+        <w:t>make ECO_FRAMEWORK=/Users/danial2006/Downloads/Eco.Framework eco-test — 108 проверки, ошибок 0.</w:t>
       </w:r>
     </w:p>
     <w:p>
@@ -1970,6 +1970,42 @@
       </w:r>
     </w:p>
     <w:p>
+      <w:r>
+        <w:rPr>
+          <w:rFonts w:ascii="Arial" w:hAnsi="Arial"/>
+          <w:sz w:val="19"/>
+        </w:rPr>
+        <w:t>Команды Xcode:</w:t>
+      </w:r>
+    </w:p>
+    <w:p>
+      <w:r>
+        <w:rPr>
+          <w:rFonts w:ascii="Arial" w:hAnsi="Arial"/>
+          <w:sz w:val="19"/>
+        </w:rPr>
+        <w:t>xcodebuild -project AssemblyFiles/Mac/Xcode_v123/EcoLab1.xcodeproj -scheme Static -configuration Debug -derivedDataPath BuildFiles/XcodeComponentStaticDebug -jobs 1 ECO_FRAMEWORK=/Users/danial2006/Downloads/Eco.Framework CODE_SIGNING_ALLOWED=NO build</w:t>
+      </w:r>
+    </w:p>
+    <w:p>
+      <w:r>
+        <w:rPr>
+          <w:rFonts w:ascii="Arial" w:hAnsi="Arial"/>
+          <w:sz w:val="19"/>
+        </w:rPr>
+        <w:t>xcodebuild -project AssemblyFiles/Mac/Xcode_v123/EcoLab1.xcodeproj -scheme Dynamic -configuration Release -derivedDataPath BuildFiles/XcodeComponentDynamicRelease -jobs 1 ECO_FRAMEWORK=/Users/danial2006/Downloads/Eco.Framework CODE_SIGNING_ALLOWED=NO build</w:t>
+      </w:r>
+    </w:p>
+    <w:p>
+      <w:r>
+        <w:rPr>
+          <w:rFonts w:ascii="Arial" w:hAnsi="Arial"/>
+          <w:sz w:val="19"/>
+        </w:rPr>
+        <w:t>xcodebuild -project AssemblyFiles/Mac/Xcode_v123/EcoLab1UnitTest.xcodeproj -scheme Static -configuration Debug -derivedDataPath BuildFiles/XcodeUnitDebug -jobs 1 ECO_FRAMEWORK=/Users/danial2006/Downloads/Eco.Framework CODE_SIGNING_ALLOWED=NO build</w:t>
+      </w:r>
+    </w:p>
+    <w:p>
       <w:pPr>
         <w:pStyle w:val="Heading1"/>
       </w:pPr>
@@ -1979,7 +2015,7 @@
     </w:p>
     <w:p>
       <w:r>
-        <w:t>В лабораторной работе №2 реализован полноценный ACOM-граф: компоненты A–E, расширенный Eco.Lab1 и внешний Eco.Lab2. Продемонстрированы включение, агрегирование, controlling unknown, переходы QueryInterface и корректное управление временем жизни объектов. Реальные проверки через Eco Interface Bus завершились результатом 103 успешных проверки без ошибок, а тесты polyfit лабораторной работы №1 сохранены.</w:t>
+        <w:t>В лабораторной работе №2 реализован полноценный ACOM-граф: компоненты A–E, расширенный Eco.Lab1 и внешний Eco.Lab2. Продемонстрированы включение, агрегирование, controlling unknown, переходы QueryInterface и корректное управление временем жизни объектов. Реальные проверки через Eco Interface Bus завершились результатом 108 успешных проверки без ошибок, а тесты polyfit лабораторной работы №1 сохранены.</w:t>
       </w:r>
     </w:p>
     <w:sectPr>

</xml_diff>

<commit_message>
Fix ACOM aggregation, real composition and verification for Lab2
</commit_message>
<xml_diff>
--- a/DesignFiles/Report/EcoLab2_Report.docx
+++ b/DesignFiles/Report/EcoLab2_Report.docx
@@ -4,54 +4,72 @@
   <w:body>
     <w:p>
       <w:pPr>
-        <w:spacing w:before="1600"/>
+        <w:widowControl/>
+        <w:spacing w:after="1120"/>
+      </w:pPr>
+    </w:p>
+    <w:p>
+      <w:pPr>
+        <w:pStyle w:val="Title"/>
+        <w:widowControl/>
         <w:jc w:val="center"/>
       </w:pPr>
       <w:r>
         <w:rPr>
-          <w:rFonts w:ascii="Arial" w:hAnsi="Arial"/>
-          <w:b/>
-          <w:color w:val="1F4E79"/>
-          <w:sz w:val="48"/>
+          <w:color w:val="000000"/>
         </w:rPr>
-        <w:t>Лабораторная работа №2</w:t>
+        <w:t>Лабораторная работа 2</w:t>
       </w:r>
     </w:p>
     <w:p>
       <w:pPr>
+        <w:widowControl/>
         <w:jc w:val="center"/>
       </w:pPr>
       <w:r>
         <w:rPr>
-          <w:rFonts w:ascii="Arial" w:hAnsi="Arial"/>
           <w:b/>
-          <w:sz w:val="32"/>
+          <w:sz w:val="36"/>
         </w:rPr>
-        <w:t>Включение и агрегирование компонентов ACOM</w:t>
+        <w:t>Включение и агрегирование</w:t>
+        <w:br/>
+        <w:t>компонентов ACOM</w:t>
       </w:r>
     </w:p>
     <w:p>
       <w:pPr>
-        <w:spacing w:before="600"/>
+        <w:widowControl/>
+        <w:spacing w:after="440"/>
+      </w:pPr>
+    </w:p>
+    <w:p>
+      <w:pPr>
+        <w:widowControl/>
         <w:jc w:val="center"/>
       </w:pPr>
       <w:r>
         <w:rPr>
-          <w:rFonts w:ascii="Arial" w:hAnsi="Arial"/>
-          <w:sz w:val="24"/>
+          <w:sz w:val="28"/>
         </w:rPr>
-        <w:t>Eco.Lab1, Eco.Lab2 и компоненты-калькуляторы A–E</w:t>
+        <w:t>Eco.Lab1 и Eco.Lab2</w:t>
+        <w:br/>
+        <w:t>Калькуляторные компоненты A–E</w:t>
       </w:r>
     </w:p>
     <w:p>
       <w:pPr>
-        <w:spacing w:before="3600"/>
+        <w:widowControl/>
+        <w:spacing w:after="1560"/>
+      </w:pPr>
+    </w:p>
+    <w:p>
+      <w:pPr>
+        <w:widowControl/>
         <w:jc w:val="center"/>
       </w:pPr>
       <w:r>
         <w:rPr>
-          <w:rFonts w:ascii="Arial" w:hAnsi="Arial"/>
-          <w:sz w:val="24"/>
+          <w:sz w:val="28"/>
         </w:rPr>
         <w:t>Выполнил</w:t>
         <w:br/>
@@ -62,100 +80,17 @@
     </w:p>
     <w:p>
       <w:pPr>
-        <w:spacing w:before="700"/>
+        <w:widowControl/>
+        <w:spacing w:after="900"/>
+      </w:pPr>
+    </w:p>
+    <w:p>
+      <w:pPr>
+        <w:widowControl/>
         <w:jc w:val="center"/>
       </w:pPr>
       <w:r>
-        <w:rPr>
-          <w:rFonts w:ascii="Arial" w:hAnsi="Arial"/>
-          <w:sz w:val="22"/>
-        </w:rPr>
         <w:t>Москва, 2026</w:t>
-      </w:r>
-    </w:p>
-    <w:p>
-      <w:r>
-        <w:br w:type="page"/>
-      </w:r>
-    </w:p>
-    <w:p>
-      <w:pPr>
-        <w:pStyle w:val="Title"/>
-      </w:pPr>
-      <w:r>
-        <w:t>Содержание</w:t>
-      </w:r>
-    </w:p>
-    <w:p>
-      <w:pPr>
-        <w:spacing w:after="100"/>
-        <w:ind w:left="288"/>
-      </w:pPr>
-      <w:r>
-        <w:t>1. Постановка задачи</w:t>
-      </w:r>
-    </w:p>
-    <w:p>
-      <w:pPr>
-        <w:spacing w:after="100"/>
-        <w:ind w:left="288"/>
-      </w:pPr>
-      <w:r>
-        <w:t>2. Архитектура решения</w:t>
-      </w:r>
-    </w:p>
-    <w:p>
-      <w:pPr>
-        <w:spacing w:after="100"/>
-        <w:ind w:left="288"/>
-      </w:pPr>
-      <w:r>
-        <w:t>3. Интерфейсы ACOM</w:t>
-      </w:r>
-    </w:p>
-    <w:p>
-      <w:pPr>
-        <w:spacing w:after="100"/>
-        <w:ind w:left="288"/>
-      </w:pPr>
-      <w:r>
-        <w:t>4. Включение и агрегирование</w:t>
-      </w:r>
-    </w:p>
-    <w:p>
-      <w:pPr>
-        <w:spacing w:after="100"/>
-        <w:ind w:left="288"/>
-      </w:pPr>
-      <w:r>
-        <w:t>5. Реализация Eco.Lab2</w:t>
-      </w:r>
-    </w:p>
-    <w:p>
-      <w:pPr>
-        <w:spacing w:after="100"/>
-        <w:ind w:left="288"/>
-      </w:pPr>
-      <w:r>
-        <w:t>6. UnitTest и критерии проверки</w:t>
-      </w:r>
-    </w:p>
-    <w:p>
-      <w:pPr>
-        <w:spacing w:after="100"/>
-        <w:ind w:left="288"/>
-      </w:pPr>
-      <w:r>
-        <w:t>7. Сборка и результаты</w:t>
-      </w:r>
-    </w:p>
-    <w:p>
-      <w:pPr>
-        <w:spacing w:after="100"/>
-        <w:ind w:left="288"/>
-      </w:pPr>
-      <w:r>
-        <w:t>8. Выводы</w:t>
       </w:r>
     </w:p>
     <w:p>
@@ -168,17 +103,477 @@
         <w:pStyle w:val="Heading1"/>
       </w:pPr>
       <w:r>
-        <w:t>1. Постановка задачи</w:t>
+        <w:rPr>
+          <w:color w:val="000000"/>
+        </w:rPr>
+        <w:t>1 Постановка задачи и критерии</w:t>
+      </w:r>
+    </w:p>
+    <w:p>
+      <w:pPr>
+        <w:widowControl/>
+      </w:pPr>
+      <w:r>
+        <w:t>Цель работы — расширить компонент полиномиальной аппроксимации из ЛР1 калькуляторными интерфейсами и показать реальное взаимодействие ACOM-компонентов через включение и агрегирование. Для внешнего компонента Eco.Lab2 компонент Eco.Lab1 поддерживает агрегирование с общим управляющим IEcoUnknown.</w:t>
+      </w:r>
+    </w:p>
+    <w:p>
+      <w:pPr>
+        <w:widowControl/>
+      </w:pPr>
+      <w:r>
+        <w:t>Работа выполнена по «Задание_2.pdf». Максимальный критерий требует нового Eco.Lab2, поддержки внешнего агрегирования Eco.Lab1 и демонстрации включения/агрегирования всех A, B, C, D, E, Eco.Lab1. В клиенте необходимо показать переходы QueryInterface между поддерживаемыми интерфейсами.</w:t>
+      </w:r>
+    </w:p>
+    <w:tbl>
+      <w:tblPr>
+        <w:tblW w:type="auto" w:w="0"/>
+        <w:jc w:val="center"/>
+        <w:tblLayout w:type="fixed"/>
+        <w:tblLook w:firstColumn="1" w:firstRow="1" w:lastColumn="0" w:lastRow="0" w:noHBand="0" w:noVBand="1" w:val="04A0"/>
+      </w:tblPr>
+      <w:tblGrid>
+        <w:gridCol w:w="4819"/>
+        <w:gridCol w:w="4819"/>
+      </w:tblGrid>
+      <w:tr>
+        <w:trPr>
+          <w:cantSplit/>
+          <w:tblHeader/>
+        </w:trPr>
+        <w:tc>
+          <w:tcPr>
+            <w:tcW w:type="dxa" w:w="2891"/>
+            <w:vAlign w:val="center"/>
+            <w:tcMar>
+              <w:top w:w="75" w:type="dxa"/>
+              <w:bottom w:w="75" w:type="dxa"/>
+              <w:left w:w="95" w:type="dxa"/>
+              <w:right w:w="95" w:type="dxa"/>
+            </w:tcMar>
+            <w:shd w:fill="24577A"/>
+            <w:tcBorders>
+              <w:top w:val="single" w:sz="4" w:color="D9D9D9"/>
+              <w:left w:val="single" w:sz="4" w:color="D9D9D9"/>
+              <w:bottom w:val="single" w:sz="4" w:color="D9D9D9"/>
+              <w:right w:val="single" w:sz="4" w:color="D9D9D9"/>
+            </w:tcBorders>
+          </w:tcPr>
+          <w:p>
+            <w:pPr>
+              <w:spacing w:after="20" w:before="20" w:line="247" w:lineRule="auto"/>
+            </w:pPr>
+            <w:r>
+              <w:rPr>
+                <w:rFonts w:ascii="Arial" w:hAnsi="Arial"/>
+                <w:b/>
+                <w:color w:val="FFFFFF"/>
+                <w:sz w:val="19"/>
+              </w:rPr>
+              <w:t>Требование задания</w:t>
+            </w:r>
+          </w:p>
+        </w:tc>
+        <w:tc>
+          <w:tcPr>
+            <w:tcW w:type="dxa" w:w="6746"/>
+            <w:vAlign w:val="center"/>
+            <w:tcMar>
+              <w:top w:w="75" w:type="dxa"/>
+              <w:bottom w:w="75" w:type="dxa"/>
+              <w:left w:w="95" w:type="dxa"/>
+              <w:right w:w="95" w:type="dxa"/>
+            </w:tcMar>
+            <w:shd w:fill="24577A"/>
+            <w:tcBorders>
+              <w:top w:val="single" w:sz="4" w:color="D9D9D9"/>
+              <w:left w:val="single" w:sz="4" w:color="D9D9D9"/>
+              <w:bottom w:val="single" w:sz="4" w:color="D9D9D9"/>
+              <w:right w:val="single" w:sz="4" w:color="D9D9D9"/>
+            </w:tcBorders>
+          </w:tcPr>
+          <w:p>
+            <w:pPr>
+              <w:spacing w:after="20" w:before="20" w:line="247" w:lineRule="auto"/>
+            </w:pPr>
+            <w:r>
+              <w:rPr>
+                <w:rFonts w:ascii="Arial" w:hAnsi="Arial"/>
+                <w:b/>
+                <w:color w:val="FFFFFF"/>
+                <w:sz w:val="19"/>
+              </w:rPr>
+              <w:t>Подтверждение в проекте</w:t>
+            </w:r>
+          </w:p>
+        </w:tc>
+      </w:tr>
+      <w:tr>
+        <w:trPr>
+          <w:cantSplit/>
+        </w:trPr>
+        <w:tc>
+          <w:tcPr>
+            <w:tcW w:type="dxa" w:w="2891"/>
+            <w:vAlign w:val="center"/>
+            <w:tcMar>
+              <w:top w:w="75" w:type="dxa"/>
+              <w:bottom w:w="75" w:type="dxa"/>
+              <w:left w:w="95" w:type="dxa"/>
+              <w:right w:w="95" w:type="dxa"/>
+            </w:tcMar>
+            <w:tcBorders>
+              <w:top w:val="single" w:sz="4" w:color="D9D9D9"/>
+              <w:left w:val="single" w:sz="4" w:color="D9D9D9"/>
+              <w:bottom w:val="single" w:sz="4" w:color="D9D9D9"/>
+              <w:right w:val="single" w:sz="4" w:color="D9D9D9"/>
+            </w:tcBorders>
+          </w:tcPr>
+          <w:p>
+            <w:pPr>
+              <w:spacing w:after="20" w:before="20" w:line="247" w:lineRule="auto"/>
+            </w:pPr>
+            <w:r>
+              <w:rPr>
+                <w:rFonts w:ascii="Arial" w:hAnsi="Arial"/>
+                <w:sz w:val="19"/>
+              </w:rPr>
+              <w:t>Добавить калькулятор в прежний компонент</w:t>
+            </w:r>
+          </w:p>
+        </w:tc>
+        <w:tc>
+          <w:tcPr>
+            <w:tcW w:type="dxa" w:w="6746"/>
+            <w:vAlign w:val="center"/>
+            <w:tcMar>
+              <w:top w:w="75" w:type="dxa"/>
+              <w:bottom w:w="75" w:type="dxa"/>
+              <w:left w:w="95" w:type="dxa"/>
+              <w:right w:w="95" w:type="dxa"/>
+            </w:tcMar>
+            <w:tcBorders>
+              <w:top w:val="single" w:sz="4" w:color="D9D9D9"/>
+              <w:left w:val="single" w:sz="4" w:color="D9D9D9"/>
+              <w:bottom w:val="single" w:sz="4" w:color="D9D9D9"/>
+              <w:right w:val="single" w:sz="4" w:color="D9D9D9"/>
+            </w:tcBorders>
+          </w:tcPr>
+          <w:p>
+            <w:pPr>
+              <w:spacing w:after="20" w:before="20" w:line="247" w:lineRule="auto"/>
+            </w:pPr>
+            <w:r>
+              <w:rPr>
+                <w:rFonts w:ascii="Arial" w:hAnsi="Arial"/>
+                <w:sz w:val="19"/>
+              </w:rPr>
+              <w:t>Lab1 включает C; операции фасадов делегируются его X/Y</w:t>
+            </w:r>
+          </w:p>
+        </w:tc>
+      </w:tr>
+      <w:tr>
+        <w:trPr>
+          <w:cantSplit/>
+        </w:trPr>
+        <w:tc>
+          <w:tcPr>
+            <w:tcW w:type="dxa" w:w="2891"/>
+            <w:vAlign w:val="center"/>
+            <w:tcMar>
+              <w:top w:w="75" w:type="dxa"/>
+              <w:bottom w:w="75" w:type="dxa"/>
+              <w:left w:w="95" w:type="dxa"/>
+              <w:right w:w="95" w:type="dxa"/>
+            </w:tcMar>
+            <w:shd w:fill="F1F5F8"/>
+            <w:tcBorders>
+              <w:top w:val="single" w:sz="4" w:color="D9D9D9"/>
+              <w:left w:val="single" w:sz="4" w:color="D9D9D9"/>
+              <w:bottom w:val="single" w:sz="4" w:color="D9D9D9"/>
+              <w:right w:val="single" w:sz="4" w:color="D9D9D9"/>
+            </w:tcBorders>
+          </w:tcPr>
+          <w:p>
+            <w:pPr>
+              <w:spacing w:after="20" w:before="20" w:line="247" w:lineRule="auto"/>
+            </w:pPr>
+            <w:r>
+              <w:rPr>
+                <w:rFonts w:ascii="Arial" w:hAnsi="Arial"/>
+                <w:sz w:val="19"/>
+              </w:rPr>
+              <w:t>Показать A–E в механизме композиции</w:t>
+            </w:r>
+          </w:p>
+        </w:tc>
+        <w:tc>
+          <w:tcPr>
+            <w:tcW w:type="dxa" w:w="6746"/>
+            <w:vAlign w:val="center"/>
+            <w:tcMar>
+              <w:top w:w="75" w:type="dxa"/>
+              <w:bottom w:w="75" w:type="dxa"/>
+              <w:left w:w="95" w:type="dxa"/>
+              <w:right w:w="95" w:type="dxa"/>
+            </w:tcMar>
+            <w:shd w:fill="F1F5F8"/>
+            <w:tcBorders>
+              <w:top w:val="single" w:sz="4" w:color="D9D9D9"/>
+              <w:left w:val="single" w:sz="4" w:color="D9D9D9"/>
+              <w:bottom w:val="single" w:sz="4" w:color="D9D9D9"/>
+              <w:right w:val="single" w:sz="4" w:color="D9D9D9"/>
+            </w:tcBorders>
+          </w:tcPr>
+          <w:p>
+            <w:pPr>
+              <w:spacing w:after="20" w:before="20" w:line="247" w:lineRule="auto"/>
+            </w:pPr>
+            <w:r>
+              <w:rPr>
+                <w:rFonts w:ascii="Arial" w:hAnsi="Arial"/>
+                <w:sz w:val="19"/>
+              </w:rPr>
+              <w:t>Lab1→C→A/D→B и Lab2→E→B; каждый узел участвует в вызовах</w:t>
+            </w:r>
+          </w:p>
+        </w:tc>
+      </w:tr>
+      <w:tr>
+        <w:trPr>
+          <w:cantSplit/>
+        </w:trPr>
+        <w:tc>
+          <w:tcPr>
+            <w:tcW w:type="dxa" w:w="2891"/>
+            <w:vAlign w:val="center"/>
+            <w:tcMar>
+              <w:top w:w="75" w:type="dxa"/>
+              <w:bottom w:w="75" w:type="dxa"/>
+              <w:left w:w="95" w:type="dxa"/>
+              <w:right w:w="95" w:type="dxa"/>
+            </w:tcMar>
+            <w:tcBorders>
+              <w:top w:val="single" w:sz="4" w:color="D9D9D9"/>
+              <w:left w:val="single" w:sz="4" w:color="D9D9D9"/>
+              <w:bottom w:val="single" w:sz="4" w:color="D9D9D9"/>
+              <w:right w:val="single" w:sz="4" w:color="D9D9D9"/>
+            </w:tcBorders>
+          </w:tcPr>
+          <w:p>
+            <w:pPr>
+              <w:spacing w:after="20" w:before="20" w:line="247" w:lineRule="auto"/>
+            </w:pPr>
+            <w:r>
+              <w:rPr>
+                <w:rFonts w:ascii="Arial" w:hAnsi="Arial"/>
+                <w:sz w:val="19"/>
+              </w:rPr>
+              <w:t>Внешнее агрегирование Lab1</w:t>
+            </w:r>
+          </w:p>
+        </w:tc>
+        <w:tc>
+          <w:tcPr>
+            <w:tcW w:type="dxa" w:w="6746"/>
+            <w:vAlign w:val="center"/>
+            <w:tcMar>
+              <w:top w:w="75" w:type="dxa"/>
+              <w:bottom w:w="75" w:type="dxa"/>
+              <w:left w:w="95" w:type="dxa"/>
+              <w:right w:w="95" w:type="dxa"/>
+            </w:tcMar>
+            <w:tcBorders>
+              <w:top w:val="single" w:sz="4" w:color="D9D9D9"/>
+              <w:left w:val="single" w:sz="4" w:color="D9D9D9"/>
+              <w:bottom w:val="single" w:sz="4" w:color="D9D9D9"/>
+              <w:right w:val="single" w:sz="4" w:color="D9D9D9"/>
+            </w:tcBorders>
+          </w:tcPr>
+          <w:p>
+            <w:pPr>
+              <w:spacing w:after="20" w:before="20" w:line="247" w:lineRule="auto"/>
+            </w:pPr>
+            <w:r>
+              <w:rPr>
+                <w:rFonts w:ascii="Arial" w:hAnsi="Arial"/>
+                <w:sz w:val="19"/>
+              </w:rPr>
+              <w:t>Lab2 хранит приватный unknown Lab1; публичные QI/AddRef/Release используют внешний unknown</w:t>
+            </w:r>
+          </w:p>
+        </w:tc>
+      </w:tr>
+      <w:tr>
+        <w:trPr>
+          <w:cantSplit/>
+        </w:trPr>
+        <w:tc>
+          <w:tcPr>
+            <w:tcW w:type="dxa" w:w="2891"/>
+            <w:vAlign w:val="center"/>
+            <w:tcMar>
+              <w:top w:w="75" w:type="dxa"/>
+              <w:bottom w:w="75" w:type="dxa"/>
+              <w:left w:w="95" w:type="dxa"/>
+              <w:right w:w="95" w:type="dxa"/>
+            </w:tcMar>
+            <w:shd w:fill="F1F5F8"/>
+            <w:tcBorders>
+              <w:top w:val="single" w:sz="4" w:color="D9D9D9"/>
+              <w:left w:val="single" w:sz="4" w:color="D9D9D9"/>
+              <w:bottom w:val="single" w:sz="4" w:color="D9D9D9"/>
+              <w:right w:val="single" w:sz="4" w:color="D9D9D9"/>
+            </w:tcBorders>
+          </w:tcPr>
+          <w:p>
+            <w:pPr>
+              <w:spacing w:after="20" w:before="20" w:line="247" w:lineRule="auto"/>
+            </w:pPr>
+            <w:r>
+              <w:rPr>
+                <w:rFonts w:ascii="Arial" w:hAnsi="Arial"/>
+                <w:sz w:val="19"/>
+              </w:rPr>
+              <w:t>Получать интерфейсы через QueryInterface</w:t>
+            </w:r>
+          </w:p>
+        </w:tc>
+        <w:tc>
+          <w:tcPr>
+            <w:tcW w:type="dxa" w:w="6746"/>
+            <w:vAlign w:val="center"/>
+            <w:tcMar>
+              <w:top w:w="75" w:type="dxa"/>
+              <w:bottom w:w="75" w:type="dxa"/>
+              <w:left w:w="95" w:type="dxa"/>
+              <w:right w:w="95" w:type="dxa"/>
+            </w:tcMar>
+            <w:shd w:fill="F1F5F8"/>
+            <w:tcBorders>
+              <w:top w:val="single" w:sz="4" w:color="D9D9D9"/>
+              <w:left w:val="single" w:sz="4" w:color="D9D9D9"/>
+              <w:bottom w:val="single" w:sz="4" w:color="D9D9D9"/>
+              <w:right w:val="single" w:sz="4" w:color="D9D9D9"/>
+            </w:tcBorders>
+          </w:tcPr>
+          <w:p>
+            <w:pPr>
+              <w:spacing w:after="20" w:before="20" w:line="247" w:lineRule="auto"/>
+            </w:pPr>
+            <w:r>
+              <w:rPr>
+                <w:rFonts w:ascii="Arial" w:hAnsi="Arial"/>
+                <w:sz w:val="19"/>
+              </w:rPr>
+              <w:t>Проверяются матрицы переходов для всех восьми CID, включая Lab2→Lab1→Lab2</w:t>
+            </w:r>
+          </w:p>
+        </w:tc>
+      </w:tr>
+      <w:tr>
+        <w:trPr>
+          <w:cantSplit/>
+        </w:trPr>
+        <w:tc>
+          <w:tcPr>
+            <w:tcW w:type="dxa" w:w="2891"/>
+            <w:vAlign w:val="center"/>
+            <w:tcMar>
+              <w:top w:w="75" w:type="dxa"/>
+              <w:bottom w:w="75" w:type="dxa"/>
+              <w:left w:w="95" w:type="dxa"/>
+              <w:right w:w="95" w:type="dxa"/>
+            </w:tcMar>
+            <w:tcBorders>
+              <w:top w:val="single" w:sz="4" w:color="D9D9D9"/>
+              <w:left w:val="single" w:sz="4" w:color="D9D9D9"/>
+              <w:bottom w:val="single" w:sz="4" w:color="D9D9D9"/>
+              <w:right w:val="single" w:sz="4" w:color="D9D9D9"/>
+            </w:tcBorders>
+          </w:tcPr>
+          <w:p>
+            <w:pPr>
+              <w:spacing w:after="20" w:before="20" w:line="247" w:lineRule="auto"/>
+            </w:pPr>
+            <w:r>
+              <w:rPr>
+                <w:rFonts w:ascii="Arial" w:hAnsi="Arial"/>
+                <w:sz w:val="19"/>
+              </w:rPr>
+              <w:t>Предоставить исходники, клиент, сборку и Word</w:t>
+            </w:r>
+          </w:p>
+        </w:tc>
+        <w:tc>
+          <w:tcPr>
+            <w:tcW w:type="dxa" w:w="6746"/>
+            <w:vAlign w:val="center"/>
+            <w:tcMar>
+              <w:top w:w="75" w:type="dxa"/>
+              <w:bottom w:w="75" w:type="dxa"/>
+              <w:left w:w="95" w:type="dxa"/>
+              <w:right w:w="95" w:type="dxa"/>
+            </w:tcMar>
+            <w:tcBorders>
+              <w:top w:val="single" w:sz="4" w:color="D9D9D9"/>
+              <w:left w:val="single" w:sz="4" w:color="D9D9D9"/>
+              <w:bottom w:val="single" w:sz="4" w:color="D9D9D9"/>
+              <w:right w:val="single" w:sz="4" w:color="D9D9D9"/>
+            </w:tcBorders>
+          </w:tcPr>
+          <w:p>
+            <w:pPr>
+              <w:spacing w:after="20" w:before="20" w:line="247" w:lineRule="auto"/>
+            </w:pPr>
+            <w:r>
+              <w:rPr>
+                <w:rFonts w:ascii="Arial" w:hAnsi="Arial"/>
+                <w:sz w:val="19"/>
+              </w:rPr>
+              <w:t>C/H/IDL, Eco UnitTest, Xcode-проекты, Dynamic runtime-скрипт и настоящий отчёт</w:t>
+            </w:r>
+          </w:p>
+        </w:tc>
+      </w:tr>
+    </w:tbl>
+    <w:p>
+      <w:pPr>
+        <w:widowControl/>
+        <w:spacing w:after="40"/>
+      </w:pPr>
+    </w:p>
+    <w:p>
+      <w:pPr>
+        <w:pStyle w:val="Heading2"/>
+      </w:pPr>
+      <w:r>
+        <w:rPr>
+          <w:color w:val="000000"/>
+        </w:rPr>
+        <w:t>Материалы и границы работы</w:t>
+      </w:r>
+    </w:p>
+    <w:p>
+      <w:pPr>
+        <w:widowControl/>
+      </w:pPr>
+      <w:r>
+        <w:t>Архитектура опирается на уроки 001.InsideACOM: B имеет делегирующий и неделегирующий unknown; D включает X-компонент; E агрегирует B. Для согласованного API с дробными аргументами введены собственные double-интерфейсы с новыми IID. Бинарная совместимость с целочисленными интерфейсами примеров не заявляется.</w:t>
+      </w:r>
+    </w:p>
+    <w:p>
+      <w:pPr>
+        <w:widowControl/>
+      </w:pPr>
+      <w:r>
+        <w:t>Существующая функциональность Lab1 сохранена: пять типов polyfit, нормальные уравнения/Гаусс и QR/Givens, FitVector и IEcoPolynomial. Основная проверенная платформа — macOS arm64 с официальным Eco Framework. Исходники Framework не изменялись.</w:t>
       </w:r>
     </w:p>
     <w:p>
       <w:r>
-        <w:t>Цель работы — расширить компонент лабораторной работы №1 средствами ACOM. В существующий Eco.Lab1 добавлены интерфейсы калькулятора, а также реализован внешний Eco.Lab2, который демонстрирует включение и агрегирование вложенных компонентов. Работа выполнена по заданию №2 и материалам InsideACOM из Eco.Education.</w:t>
-      </w:r>
-    </w:p>
-    <w:p>
-      <w:r>
-        <w:t>В соответствии с максимальным критерием необходимо продемонстрировать работу всех компонентов A, B, C, D, E и Eco.Lab1, переходы между интерфейсами через QueryInterface, а также поддержку агрегирования Eco.Lab1 внешним Eco.Lab2.</w:t>
+        <w:br w:type="page"/>
       </w:r>
     </w:p>
     <w:p>
@@ -186,45 +581,1019 @@
         <w:pStyle w:val="Heading1"/>
       </w:pPr>
       <w:r>
-        <w:t>2. Архитектура решения</w:t>
+        <w:rPr>
+          <w:color w:val="000000"/>
+        </w:rPr>
+        <w:t>2 Компонентная архитектура</w:t>
       </w:r>
     </w:p>
     <w:p>
+      <w:pPr>
+        <w:widowControl/>
+        <w:spacing w:after="40"/>
+        <w:jc w:val="center"/>
+      </w:pPr>
       <w:r>
-        <w:t>Компонентная схема разделяет операции калькулятора и полиномиальную аппроксимацию. Lab1 сохраняет polyfit, обе реализации алгоритма и IEcoPolynomial. Дополнительные calculator-компоненты имеют отдельные CID и регистрируются на IEcoInterfaceBus1.</w:t>
+        <w:drawing>
+          <wp:inline xmlns:a="http://schemas.openxmlformats.org/drawingml/2006/main" xmlns:pic="http://schemas.openxmlformats.org/drawingml/2006/picture">
+            <wp:extent cx="5652000" cy="4973760"/>
+            <wp:docPr id="1" name="Picture 1"/>
+            <wp:cNvGraphicFramePr>
+              <a:graphicFrameLocks noChangeAspect="1"/>
+            </wp:cNvGraphicFramePr>
+            <a:graphic>
+              <a:graphicData uri="http://schemas.openxmlformats.org/drawingml/2006/picture">
+                <pic:pic>
+                  <pic:nvPicPr>
+                    <pic:cNvPr id="0" name="lab2_architecture.png"/>
+                    <pic:cNvPicPr/>
+                  </pic:nvPicPr>
+                  <pic:blipFill>
+                    <a:blip r:embed="rId11"/>
+                    <a:stretch>
+                      <a:fillRect/>
+                    </a:stretch>
+                  </pic:blipFill>
+                  <pic:spPr>
+                    <a:xfrm>
+                      <a:off x="0" y="0"/>
+                      <a:ext cx="5652000" cy="4973760"/>
+                    </a:xfrm>
+                    <a:prstGeom prst="rect"/>
+                  </pic:spPr>
+                </pic:pic>
+              </a:graphicData>
+            </a:graphic>
+          </wp:inline>
+        </w:drawing>
+      </w:r>
+    </w:p>
+    <w:p>
+      <w:pPr>
+        <w:pStyle w:val="Caption"/>
+        <w:widowControl/>
+        <w:jc w:val="center"/>
+      </w:pPr>
+      <w:r>
+        <w:t>Рисунок 1. Реальная схема создания и владения компонентами</w:t>
+      </w:r>
+    </w:p>
+    <w:p>
+      <w:pPr>
+        <w:widowControl/>
+      </w:pPr>
+      <w:r>
+        <w:t>На схеме B₁ и B₂ — разные экземпляры одной фабрики. D владеет обычной ссылкой B₁, а E владеет приватным неделегирующим unknown B₂. Все компоненты создаются через IEcoInterfaceBus1::QueryComponent по соответствующему CID.</w:t>
       </w:r>
     </w:p>
     <w:tbl>
       <w:tblPr>
-        <w:tblStyle w:val="TableGrid"/>
         <w:tblW w:type="auto" w:w="0"/>
         <w:jc w:val="center"/>
+        <w:tblLayout w:type="fixed"/>
         <w:tblLook w:firstColumn="1" w:firstRow="1" w:lastColumn="0" w:lastRow="0" w:noHBand="0" w:noVBand="1" w:val="04A0"/>
       </w:tblPr>
       <w:tblGrid>
-        <w:gridCol w:w="2502"/>
-        <w:gridCol w:w="2502"/>
-        <w:gridCol w:w="2502"/>
-        <w:gridCol w:w="2502"/>
+        <w:gridCol w:w="4819"/>
+        <w:gridCol w:w="4819"/>
       </w:tblGrid>
       <w:tr>
+        <w:trPr>
+          <w:cantSplit/>
+          <w:tblHeader/>
+        </w:trPr>
         <w:tc>
           <w:tcPr>
-            <w:tcW w:type="dxa" w:w="1440"/>
+            <w:tcW w:type="dxa" w:w="3969"/>
             <w:vAlign w:val="center"/>
-            <w:shd w:fill="1F4E78"/>
+            <w:tcMar>
+              <w:top w:w="75" w:type="dxa"/>
+              <w:bottom w:w="75" w:type="dxa"/>
+              <w:left w:w="95" w:type="dxa"/>
+              <w:right w:w="95" w:type="dxa"/>
+            </w:tcMar>
+            <w:shd w:fill="24577A"/>
+            <w:tcBorders>
+              <w:top w:val="single" w:sz="4" w:color="D9D9D9"/>
+              <w:left w:val="single" w:sz="4" w:color="D9D9D9"/>
+              <w:bottom w:val="single" w:sz="4" w:color="D9D9D9"/>
+              <w:right w:val="single" w:sz="4" w:color="D9D9D9"/>
+            </w:tcBorders>
           </w:tcPr>
           <w:p>
             <w:pPr>
-              <w:jc w:val="left"/>
+              <w:spacing w:after="20" w:before="20" w:line="247" w:lineRule="auto"/>
             </w:pPr>
-            <w:r/>
             <w:r>
               <w:rPr>
                 <w:rFonts w:ascii="Arial" w:hAnsi="Arial"/>
                 <w:b/>
                 <w:color w:val="FFFFFF"/>
-                <w:sz w:val="19"/>
+                <w:sz w:val="18"/>
+              </w:rPr>
+              <w:t>Операция через внешний Lab2</w:t>
+            </w:r>
+          </w:p>
+        </w:tc>
+        <w:tc>
+          <w:tcPr>
+            <w:tcW w:type="dxa" w:w="5669"/>
+            <w:vAlign w:val="center"/>
+            <w:tcMar>
+              <w:top w:w="75" w:type="dxa"/>
+              <w:bottom w:w="75" w:type="dxa"/>
+              <w:left w:w="95" w:type="dxa"/>
+              <w:right w:w="95" w:type="dxa"/>
+            </w:tcMar>
+            <w:shd w:fill="24577A"/>
+            <w:tcBorders>
+              <w:top w:val="single" w:sz="4" w:color="D9D9D9"/>
+              <w:left w:val="single" w:sz="4" w:color="D9D9D9"/>
+              <w:bottom w:val="single" w:sz="4" w:color="D9D9D9"/>
+              <w:right w:val="single" w:sz="4" w:color="D9D9D9"/>
+            </w:tcBorders>
+          </w:tcPr>
+          <w:p>
+            <w:pPr>
+              <w:spacing w:after="20" w:before="20" w:line="247" w:lineRule="auto"/>
+            </w:pPr>
+            <w:r>
+              <w:rPr>
+                <w:rFonts w:ascii="Arial" w:hAnsi="Arial"/>
+                <w:b/>
+                <w:color w:val="FFFFFF"/>
+                <w:sz w:val="18"/>
+              </w:rPr>
+              <w:t>Путь вызова</w:t>
+            </w:r>
+          </w:p>
+        </w:tc>
+      </w:tr>
+      <w:tr>
+        <w:trPr>
+          <w:cantSplit/>
+        </w:trPr>
+        <w:tc>
+          <w:tcPr>
+            <w:tcW w:type="dxa" w:w="3969"/>
+            <w:vAlign w:val="center"/>
+            <w:tcMar>
+              <w:top w:w="75" w:type="dxa"/>
+              <w:bottom w:w="75" w:type="dxa"/>
+              <w:left w:w="95" w:type="dxa"/>
+              <w:right w:w="95" w:type="dxa"/>
+            </w:tcMar>
+            <w:tcBorders>
+              <w:top w:val="single" w:sz="4" w:color="D9D9D9"/>
+              <w:left w:val="single" w:sz="4" w:color="D9D9D9"/>
+              <w:bottom w:val="single" w:sz="4" w:color="D9D9D9"/>
+              <w:right w:val="single" w:sz="4" w:color="D9D9D9"/>
+            </w:tcBorders>
+          </w:tcPr>
+          <w:p>
+            <w:pPr>
+              <w:spacing w:after="20" w:before="20" w:line="247" w:lineRule="auto"/>
+            </w:pPr>
+            <w:r>
+              <w:rPr>
+                <w:rFonts w:ascii="Arial" w:hAnsi="Arial"/>
+                <w:sz w:val="18"/>
+              </w:rPr>
+              <w:t>Addition</w:t>
+            </w:r>
+          </w:p>
+        </w:tc>
+        <w:tc>
+          <w:tcPr>
+            <w:tcW w:type="dxa" w:w="5669"/>
+            <w:vAlign w:val="center"/>
+            <w:tcMar>
+              <w:top w:w="75" w:type="dxa"/>
+              <w:bottom w:w="75" w:type="dxa"/>
+              <w:left w:w="95" w:type="dxa"/>
+              <w:right w:w="95" w:type="dxa"/>
+            </w:tcMar>
+            <w:tcBorders>
+              <w:top w:val="single" w:sz="4" w:color="D9D9D9"/>
+              <w:left w:val="single" w:sz="4" w:color="D9D9D9"/>
+              <w:bottom w:val="single" w:sz="4" w:color="D9D9D9"/>
+              <w:right w:val="single" w:sz="4" w:color="D9D9D9"/>
+            </w:tcBorders>
+          </w:tcPr>
+          <w:p>
+            <w:pPr>
+              <w:spacing w:after="20" w:before="20" w:line="247" w:lineRule="auto"/>
+            </w:pPr>
+            <w:r>
+              <w:rPr>
+                <w:rFonts w:ascii="Arial" w:hAnsi="Arial"/>
+                <w:sz w:val="18"/>
+              </w:rPr>
+              <w:t>Lab2.X → Lab1.X → C.X → A.X</w:t>
+            </w:r>
+          </w:p>
+        </w:tc>
+      </w:tr>
+      <w:tr>
+        <w:trPr>
+          <w:cantSplit/>
+        </w:trPr>
+        <w:tc>
+          <w:tcPr>
+            <w:tcW w:type="dxa" w:w="3969"/>
+            <w:vAlign w:val="center"/>
+            <w:tcMar>
+              <w:top w:w="75" w:type="dxa"/>
+              <w:bottom w:w="75" w:type="dxa"/>
+              <w:left w:w="95" w:type="dxa"/>
+              <w:right w:w="95" w:type="dxa"/>
+            </w:tcMar>
+            <w:shd w:fill="F1F5F8"/>
+            <w:tcBorders>
+              <w:top w:val="single" w:sz="4" w:color="D9D9D9"/>
+              <w:left w:val="single" w:sz="4" w:color="D9D9D9"/>
+              <w:bottom w:val="single" w:sz="4" w:color="D9D9D9"/>
+              <w:right w:val="single" w:sz="4" w:color="D9D9D9"/>
+            </w:tcBorders>
+          </w:tcPr>
+          <w:p>
+            <w:pPr>
+              <w:spacing w:after="20" w:before="20" w:line="247" w:lineRule="auto"/>
+            </w:pPr>
+            <w:r>
+              <w:rPr>
+                <w:rFonts w:ascii="Arial" w:hAnsi="Arial"/>
+                <w:sz w:val="18"/>
+              </w:rPr>
+              <w:t>Subtraction</w:t>
+            </w:r>
+          </w:p>
+        </w:tc>
+        <w:tc>
+          <w:tcPr>
+            <w:tcW w:type="dxa" w:w="5669"/>
+            <w:vAlign w:val="center"/>
+            <w:tcMar>
+              <w:top w:w="75" w:type="dxa"/>
+              <w:bottom w:w="75" w:type="dxa"/>
+              <w:left w:w="95" w:type="dxa"/>
+              <w:right w:w="95" w:type="dxa"/>
+            </w:tcMar>
+            <w:shd w:fill="F1F5F8"/>
+            <w:tcBorders>
+              <w:top w:val="single" w:sz="4" w:color="D9D9D9"/>
+              <w:left w:val="single" w:sz="4" w:color="D9D9D9"/>
+              <w:bottom w:val="single" w:sz="4" w:color="D9D9D9"/>
+              <w:right w:val="single" w:sz="4" w:color="D9D9D9"/>
+            </w:tcBorders>
+          </w:tcPr>
+          <w:p>
+            <w:pPr>
+              <w:spacing w:after="20" w:before="20" w:line="247" w:lineRule="auto"/>
+            </w:pPr>
+            <w:r>
+              <w:rPr>
+                <w:rFonts w:ascii="Arial" w:hAnsi="Arial"/>
+                <w:sz w:val="18"/>
+              </w:rPr>
+              <w:t>Lab2.X → Lab1.X → C.X → D.X → B₁.X</w:t>
+            </w:r>
+          </w:p>
+        </w:tc>
+      </w:tr>
+      <w:tr>
+        <w:trPr>
+          <w:cantSplit/>
+        </w:trPr>
+        <w:tc>
+          <w:tcPr>
+            <w:tcW w:type="dxa" w:w="3969"/>
+            <w:vAlign w:val="center"/>
+            <w:tcMar>
+              <w:top w:w="75" w:type="dxa"/>
+              <w:bottom w:w="75" w:type="dxa"/>
+              <w:left w:w="95" w:type="dxa"/>
+              <w:right w:w="95" w:type="dxa"/>
+            </w:tcMar>
+            <w:tcBorders>
+              <w:top w:val="single" w:sz="4" w:color="D9D9D9"/>
+              <w:left w:val="single" w:sz="4" w:color="D9D9D9"/>
+              <w:bottom w:val="single" w:sz="4" w:color="D9D9D9"/>
+              <w:right w:val="single" w:sz="4" w:color="D9D9D9"/>
+            </w:tcBorders>
+          </w:tcPr>
+          <w:p>
+            <w:pPr>
+              <w:spacing w:after="20" w:before="20" w:line="247" w:lineRule="auto"/>
+            </w:pPr>
+            <w:r>
+              <w:rPr>
+                <w:rFonts w:ascii="Arial" w:hAnsi="Arial"/>
+                <w:sz w:val="18"/>
+              </w:rPr>
+              <w:t>Multiplication / Division / TryDivision</w:t>
+            </w:r>
+          </w:p>
+        </w:tc>
+        <w:tc>
+          <w:tcPr>
+            <w:tcW w:type="dxa" w:w="5669"/>
+            <w:vAlign w:val="center"/>
+            <w:tcMar>
+              <w:top w:w="75" w:type="dxa"/>
+              <w:bottom w:w="75" w:type="dxa"/>
+              <w:left w:w="95" w:type="dxa"/>
+              <w:right w:w="95" w:type="dxa"/>
+            </w:tcMar>
+            <w:tcBorders>
+              <w:top w:val="single" w:sz="4" w:color="D9D9D9"/>
+              <w:left w:val="single" w:sz="4" w:color="D9D9D9"/>
+              <w:bottom w:val="single" w:sz="4" w:color="D9D9D9"/>
+              <w:right w:val="single" w:sz="4" w:color="D9D9D9"/>
+            </w:tcBorders>
+          </w:tcPr>
+          <w:p>
+            <w:pPr>
+              <w:spacing w:after="20" w:before="20" w:line="247" w:lineRule="auto"/>
+            </w:pPr>
+            <w:r>
+              <w:rPr>
+                <w:rFonts w:ascii="Arial" w:hAnsi="Arial"/>
+                <w:sz w:val="18"/>
+              </w:rPr>
+              <w:t>Lab2.Y → включённый E.Y</w:t>
+            </w:r>
+          </w:p>
+        </w:tc>
+      </w:tr>
+      <w:tr>
+        <w:trPr>
+          <w:cantSplit/>
+        </w:trPr>
+        <w:tc>
+          <w:tcPr>
+            <w:tcW w:type="dxa" w:w="3969"/>
+            <w:vAlign w:val="center"/>
+            <w:tcMar>
+              <w:top w:w="75" w:type="dxa"/>
+              <w:bottom w:w="75" w:type="dxa"/>
+              <w:left w:w="95" w:type="dxa"/>
+              <w:right w:w="95" w:type="dxa"/>
+            </w:tcMar>
+            <w:shd w:fill="F1F5F8"/>
+            <w:tcBorders>
+              <w:top w:val="single" w:sz="4" w:color="D9D9D9"/>
+              <w:left w:val="single" w:sz="4" w:color="D9D9D9"/>
+              <w:bottom w:val="single" w:sz="4" w:color="D9D9D9"/>
+              <w:right w:val="single" w:sz="4" w:color="D9D9D9"/>
+            </w:tcBorders>
+          </w:tcPr>
+          <w:p>
+            <w:pPr>
+              <w:spacing w:after="20" w:before="20" w:line="247" w:lineRule="auto"/>
+            </w:pPr>
+            <w:r>
+              <w:rPr>
+                <w:rFonts w:ascii="Arial" w:hAnsi="Arial"/>
+                <w:sz w:val="18"/>
+              </w:rPr>
+              <w:t>CalculatorX самостоятельного E</w:t>
+            </w:r>
+          </w:p>
+        </w:tc>
+        <w:tc>
+          <w:tcPr>
+            <w:tcW w:type="dxa" w:w="5669"/>
+            <w:vAlign w:val="center"/>
+            <w:tcMar>
+              <w:top w:w="75" w:type="dxa"/>
+              <w:bottom w:w="75" w:type="dxa"/>
+              <w:left w:w="95" w:type="dxa"/>
+              <w:right w:w="95" w:type="dxa"/>
+            </w:tcMar>
+            <w:shd w:fill="F1F5F8"/>
+            <w:tcBorders>
+              <w:top w:val="single" w:sz="4" w:color="D9D9D9"/>
+              <w:left w:val="single" w:sz="4" w:color="D9D9D9"/>
+              <w:bottom w:val="single" w:sz="4" w:color="D9D9D9"/>
+              <w:right w:val="single" w:sz="4" w:color="D9D9D9"/>
+            </w:tcBorders>
+          </w:tcPr>
+          <w:p>
+            <w:pPr>
+              <w:spacing w:after="20" w:before="20" w:line="247" w:lineRule="auto"/>
+            </w:pPr>
+            <w:r>
+              <w:rPr>
+                <w:rFonts w:ascii="Arial" w:hAnsi="Arial"/>
+                <w:sz w:val="18"/>
+              </w:rPr>
+              <w:t>E.QueryInterface(X) → агрегированный B₂.X</w:t>
+            </w:r>
+          </w:p>
+        </w:tc>
+      </w:tr>
+    </w:tbl>
+    <w:p>
+      <w:pPr>
+        <w:widowControl/>
+        <w:spacing w:after="40"/>
+      </w:pPr>
+    </w:p>
+    <w:p>
+      <w:pPr>
+        <w:widowControl/>
+      </w:pPr>
+      <w:r>
+        <w:t>Фасад Lab2.Y сохраняет identity Lab2 и вызывает включённый E. Внутренние A/D/C/E не выдаются клиенту как независимые identity внешнего объекта. Они остаются закрытыми деталями композиции.</w:t>
+      </w:r>
+    </w:p>
+    <w:p>
+      <w:r>
+        <w:br w:type="page"/>
+      </w:r>
+    </w:p>
+    <w:p>
+      <w:pPr>
+        <w:pStyle w:val="Heading1"/>
+      </w:pPr>
+      <w:r>
+        <w:rPr>
+          <w:color w:val="000000"/>
+        </w:rPr>
+        <w:t>3 Публичные интерфейсы и идентификаторы</w:t>
+      </w:r>
+    </w:p>
+    <w:p>
+      <w:pPr>
+        <w:widowControl/>
+      </w:pPr>
+      <w:r>
+        <w:t>Методы CalculatorX/Y возвращают числовой результат напрямую. TryDivision возвращает int16_t и записывает результат через double*. IEcoLab1 и IEcoLab2 служат корневыми интерфейсами; их функциональные интерфейсы запрашиваются через QueryInterface.</w:t>
+      </w:r>
+    </w:p>
+    <w:tbl>
+      <w:tblPr>
+        <w:tblW w:type="auto" w:w="0"/>
+        <w:jc w:val="center"/>
+        <w:tblLayout w:type="fixed"/>
+        <w:tblLook w:firstColumn="1" w:firstRow="1" w:lastColumn="0" w:lastRow="0" w:noHBand="0" w:noVBand="1" w:val="04A0"/>
+      </w:tblPr>
+      <w:tblGrid>
+        <w:gridCol w:w="3213"/>
+        <w:gridCol w:w="3213"/>
+        <w:gridCol w:w="3213"/>
+      </w:tblGrid>
+      <w:tr>
+        <w:trPr>
+          <w:cantSplit/>
+          <w:tblHeader/>
+        </w:trPr>
+        <w:tc>
+          <w:tcPr>
+            <w:tcW w:type="dxa" w:w="2494"/>
+            <w:vAlign w:val="center"/>
+            <w:tcMar>
+              <w:top w:w="75" w:type="dxa"/>
+              <w:bottom w:w="75" w:type="dxa"/>
+              <w:left w:w="95" w:type="dxa"/>
+              <w:right w:w="95" w:type="dxa"/>
+            </w:tcMar>
+            <w:shd w:fill="24577A"/>
+            <w:tcBorders>
+              <w:top w:val="single" w:sz="4" w:color="D9D9D9"/>
+              <w:left w:val="single" w:sz="4" w:color="D9D9D9"/>
+              <w:bottom w:val="single" w:sz="4" w:color="D9D9D9"/>
+              <w:right w:val="single" w:sz="4" w:color="D9D9D9"/>
+            </w:tcBorders>
+          </w:tcPr>
+          <w:p>
+            <w:pPr>
+              <w:spacing w:after="20" w:before="20" w:line="247" w:lineRule="auto"/>
+            </w:pPr>
+            <w:r>
+              <w:rPr>
+                <w:rFonts w:ascii="Arial" w:hAnsi="Arial"/>
+                <w:b/>
+                <w:color w:val="FFFFFF"/>
+                <w:sz w:val="18"/>
+              </w:rPr>
+              <w:t>Интерфейс</w:t>
+            </w:r>
+          </w:p>
+        </w:tc>
+        <w:tc>
+          <w:tcPr>
+            <w:tcW w:type="dxa" w:w="4649"/>
+            <w:vAlign w:val="center"/>
+            <w:tcMar>
+              <w:top w:w="75" w:type="dxa"/>
+              <w:bottom w:w="75" w:type="dxa"/>
+              <w:left w:w="95" w:type="dxa"/>
+              <w:right w:w="95" w:type="dxa"/>
+            </w:tcMar>
+            <w:shd w:fill="24577A"/>
+            <w:tcBorders>
+              <w:top w:val="single" w:sz="4" w:color="D9D9D9"/>
+              <w:left w:val="single" w:sz="4" w:color="D9D9D9"/>
+              <w:bottom w:val="single" w:sz="4" w:color="D9D9D9"/>
+              <w:right w:val="single" w:sz="4" w:color="D9D9D9"/>
+            </w:tcBorders>
+          </w:tcPr>
+          <w:p>
+            <w:pPr>
+              <w:spacing w:after="20" w:before="20" w:line="247" w:lineRule="auto"/>
+            </w:pPr>
+            <w:r>
+              <w:rPr>
+                <w:rFonts w:ascii="Arial" w:hAnsi="Arial"/>
+                <w:b/>
+                <w:color w:val="FFFFFF"/>
+                <w:sz w:val="18"/>
+              </w:rPr>
+              <w:t>Методы</w:t>
+            </w:r>
+          </w:p>
+        </w:tc>
+        <w:tc>
+          <w:tcPr>
+            <w:tcW w:type="dxa" w:w="2494"/>
+            <w:vAlign w:val="center"/>
+            <w:tcMar>
+              <w:top w:w="75" w:type="dxa"/>
+              <w:bottom w:w="75" w:type="dxa"/>
+              <w:left w:w="95" w:type="dxa"/>
+              <w:right w:w="95" w:type="dxa"/>
+            </w:tcMar>
+            <w:shd w:fill="24577A"/>
+            <w:tcBorders>
+              <w:top w:val="single" w:sz="4" w:color="D9D9D9"/>
+              <w:left w:val="single" w:sz="4" w:color="D9D9D9"/>
+              <w:bottom w:val="single" w:sz="4" w:color="D9D9D9"/>
+              <w:right w:val="single" w:sz="4" w:color="D9D9D9"/>
+            </w:tcBorders>
+          </w:tcPr>
+          <w:p>
+            <w:pPr>
+              <w:spacing w:after="20" w:before="20" w:line="247" w:lineRule="auto"/>
+            </w:pPr>
+            <w:r>
+              <w:rPr>
+                <w:rFonts w:ascii="Arial" w:hAnsi="Arial"/>
+                <w:b/>
+                <w:color w:val="FFFFFF"/>
+                <w:sz w:val="18"/>
+              </w:rPr>
+              <w:t>Последний байт IID</w:t>
+            </w:r>
+          </w:p>
+        </w:tc>
+      </w:tr>
+      <w:tr>
+        <w:trPr>
+          <w:cantSplit/>
+        </w:trPr>
+        <w:tc>
+          <w:tcPr>
+            <w:tcW w:type="dxa" w:w="2494"/>
+            <w:vAlign w:val="center"/>
+            <w:tcMar>
+              <w:top w:w="75" w:type="dxa"/>
+              <w:bottom w:w="75" w:type="dxa"/>
+              <w:left w:w="95" w:type="dxa"/>
+              <w:right w:w="95" w:type="dxa"/>
+            </w:tcMar>
+            <w:tcBorders>
+              <w:top w:val="single" w:sz="4" w:color="D9D9D9"/>
+              <w:left w:val="single" w:sz="4" w:color="D9D9D9"/>
+              <w:bottom w:val="single" w:sz="4" w:color="D9D9D9"/>
+              <w:right w:val="single" w:sz="4" w:color="D9D9D9"/>
+            </w:tcBorders>
+          </w:tcPr>
+          <w:p>
+            <w:pPr>
+              <w:spacing w:after="20" w:before="20" w:line="247" w:lineRule="auto"/>
+            </w:pPr>
+            <w:r>
+              <w:rPr>
+                <w:rFonts w:ascii="Arial" w:hAnsi="Arial"/>
+                <w:sz w:val="18"/>
+              </w:rPr>
+              <w:t>IEcoCalculatorX</w:t>
+            </w:r>
+          </w:p>
+        </w:tc>
+        <w:tc>
+          <w:tcPr>
+            <w:tcW w:type="dxa" w:w="4649"/>
+            <w:vAlign w:val="center"/>
+            <w:tcMar>
+              <w:top w:w="75" w:type="dxa"/>
+              <w:bottom w:w="75" w:type="dxa"/>
+              <w:left w:w="95" w:type="dxa"/>
+              <w:right w:w="95" w:type="dxa"/>
+            </w:tcMar>
+            <w:tcBorders>
+              <w:top w:val="single" w:sz="4" w:color="D9D9D9"/>
+              <w:left w:val="single" w:sz="4" w:color="D9D9D9"/>
+              <w:bottom w:val="single" w:sz="4" w:color="D9D9D9"/>
+              <w:right w:val="single" w:sz="4" w:color="D9D9D9"/>
+            </w:tcBorders>
+          </w:tcPr>
+          <w:p>
+            <w:pPr>
+              <w:spacing w:after="20" w:before="20" w:line="247" w:lineRule="auto"/>
+            </w:pPr>
+            <w:r>
+              <w:rPr>
+                <w:rFonts w:ascii="Arial" w:hAnsi="Arial"/>
+                <w:sz w:val="18"/>
+              </w:rPr>
+              <w:t>Addition, Subtraction</w:t>
+            </w:r>
+          </w:p>
+        </w:tc>
+        <w:tc>
+          <w:tcPr>
+            <w:tcW w:type="dxa" w:w="2494"/>
+            <w:vAlign w:val="center"/>
+            <w:tcMar>
+              <w:top w:w="75" w:type="dxa"/>
+              <w:bottom w:w="75" w:type="dxa"/>
+              <w:left w:w="95" w:type="dxa"/>
+              <w:right w:w="95" w:type="dxa"/>
+            </w:tcMar>
+            <w:tcBorders>
+              <w:top w:val="single" w:sz="4" w:color="D9D9D9"/>
+              <w:left w:val="single" w:sz="4" w:color="D9D9D9"/>
+              <w:bottom w:val="single" w:sz="4" w:color="D9D9D9"/>
+              <w:right w:val="single" w:sz="4" w:color="D9D9D9"/>
+            </w:tcBorders>
+          </w:tcPr>
+          <w:p>
+            <w:pPr>
+              <w:spacing w:after="20" w:before="20" w:line="247" w:lineRule="auto"/>
+            </w:pPr>
+            <w:r>
+              <w:rPr>
+                <w:rFonts w:ascii="Arial" w:hAnsi="Arial"/>
+                <w:sz w:val="18"/>
+              </w:rPr>
+              <w:t>50</w:t>
+            </w:r>
+          </w:p>
+        </w:tc>
+      </w:tr>
+      <w:tr>
+        <w:trPr>
+          <w:cantSplit/>
+        </w:trPr>
+        <w:tc>
+          <w:tcPr>
+            <w:tcW w:type="dxa" w:w="2494"/>
+            <w:vAlign w:val="center"/>
+            <w:tcMar>
+              <w:top w:w="75" w:type="dxa"/>
+              <w:bottom w:w="75" w:type="dxa"/>
+              <w:left w:w="95" w:type="dxa"/>
+              <w:right w:w="95" w:type="dxa"/>
+            </w:tcMar>
+            <w:shd w:fill="F1F5F8"/>
+            <w:tcBorders>
+              <w:top w:val="single" w:sz="4" w:color="D9D9D9"/>
+              <w:left w:val="single" w:sz="4" w:color="D9D9D9"/>
+              <w:bottom w:val="single" w:sz="4" w:color="D9D9D9"/>
+              <w:right w:val="single" w:sz="4" w:color="D9D9D9"/>
+            </w:tcBorders>
+          </w:tcPr>
+          <w:p>
+            <w:pPr>
+              <w:spacing w:after="20" w:before="20" w:line="247" w:lineRule="auto"/>
+            </w:pPr>
+            <w:r>
+              <w:rPr>
+                <w:rFonts w:ascii="Arial" w:hAnsi="Arial"/>
+                <w:sz w:val="18"/>
+              </w:rPr>
+              <w:t>IEcoCalculatorY</w:t>
+            </w:r>
+          </w:p>
+        </w:tc>
+        <w:tc>
+          <w:tcPr>
+            <w:tcW w:type="dxa" w:w="4649"/>
+            <w:vAlign w:val="center"/>
+            <w:tcMar>
+              <w:top w:w="75" w:type="dxa"/>
+              <w:bottom w:w="75" w:type="dxa"/>
+              <w:left w:w="95" w:type="dxa"/>
+              <w:right w:w="95" w:type="dxa"/>
+            </w:tcMar>
+            <w:shd w:fill="F1F5F8"/>
+            <w:tcBorders>
+              <w:top w:val="single" w:sz="4" w:color="D9D9D9"/>
+              <w:left w:val="single" w:sz="4" w:color="D9D9D9"/>
+              <w:bottom w:val="single" w:sz="4" w:color="D9D9D9"/>
+              <w:right w:val="single" w:sz="4" w:color="D9D9D9"/>
+            </w:tcBorders>
+          </w:tcPr>
+          <w:p>
+            <w:pPr>
+              <w:spacing w:after="20" w:before="20" w:line="247" w:lineRule="auto"/>
+            </w:pPr>
+            <w:r>
+              <w:rPr>
+                <w:rFonts w:ascii="Arial" w:hAnsi="Arial"/>
+                <w:sz w:val="18"/>
+              </w:rPr>
+              <w:t>Multiplication, Division, TryDivision</w:t>
+            </w:r>
+          </w:p>
+        </w:tc>
+        <w:tc>
+          <w:tcPr>
+            <w:tcW w:type="dxa" w:w="2494"/>
+            <w:vAlign w:val="center"/>
+            <w:tcMar>
+              <w:top w:w="75" w:type="dxa"/>
+              <w:bottom w:w="75" w:type="dxa"/>
+              <w:left w:w="95" w:type="dxa"/>
+              <w:right w:w="95" w:type="dxa"/>
+            </w:tcMar>
+            <w:shd w:fill="F1F5F8"/>
+            <w:tcBorders>
+              <w:top w:val="single" w:sz="4" w:color="D9D9D9"/>
+              <w:left w:val="single" w:sz="4" w:color="D9D9D9"/>
+              <w:bottom w:val="single" w:sz="4" w:color="D9D9D9"/>
+              <w:right w:val="single" w:sz="4" w:color="D9D9D9"/>
+            </w:tcBorders>
+          </w:tcPr>
+          <w:p>
+            <w:pPr>
+              <w:spacing w:after="20" w:before="20" w:line="247" w:lineRule="auto"/>
+            </w:pPr>
+            <w:r>
+              <w:rPr>
+                <w:rFonts w:ascii="Arial" w:hAnsi="Arial"/>
+                <w:sz w:val="18"/>
+              </w:rPr>
+              <w:t>51</w:t>
+            </w:r>
+          </w:p>
+        </w:tc>
+      </w:tr>
+      <w:tr>
+        <w:trPr>
+          <w:cantSplit/>
+        </w:trPr>
+        <w:tc>
+          <w:tcPr>
+            <w:tcW w:type="dxa" w:w="2494"/>
+            <w:vAlign w:val="center"/>
+            <w:tcMar>
+              <w:top w:w="75" w:type="dxa"/>
+              <w:bottom w:w="75" w:type="dxa"/>
+              <w:left w:w="95" w:type="dxa"/>
+              <w:right w:w="95" w:type="dxa"/>
+            </w:tcMar>
+            <w:tcBorders>
+              <w:top w:val="single" w:sz="4" w:color="D9D9D9"/>
+              <w:left w:val="single" w:sz="4" w:color="D9D9D9"/>
+              <w:bottom w:val="single" w:sz="4" w:color="D9D9D9"/>
+              <w:right w:val="single" w:sz="4" w:color="D9D9D9"/>
+            </w:tcBorders>
+          </w:tcPr>
+          <w:p>
+            <w:pPr>
+              <w:spacing w:after="20" w:before="20" w:line="247" w:lineRule="auto"/>
+            </w:pPr>
+            <w:r>
+              <w:rPr>
+                <w:rFonts w:ascii="Arial" w:hAnsi="Arial"/>
+                <w:sz w:val="18"/>
+              </w:rPr>
+              <w:t>IEcoLab1</w:t>
+            </w:r>
+          </w:p>
+        </w:tc>
+        <w:tc>
+          <w:tcPr>
+            <w:tcW w:type="dxa" w:w="4649"/>
+            <w:vAlign w:val="center"/>
+            <w:tcMar>
+              <w:top w:w="75" w:type="dxa"/>
+              <w:bottom w:w="75" w:type="dxa"/>
+              <w:left w:w="95" w:type="dxa"/>
+              <w:right w:w="95" w:type="dxa"/>
+            </w:tcMar>
+            <w:tcBorders>
+              <w:top w:val="single" w:sz="4" w:color="D9D9D9"/>
+              <w:left w:val="single" w:sz="4" w:color="D9D9D9"/>
+              <w:bottom w:val="single" w:sz="4" w:color="D9D9D9"/>
+              <w:right w:val="single" w:sz="4" w:color="D9D9D9"/>
+            </w:tcBorders>
+          </w:tcPr>
+          <w:p>
+            <w:pPr>
+              <w:spacing w:after="20" w:before="20" w:line="247" w:lineRule="auto"/>
+            </w:pPr>
+            <w:r>
+              <w:rPr>
+                <w:rFonts w:ascii="Arial" w:hAnsi="Arial"/>
+                <w:sz w:val="18"/>
+              </w:rPr>
+              <w:t>QueryInterface, AddRef, Release</w:t>
+            </w:r>
+          </w:p>
+        </w:tc>
+        <w:tc>
+          <w:tcPr>
+            <w:tcW w:type="dxa" w:w="2494"/>
+            <w:vAlign w:val="center"/>
+            <w:tcMar>
+              <w:top w:w="75" w:type="dxa"/>
+              <w:bottom w:w="75" w:type="dxa"/>
+              <w:left w:w="95" w:type="dxa"/>
+              <w:right w:w="95" w:type="dxa"/>
+            </w:tcMar>
+            <w:tcBorders>
+              <w:top w:val="single" w:sz="4" w:color="D9D9D9"/>
+              <w:left w:val="single" w:sz="4" w:color="D9D9D9"/>
+              <w:bottom w:val="single" w:sz="4" w:color="D9D9D9"/>
+              <w:right w:val="single" w:sz="4" w:color="D9D9D9"/>
+            </w:tcBorders>
+          </w:tcPr>
+          <w:p>
+            <w:pPr>
+              <w:spacing w:after="20" w:before="20" w:line="247" w:lineRule="auto"/>
+            </w:pPr>
+            <w:r>
+              <w:rPr>
+                <w:rFonts w:ascii="Arial" w:hAnsi="Arial"/>
+                <w:sz w:val="18"/>
+              </w:rPr>
+              <w:t>52</w:t>
+            </w:r>
+          </w:p>
+        </w:tc>
+      </w:tr>
+      <w:tr>
+        <w:trPr>
+          <w:cantSplit/>
+        </w:trPr>
+        <w:tc>
+          <w:tcPr>
+            <w:tcW w:type="dxa" w:w="2494"/>
+            <w:vAlign w:val="center"/>
+            <w:tcMar>
+              <w:top w:w="75" w:type="dxa"/>
+              <w:bottom w:w="75" w:type="dxa"/>
+              <w:left w:w="95" w:type="dxa"/>
+              <w:right w:w="95" w:type="dxa"/>
+            </w:tcMar>
+            <w:shd w:fill="F1F5F8"/>
+            <w:tcBorders>
+              <w:top w:val="single" w:sz="4" w:color="D9D9D9"/>
+              <w:left w:val="single" w:sz="4" w:color="D9D9D9"/>
+              <w:bottom w:val="single" w:sz="4" w:color="D9D9D9"/>
+              <w:right w:val="single" w:sz="4" w:color="D9D9D9"/>
+            </w:tcBorders>
+          </w:tcPr>
+          <w:p>
+            <w:pPr>
+              <w:spacing w:after="20" w:before="20" w:line="247" w:lineRule="auto"/>
+            </w:pPr>
+            <w:r>
+              <w:rPr>
+                <w:rFonts w:ascii="Arial" w:hAnsi="Arial"/>
+                <w:sz w:val="18"/>
+              </w:rPr>
+              <w:t>IEcoLab2</w:t>
+            </w:r>
+          </w:p>
+        </w:tc>
+        <w:tc>
+          <w:tcPr>
+            <w:tcW w:type="dxa" w:w="4649"/>
+            <w:vAlign w:val="center"/>
+            <w:tcMar>
+              <w:top w:w="75" w:type="dxa"/>
+              <w:bottom w:w="75" w:type="dxa"/>
+              <w:left w:w="95" w:type="dxa"/>
+              <w:right w:w="95" w:type="dxa"/>
+            </w:tcMar>
+            <w:shd w:fill="F1F5F8"/>
+            <w:tcBorders>
+              <w:top w:val="single" w:sz="4" w:color="D9D9D9"/>
+              <w:left w:val="single" w:sz="4" w:color="D9D9D9"/>
+              <w:bottom w:val="single" w:sz="4" w:color="D9D9D9"/>
+              <w:right w:val="single" w:sz="4" w:color="D9D9D9"/>
+            </w:tcBorders>
+          </w:tcPr>
+          <w:p>
+            <w:pPr>
+              <w:spacing w:after="20" w:before="20" w:line="247" w:lineRule="auto"/>
+            </w:pPr>
+            <w:r>
+              <w:rPr>
+                <w:rFonts w:ascii="Arial" w:hAnsi="Arial"/>
+                <w:sz w:val="18"/>
+              </w:rPr>
+              <w:t>QueryInterface, AddRef, Release</w:t>
+            </w:r>
+          </w:p>
+        </w:tc>
+        <w:tc>
+          <w:tcPr>
+            <w:tcW w:type="dxa" w:w="2494"/>
+            <w:vAlign w:val="center"/>
+            <w:tcMar>
+              <w:top w:w="75" w:type="dxa"/>
+              <w:bottom w:w="75" w:type="dxa"/>
+              <w:left w:w="95" w:type="dxa"/>
+              <w:right w:w="95" w:type="dxa"/>
+            </w:tcMar>
+            <w:shd w:fill="F1F5F8"/>
+            <w:tcBorders>
+              <w:top w:val="single" w:sz="4" w:color="D9D9D9"/>
+              <w:left w:val="single" w:sz="4" w:color="D9D9D9"/>
+              <w:bottom w:val="single" w:sz="4" w:color="D9D9D9"/>
+              <w:right w:val="single" w:sz="4" w:color="D9D9D9"/>
+            </w:tcBorders>
+          </w:tcPr>
+          <w:p>
+            <w:pPr>
+              <w:spacing w:after="20" w:before="20" w:line="247" w:lineRule="auto"/>
+            </w:pPr>
+            <w:r>
+              <w:rPr>
+                <w:rFonts w:ascii="Arial" w:hAnsi="Arial"/>
+                <w:sz w:val="18"/>
+              </w:rPr>
+              <w:t>53</w:t>
+            </w:r>
+          </w:p>
+        </w:tc>
+      </w:tr>
+    </w:tbl>
+    <w:p>
+      <w:pPr>
+        <w:widowControl/>
+        <w:spacing w:after="40"/>
+      </w:pPr>
+    </w:p>
+    <w:p>
+      <w:pPr>
+        <w:widowControl/>
+      </w:pPr>
+      <w:r>
+        <w:t>Общий префикс IID: D3B3E2F1-8D21-4A6B-9A40-4400000000. В конце добавляются две hex-цифры из таблицы. CID компонентов приведены полностью:</w:t>
+      </w:r>
+    </w:p>
+    <w:tbl>
+      <w:tblPr>
+        <w:tblW w:type="auto" w:w="0"/>
+        <w:jc w:val="center"/>
+        <w:tblLayout w:type="fixed"/>
+        <w:tblLook w:firstColumn="1" w:firstRow="1" w:lastColumn="0" w:lastRow="0" w:noHBand="0" w:noVBand="1" w:val="04A0"/>
+      </w:tblPr>
+      <w:tblGrid>
+        <w:gridCol w:w="4819"/>
+        <w:gridCol w:w="4819"/>
+      </w:tblGrid>
+      <w:tr>
+        <w:trPr>
+          <w:cantSplit/>
+          <w:tblHeader/>
+        </w:trPr>
+        <w:tc>
+          <w:tcPr>
+            <w:tcW w:type="dxa" w:w="2324"/>
+            <w:vAlign w:val="center"/>
+            <w:tcMar>
+              <w:top w:w="75" w:type="dxa"/>
+              <w:bottom w:w="75" w:type="dxa"/>
+              <w:left w:w="95" w:type="dxa"/>
+              <w:right w:w="95" w:type="dxa"/>
+            </w:tcMar>
+            <w:shd w:fill="24577A"/>
+            <w:tcBorders>
+              <w:top w:val="single" w:sz="4" w:color="D9D9D9"/>
+              <w:left w:val="single" w:sz="4" w:color="D9D9D9"/>
+              <w:bottom w:val="single" w:sz="4" w:color="D9D9D9"/>
+              <w:right w:val="single" w:sz="4" w:color="D9D9D9"/>
+            </w:tcBorders>
+          </w:tcPr>
+          <w:p>
+            <w:pPr>
+              <w:spacing w:after="20" w:before="20" w:line="247" w:lineRule="auto"/>
+            </w:pPr>
+            <w:r>
+              <w:rPr>
+                <w:rFonts w:ascii="Arial" w:hAnsi="Arial"/>
+                <w:b/>
+                <w:color w:val="FFFFFF"/>
+                <w:sz w:val="18"/>
               </w:rPr>
               <w:t>Компонент</w:t>
             </w:r>
@@ -232,87 +1601,199 @@
         </w:tc>
         <w:tc>
           <w:tcPr>
-            <w:tcW w:type="dxa" w:w="2880"/>
+            <w:tcW w:type="dxa" w:w="7313"/>
             <w:vAlign w:val="center"/>
-            <w:shd w:fill="1F4E78"/>
+            <w:tcMar>
+              <w:top w:w="75" w:type="dxa"/>
+              <w:bottom w:w="75" w:type="dxa"/>
+              <w:left w:w="95" w:type="dxa"/>
+              <w:right w:w="95" w:type="dxa"/>
+            </w:tcMar>
+            <w:shd w:fill="24577A"/>
+            <w:tcBorders>
+              <w:top w:val="single" w:sz="4" w:color="D9D9D9"/>
+              <w:left w:val="single" w:sz="4" w:color="D9D9D9"/>
+              <w:bottom w:val="single" w:sz="4" w:color="D9D9D9"/>
+              <w:right w:val="single" w:sz="4" w:color="D9D9D9"/>
+            </w:tcBorders>
           </w:tcPr>
           <w:p>
             <w:pPr>
-              <w:jc w:val="left"/>
+              <w:spacing w:after="20" w:before="20" w:line="247" w:lineRule="auto"/>
             </w:pPr>
-            <w:r/>
             <w:r>
               <w:rPr>
                 <w:rFonts w:ascii="Arial" w:hAnsi="Arial"/>
                 <w:b/>
                 <w:color w:val="FFFFFF"/>
-                <w:sz w:val="19"/>
+                <w:sz w:val="18"/>
               </w:rPr>
-              <w:t>Назначение</w:t>
+              <w:t>CID</w:t>
+            </w:r>
+          </w:p>
+        </w:tc>
+      </w:tr>
+      <w:tr>
+        <w:trPr>
+          <w:cantSplit/>
+        </w:trPr>
+        <w:tc>
+          <w:tcPr>
+            <w:tcW w:type="dxa" w:w="2324"/>
+            <w:vAlign w:val="center"/>
+            <w:tcMar>
+              <w:top w:w="75" w:type="dxa"/>
+              <w:bottom w:w="75" w:type="dxa"/>
+              <w:left w:w="95" w:type="dxa"/>
+              <w:right w:w="95" w:type="dxa"/>
+            </w:tcMar>
+            <w:tcBorders>
+              <w:top w:val="single" w:sz="4" w:color="D9D9D9"/>
+              <w:left w:val="single" w:sz="4" w:color="D9D9D9"/>
+              <w:bottom w:val="single" w:sz="4" w:color="D9D9D9"/>
+              <w:right w:val="single" w:sz="4" w:color="D9D9D9"/>
+            </w:tcBorders>
+          </w:tcPr>
+          <w:p>
+            <w:pPr>
+              <w:spacing w:after="20" w:before="20" w:line="247" w:lineRule="auto"/>
+            </w:pPr>
+            <w:r>
+              <w:rPr>
+                <w:rFonts w:ascii="Arial" w:hAnsi="Arial"/>
+                <w:sz w:val="18"/>
+              </w:rPr>
+              <w:t>Eco.Lab1 normal</w:t>
             </w:r>
           </w:p>
         </w:tc>
         <w:tc>
           <w:tcPr>
-            <w:tcW w:type="dxa" w:w="2232"/>
+            <w:tcW w:type="dxa" w:w="7313"/>
             <w:vAlign w:val="center"/>
-            <w:shd w:fill="1F4E78"/>
+            <w:tcMar>
+              <w:top w:w="75" w:type="dxa"/>
+              <w:bottom w:w="75" w:type="dxa"/>
+              <w:left w:w="95" w:type="dxa"/>
+              <w:right w:w="95" w:type="dxa"/>
+            </w:tcMar>
+            <w:tcBorders>
+              <w:top w:val="single" w:sz="4" w:color="D9D9D9"/>
+              <w:left w:val="single" w:sz="4" w:color="D9D9D9"/>
+              <w:bottom w:val="single" w:sz="4" w:color="D9D9D9"/>
+              <w:right w:val="single" w:sz="4" w:color="D9D9D9"/>
+            </w:tcBorders>
           </w:tcPr>
           <w:p>
             <w:pPr>
-              <w:jc w:val="left"/>
+              <w:spacing w:after="20" w:before="20" w:line="247" w:lineRule="auto"/>
             </w:pPr>
-            <w:r/>
             <w:r>
               <w:rPr>
                 <w:rFonts w:ascii="Arial" w:hAnsi="Arial"/>
-                <w:b/>
-                <w:color w:val="FFFFFF"/>
-                <w:sz w:val="19"/>
+                <w:sz w:val="18"/>
               </w:rPr>
-              <w:t>Способ подключения</w:t>
+              <w:t>D3B3E2F1-8D21-4A6B-9A40-440000000045</w:t>
+            </w:r>
+          </w:p>
+        </w:tc>
+      </w:tr>
+      <w:tr>
+        <w:trPr>
+          <w:cantSplit/>
+        </w:trPr>
+        <w:tc>
+          <w:tcPr>
+            <w:tcW w:type="dxa" w:w="2324"/>
+            <w:vAlign w:val="center"/>
+            <w:tcMar>
+              <w:top w:w="75" w:type="dxa"/>
+              <w:bottom w:w="75" w:type="dxa"/>
+              <w:left w:w="95" w:type="dxa"/>
+              <w:right w:w="95" w:type="dxa"/>
+            </w:tcMar>
+            <w:shd w:fill="F1F5F8"/>
+            <w:tcBorders>
+              <w:top w:val="single" w:sz="4" w:color="D9D9D9"/>
+              <w:left w:val="single" w:sz="4" w:color="D9D9D9"/>
+              <w:bottom w:val="single" w:sz="4" w:color="D9D9D9"/>
+              <w:right w:val="single" w:sz="4" w:color="D9D9D9"/>
+            </w:tcBorders>
+          </w:tcPr>
+          <w:p>
+            <w:pPr>
+              <w:spacing w:after="20" w:before="20" w:line="247" w:lineRule="auto"/>
+            </w:pPr>
+            <w:r>
+              <w:rPr>
+                <w:rFonts w:ascii="Arial" w:hAnsi="Arial"/>
+                <w:sz w:val="18"/>
+              </w:rPr>
+              <w:t>Eco.Lab1 QR</w:t>
             </w:r>
           </w:p>
         </w:tc>
         <w:tc>
           <w:tcPr>
-            <w:tcW w:type="dxa" w:w="2880"/>
+            <w:tcW w:type="dxa" w:w="7313"/>
             <w:vAlign w:val="center"/>
-            <w:shd w:fill="1F4E78"/>
+            <w:tcMar>
+              <w:top w:w="75" w:type="dxa"/>
+              <w:bottom w:w="75" w:type="dxa"/>
+              <w:left w:w="95" w:type="dxa"/>
+              <w:right w:w="95" w:type="dxa"/>
+            </w:tcMar>
+            <w:shd w:fill="F1F5F8"/>
+            <w:tcBorders>
+              <w:top w:val="single" w:sz="4" w:color="D9D9D9"/>
+              <w:left w:val="single" w:sz="4" w:color="D9D9D9"/>
+              <w:bottom w:val="single" w:sz="4" w:color="D9D9D9"/>
+              <w:right w:val="single" w:sz="4" w:color="D9D9D9"/>
+            </w:tcBorders>
           </w:tcPr>
           <w:p>
             <w:pPr>
-              <w:jc w:val="left"/>
+              <w:spacing w:after="20" w:before="20" w:line="247" w:lineRule="auto"/>
             </w:pPr>
-            <w:r/>
             <w:r>
               <w:rPr>
                 <w:rFonts w:ascii="Arial" w:hAnsi="Arial"/>
-                <w:b/>
-                <w:color w:val="FFFFFF"/>
-                <w:sz w:val="19"/>
+                <w:sz w:val="18"/>
               </w:rPr>
-              <w:t>Интерфейс</w:t>
+              <w:t>D3B3E2F1-8D21-4A6B-9A40-440000000046</w:t>
             </w:r>
           </w:p>
         </w:tc>
       </w:tr>
       <w:tr>
+        <w:trPr>
+          <w:cantSplit/>
+        </w:trPr>
         <w:tc>
           <w:tcPr>
-            <w:tcW w:type="dxa" w:w="1440"/>
+            <w:tcW w:type="dxa" w:w="2324"/>
             <w:vAlign w:val="center"/>
+            <w:tcMar>
+              <w:top w:w="75" w:type="dxa"/>
+              <w:bottom w:w="75" w:type="dxa"/>
+              <w:left w:w="95" w:type="dxa"/>
+              <w:right w:w="95" w:type="dxa"/>
+            </w:tcMar>
+            <w:tcBorders>
+              <w:top w:val="single" w:sz="4" w:color="D9D9D9"/>
+              <w:left w:val="single" w:sz="4" w:color="D9D9D9"/>
+              <w:bottom w:val="single" w:sz="4" w:color="D9D9D9"/>
+              <w:right w:val="single" w:sz="4" w:color="D9D9D9"/>
+            </w:tcBorders>
           </w:tcPr>
           <w:p>
             <w:pPr>
-              <w:jc w:val="left"/>
+              <w:spacing w:after="20" w:before="20" w:line="247" w:lineRule="auto"/>
             </w:pPr>
-            <w:r/>
             <w:r>
               <w:rPr>
                 <w:rFonts w:ascii="Arial" w:hAnsi="Arial"/>
-                <w:b w:val="0"/>
-                <w:sz w:val="19"/>
+                <w:sz w:val="18"/>
               </w:rPr>
               <w:t>A</w:t>
             </w:r>
@@ -320,82 +1801,65 @@
         </w:tc>
         <w:tc>
           <w:tcPr>
-            <w:tcW w:type="dxa" w:w="2880"/>
+            <w:tcW w:type="dxa" w:w="7313"/>
             <w:vAlign w:val="center"/>
+            <w:tcMar>
+              <w:top w:w="75" w:type="dxa"/>
+              <w:bottom w:w="75" w:type="dxa"/>
+              <w:left w:w="95" w:type="dxa"/>
+              <w:right w:w="95" w:type="dxa"/>
+            </w:tcMar>
+            <w:tcBorders>
+              <w:top w:val="single" w:sz="4" w:color="D9D9D9"/>
+              <w:left w:val="single" w:sz="4" w:color="D9D9D9"/>
+              <w:bottom w:val="single" w:sz="4" w:color="D9D9D9"/>
+              <w:right w:val="single" w:sz="4" w:color="D9D9D9"/>
+            </w:tcBorders>
           </w:tcPr>
           <w:p>
             <w:pPr>
-              <w:jc w:val="left"/>
+              <w:spacing w:after="20" w:before="20" w:line="247" w:lineRule="auto"/>
             </w:pPr>
-            <w:r/>
             <w:r>
               <w:rPr>
                 <w:rFonts w:ascii="Arial" w:hAnsi="Arial"/>
-                <w:b w:val="0"/>
-                <w:sz w:val="19"/>
+                <w:sz w:val="18"/>
               </w:rPr>
-              <w:t>Сложение и вычитание</w:t>
-            </w:r>
-          </w:p>
-        </w:tc>
-        <w:tc>
-          <w:tcPr>
-            <w:tcW w:type="dxa" w:w="2232"/>
-            <w:vAlign w:val="center"/>
-          </w:tcPr>
-          <w:p>
-            <w:pPr>
-              <w:jc w:val="left"/>
-            </w:pPr>
-            <w:r/>
-            <w:r>
-              <w:rPr>
-                <w:rFonts w:ascii="Arial" w:hAnsi="Arial"/>
-                <w:b w:val="0"/>
-                <w:sz w:val="19"/>
-              </w:rPr>
-              <w:t>Включение</w:t>
-            </w:r>
-          </w:p>
-        </w:tc>
-        <w:tc>
-          <w:tcPr>
-            <w:tcW w:type="dxa" w:w="2880"/>
-            <w:vAlign w:val="center"/>
-          </w:tcPr>
-          <w:p>
-            <w:pPr>
-              <w:jc w:val="left"/>
-            </w:pPr>
-            <w:r/>
-            <w:r>
-              <w:rPr>
-                <w:rFonts w:ascii="Arial" w:hAnsi="Arial"/>
-                <w:b w:val="0"/>
-                <w:sz w:val="19"/>
-              </w:rPr>
-              <w:t>IEcoCalculatorX</w:t>
+              <w:t>D3B3E2F1-8D21-4A6B-9A40-440000000060</w:t>
             </w:r>
           </w:p>
         </w:tc>
       </w:tr>
       <w:tr>
+        <w:trPr>
+          <w:cantSplit/>
+        </w:trPr>
         <w:tc>
           <w:tcPr>
-            <w:tcW w:type="dxa" w:w="1440"/>
+            <w:tcW w:type="dxa" w:w="2324"/>
             <w:vAlign w:val="center"/>
-            <w:shd w:fill="F2F6FA"/>
+            <w:tcMar>
+              <w:top w:w="75" w:type="dxa"/>
+              <w:bottom w:w="75" w:type="dxa"/>
+              <w:left w:w="95" w:type="dxa"/>
+              <w:right w:w="95" w:type="dxa"/>
+            </w:tcMar>
+            <w:shd w:fill="F1F5F8"/>
+            <w:tcBorders>
+              <w:top w:val="single" w:sz="4" w:color="D9D9D9"/>
+              <w:left w:val="single" w:sz="4" w:color="D9D9D9"/>
+              <w:bottom w:val="single" w:sz="4" w:color="D9D9D9"/>
+              <w:right w:val="single" w:sz="4" w:color="D9D9D9"/>
+            </w:tcBorders>
           </w:tcPr>
           <w:p>
             <w:pPr>
-              <w:jc w:val="left"/>
+              <w:spacing w:after="20" w:before="20" w:line="247" w:lineRule="auto"/>
             </w:pPr>
-            <w:r/>
             <w:r>
               <w:rPr>
                 <w:rFonts w:ascii="Arial" w:hAnsi="Arial"/>
-                <w:b w:val="0"/>
-                <w:sz w:val="19"/>
+                <w:sz w:val="18"/>
               </w:rPr>
               <w:t>B</w:t>
             </w:r>
@@ -403,84 +1867,65 @@
         </w:tc>
         <w:tc>
           <w:tcPr>
-            <w:tcW w:type="dxa" w:w="2880"/>
+            <w:tcW w:type="dxa" w:w="7313"/>
             <w:vAlign w:val="center"/>
-            <w:shd w:fill="F2F6FA"/>
+            <w:tcMar>
+              <w:top w:w="75" w:type="dxa"/>
+              <w:bottom w:w="75" w:type="dxa"/>
+              <w:left w:w="95" w:type="dxa"/>
+              <w:right w:w="95" w:type="dxa"/>
+            </w:tcMar>
+            <w:shd w:fill="F1F5F8"/>
+            <w:tcBorders>
+              <w:top w:val="single" w:sz="4" w:color="D9D9D9"/>
+              <w:left w:val="single" w:sz="4" w:color="D9D9D9"/>
+              <w:bottom w:val="single" w:sz="4" w:color="D9D9D9"/>
+              <w:right w:val="single" w:sz="4" w:color="D9D9D9"/>
+            </w:tcBorders>
           </w:tcPr>
           <w:p>
             <w:pPr>
-              <w:jc w:val="left"/>
+              <w:spacing w:after="20" w:before="20" w:line="247" w:lineRule="auto"/>
             </w:pPr>
-            <w:r/>
             <w:r>
               <w:rPr>
                 <w:rFonts w:ascii="Arial" w:hAnsi="Arial"/>
-                <w:b w:val="0"/>
-                <w:sz w:val="19"/>
+                <w:sz w:val="18"/>
               </w:rPr>
-              <w:t>Сложение и вычитание</w:t>
-            </w:r>
-          </w:p>
-        </w:tc>
-        <w:tc>
-          <w:tcPr>
-            <w:tcW w:type="dxa" w:w="2232"/>
-            <w:vAlign w:val="center"/>
-            <w:shd w:fill="F2F6FA"/>
-          </w:tcPr>
-          <w:p>
-            <w:pPr>
-              <w:jc w:val="left"/>
-            </w:pPr>
-            <w:r/>
-            <w:r>
-              <w:rPr>
-                <w:rFonts w:ascii="Arial" w:hAnsi="Arial"/>
-                <w:b w:val="0"/>
-                <w:sz w:val="19"/>
-              </w:rPr>
-              <w:t>Агрегирование</w:t>
-            </w:r>
-          </w:p>
-        </w:tc>
-        <w:tc>
-          <w:tcPr>
-            <w:tcW w:type="dxa" w:w="2880"/>
-            <w:vAlign w:val="center"/>
-            <w:shd w:fill="F2F6FA"/>
-          </w:tcPr>
-          <w:p>
-            <w:pPr>
-              <w:jc w:val="left"/>
-            </w:pPr>
-            <w:r/>
-            <w:r>
-              <w:rPr>
-                <w:rFonts w:ascii="Arial" w:hAnsi="Arial"/>
-                <w:b w:val="0"/>
-                <w:sz w:val="19"/>
-              </w:rPr>
-              <w:t>IEcoCalculatorX</w:t>
+              <w:t>D3B3E2F1-8D21-4A6B-9A40-440000000061</w:t>
             </w:r>
           </w:p>
         </w:tc>
       </w:tr>
       <w:tr>
+        <w:trPr>
+          <w:cantSplit/>
+        </w:trPr>
         <w:tc>
           <w:tcPr>
-            <w:tcW w:type="dxa" w:w="1440"/>
+            <w:tcW w:type="dxa" w:w="2324"/>
             <w:vAlign w:val="center"/>
+            <w:tcMar>
+              <w:top w:w="75" w:type="dxa"/>
+              <w:bottom w:w="75" w:type="dxa"/>
+              <w:left w:w="95" w:type="dxa"/>
+              <w:right w:w="95" w:type="dxa"/>
+            </w:tcMar>
+            <w:tcBorders>
+              <w:top w:val="single" w:sz="4" w:color="D9D9D9"/>
+              <w:left w:val="single" w:sz="4" w:color="D9D9D9"/>
+              <w:bottom w:val="single" w:sz="4" w:color="D9D9D9"/>
+              <w:right w:val="single" w:sz="4" w:color="D9D9D9"/>
+            </w:tcBorders>
           </w:tcPr>
           <w:p>
             <w:pPr>
-              <w:jc w:val="left"/>
+              <w:spacing w:after="20" w:before="20" w:line="247" w:lineRule="auto"/>
             </w:pPr>
-            <w:r/>
             <w:r>
               <w:rPr>
                 <w:rFonts w:ascii="Arial" w:hAnsi="Arial"/>
-                <w:b w:val="0"/>
-                <w:sz w:val="19"/>
+                <w:sz w:val="18"/>
               </w:rPr>
               <w:t>C</w:t>
             </w:r>
@@ -488,82 +1933,65 @@
         </w:tc>
         <w:tc>
           <w:tcPr>
-            <w:tcW w:type="dxa" w:w="2880"/>
+            <w:tcW w:type="dxa" w:w="7313"/>
             <w:vAlign w:val="center"/>
+            <w:tcMar>
+              <w:top w:w="75" w:type="dxa"/>
+              <w:bottom w:w="75" w:type="dxa"/>
+              <w:left w:w="95" w:type="dxa"/>
+              <w:right w:w="95" w:type="dxa"/>
+            </w:tcMar>
+            <w:tcBorders>
+              <w:top w:val="single" w:sz="4" w:color="D9D9D9"/>
+              <w:left w:val="single" w:sz="4" w:color="D9D9D9"/>
+              <w:bottom w:val="single" w:sz="4" w:color="D9D9D9"/>
+              <w:right w:val="single" w:sz="4" w:color="D9D9D9"/>
+            </w:tcBorders>
           </w:tcPr>
           <w:p>
             <w:pPr>
-              <w:jc w:val="left"/>
+              <w:spacing w:after="20" w:before="20" w:line="247" w:lineRule="auto"/>
             </w:pPr>
-            <w:r/>
             <w:r>
               <w:rPr>
                 <w:rFonts w:ascii="Arial" w:hAnsi="Arial"/>
-                <w:b w:val="0"/>
-                <w:sz w:val="19"/>
+                <w:sz w:val="18"/>
               </w:rPr>
-              <w:t>Компоновщик X и Y</w:t>
-            </w:r>
-          </w:p>
-        </w:tc>
-        <w:tc>
-          <w:tcPr>
-            <w:tcW w:type="dxa" w:w="2232"/>
-            <w:vAlign w:val="center"/>
-          </w:tcPr>
-          <w:p>
-            <w:pPr>
-              <w:jc w:val="left"/>
-            </w:pPr>
-            <w:r/>
-            <w:r>
-              <w:rPr>
-                <w:rFonts w:ascii="Arial" w:hAnsi="Arial"/>
-                <w:b w:val="0"/>
-                <w:sz w:val="19"/>
-              </w:rPr>
-              <w:t>Включение</w:t>
-            </w:r>
-          </w:p>
-        </w:tc>
-        <w:tc>
-          <w:tcPr>
-            <w:tcW w:type="dxa" w:w="2880"/>
-            <w:vAlign w:val="center"/>
-          </w:tcPr>
-          <w:p>
-            <w:pPr>
-              <w:jc w:val="left"/>
-            </w:pPr>
-            <w:r/>
-            <w:r>
-              <w:rPr>
-                <w:rFonts w:ascii="Arial" w:hAnsi="Arial"/>
-                <w:b w:val="0"/>
-                <w:sz w:val="19"/>
-              </w:rPr>
-              <w:t>IEcoCalculatorX, IEcoCalculatorY</w:t>
+              <w:t>D3B3E2F1-8D21-4A6B-9A40-440000000062</w:t>
             </w:r>
           </w:p>
         </w:tc>
       </w:tr>
       <w:tr>
+        <w:trPr>
+          <w:cantSplit/>
+        </w:trPr>
         <w:tc>
           <w:tcPr>
-            <w:tcW w:type="dxa" w:w="1440"/>
+            <w:tcW w:type="dxa" w:w="2324"/>
             <w:vAlign w:val="center"/>
-            <w:shd w:fill="F2F6FA"/>
+            <w:tcMar>
+              <w:top w:w="75" w:type="dxa"/>
+              <w:bottom w:w="75" w:type="dxa"/>
+              <w:left w:w="95" w:type="dxa"/>
+              <w:right w:w="95" w:type="dxa"/>
+            </w:tcMar>
+            <w:shd w:fill="F1F5F8"/>
+            <w:tcBorders>
+              <w:top w:val="single" w:sz="4" w:color="D9D9D9"/>
+              <w:left w:val="single" w:sz="4" w:color="D9D9D9"/>
+              <w:bottom w:val="single" w:sz="4" w:color="D9D9D9"/>
+              <w:right w:val="single" w:sz="4" w:color="D9D9D9"/>
+            </w:tcBorders>
           </w:tcPr>
           <w:p>
             <w:pPr>
-              <w:jc w:val="left"/>
+              <w:spacing w:after="20" w:before="20" w:line="247" w:lineRule="auto"/>
             </w:pPr>
-            <w:r/>
             <w:r>
               <w:rPr>
                 <w:rFonts w:ascii="Arial" w:hAnsi="Arial"/>
-                <w:b w:val="0"/>
-                <w:sz w:val="19"/>
+                <w:sz w:val="18"/>
               </w:rPr>
               <w:t>D</w:t>
             </w:r>
@@ -571,84 +1999,65 @@
         </w:tc>
         <w:tc>
           <w:tcPr>
-            <w:tcW w:type="dxa" w:w="2880"/>
+            <w:tcW w:type="dxa" w:w="7313"/>
             <w:vAlign w:val="center"/>
-            <w:shd w:fill="F2F6FA"/>
+            <w:tcMar>
+              <w:top w:w="75" w:type="dxa"/>
+              <w:bottom w:w="75" w:type="dxa"/>
+              <w:left w:w="95" w:type="dxa"/>
+              <w:right w:w="95" w:type="dxa"/>
+            </w:tcMar>
+            <w:shd w:fill="F1F5F8"/>
+            <w:tcBorders>
+              <w:top w:val="single" w:sz="4" w:color="D9D9D9"/>
+              <w:left w:val="single" w:sz="4" w:color="D9D9D9"/>
+              <w:bottom w:val="single" w:sz="4" w:color="D9D9D9"/>
+              <w:right w:val="single" w:sz="4" w:color="D9D9D9"/>
+            </w:tcBorders>
           </w:tcPr>
           <w:p>
             <w:pPr>
-              <w:jc w:val="left"/>
+              <w:spacing w:after="20" w:before="20" w:line="247" w:lineRule="auto"/>
             </w:pPr>
-            <w:r/>
             <w:r>
               <w:rPr>
                 <w:rFonts w:ascii="Arial" w:hAnsi="Arial"/>
-                <w:b w:val="0"/>
-                <w:sz w:val="19"/>
+                <w:sz w:val="18"/>
               </w:rPr>
-              <w:t>Умножение и деление</w:t>
-            </w:r>
-          </w:p>
-        </w:tc>
-        <w:tc>
-          <w:tcPr>
-            <w:tcW w:type="dxa" w:w="2232"/>
-            <w:vAlign w:val="center"/>
-            <w:shd w:fill="F2F6FA"/>
-          </w:tcPr>
-          <w:p>
-            <w:pPr>
-              <w:jc w:val="left"/>
-            </w:pPr>
-            <w:r/>
-            <w:r>
-              <w:rPr>
-                <w:rFonts w:ascii="Arial" w:hAnsi="Arial"/>
-                <w:b w:val="0"/>
-                <w:sz w:val="19"/>
-              </w:rPr>
-              <w:t>Включение</w:t>
-            </w:r>
-          </w:p>
-        </w:tc>
-        <w:tc>
-          <w:tcPr>
-            <w:tcW w:type="dxa" w:w="2880"/>
-            <w:vAlign w:val="center"/>
-            <w:shd w:fill="F2F6FA"/>
-          </w:tcPr>
-          <w:p>
-            <w:pPr>
-              <w:jc w:val="left"/>
-            </w:pPr>
-            <w:r/>
-            <w:r>
-              <w:rPr>
-                <w:rFonts w:ascii="Arial" w:hAnsi="Arial"/>
-                <w:b w:val="0"/>
-                <w:sz w:val="19"/>
-              </w:rPr>
-              <w:t>IEcoCalculatorY</w:t>
+              <w:t>D3B3E2F1-8D21-4A6B-9A40-440000000063</w:t>
             </w:r>
           </w:p>
         </w:tc>
       </w:tr>
       <w:tr>
+        <w:trPr>
+          <w:cantSplit/>
+        </w:trPr>
         <w:tc>
           <w:tcPr>
-            <w:tcW w:type="dxa" w:w="1440"/>
+            <w:tcW w:type="dxa" w:w="2324"/>
             <w:vAlign w:val="center"/>
+            <w:tcMar>
+              <w:top w:w="75" w:type="dxa"/>
+              <w:bottom w:w="75" w:type="dxa"/>
+              <w:left w:w="95" w:type="dxa"/>
+              <w:right w:w="95" w:type="dxa"/>
+            </w:tcMar>
+            <w:tcBorders>
+              <w:top w:val="single" w:sz="4" w:color="D9D9D9"/>
+              <w:left w:val="single" w:sz="4" w:color="D9D9D9"/>
+              <w:bottom w:val="single" w:sz="4" w:color="D9D9D9"/>
+              <w:right w:val="single" w:sz="4" w:color="D9D9D9"/>
+            </w:tcBorders>
           </w:tcPr>
           <w:p>
             <w:pPr>
-              <w:jc w:val="left"/>
+              <w:spacing w:after="20" w:before="20" w:line="247" w:lineRule="auto"/>
             </w:pPr>
-            <w:r/>
             <w:r>
               <w:rPr>
                 <w:rFonts w:ascii="Arial" w:hAnsi="Arial"/>
-                <w:b w:val="0"/>
-                <w:sz w:val="19"/>
+                <w:sz w:val="18"/>
               </w:rPr>
               <w:t>E</w:t>
             </w:r>
@@ -656,167 +2065,65 @@
         </w:tc>
         <w:tc>
           <w:tcPr>
-            <w:tcW w:type="dxa" w:w="2880"/>
+            <w:tcW w:type="dxa" w:w="7313"/>
             <w:vAlign w:val="center"/>
+            <w:tcMar>
+              <w:top w:w="75" w:type="dxa"/>
+              <w:bottom w:w="75" w:type="dxa"/>
+              <w:left w:w="95" w:type="dxa"/>
+              <w:right w:w="95" w:type="dxa"/>
+            </w:tcMar>
+            <w:tcBorders>
+              <w:top w:val="single" w:sz="4" w:color="D9D9D9"/>
+              <w:left w:val="single" w:sz="4" w:color="D9D9D9"/>
+              <w:bottom w:val="single" w:sz="4" w:color="D9D9D9"/>
+              <w:right w:val="single" w:sz="4" w:color="D9D9D9"/>
+            </w:tcBorders>
           </w:tcPr>
           <w:p>
             <w:pPr>
-              <w:jc w:val="left"/>
+              <w:spacing w:after="20" w:before="20" w:line="247" w:lineRule="auto"/>
             </w:pPr>
-            <w:r/>
             <w:r>
               <w:rPr>
                 <w:rFonts w:ascii="Arial" w:hAnsi="Arial"/>
-                <w:b w:val="0"/>
-                <w:sz w:val="19"/>
+                <w:sz w:val="18"/>
               </w:rPr>
-              <w:t>Умножение и деление</w:t>
-            </w:r>
-          </w:p>
-        </w:tc>
-        <w:tc>
-          <w:tcPr>
-            <w:tcW w:type="dxa" w:w="2232"/>
-            <w:vAlign w:val="center"/>
-          </w:tcPr>
-          <w:p>
-            <w:pPr>
-              <w:jc w:val="left"/>
-            </w:pPr>
-            <w:r/>
-            <w:r>
-              <w:rPr>
-                <w:rFonts w:ascii="Arial" w:hAnsi="Arial"/>
-                <w:b w:val="0"/>
-                <w:sz w:val="19"/>
-              </w:rPr>
-              <w:t>Агрегирование</w:t>
-            </w:r>
-          </w:p>
-        </w:tc>
-        <w:tc>
-          <w:tcPr>
-            <w:tcW w:type="dxa" w:w="2880"/>
-            <w:vAlign w:val="center"/>
-          </w:tcPr>
-          <w:p>
-            <w:pPr>
-              <w:jc w:val="left"/>
-            </w:pPr>
-            <w:r/>
-            <w:r>
-              <w:rPr>
-                <w:rFonts w:ascii="Arial" w:hAnsi="Arial"/>
-                <w:b w:val="0"/>
-                <w:sz w:val="19"/>
-              </w:rPr>
-              <w:t>IEcoCalculatorY</w:t>
+              <w:t>D3B3E2F1-8D21-4A6B-9A40-440000000064</w:t>
             </w:r>
           </w:p>
         </w:tc>
       </w:tr>
       <w:tr>
+        <w:trPr>
+          <w:cantSplit/>
+        </w:trPr>
         <w:tc>
           <w:tcPr>
-            <w:tcW w:type="dxa" w:w="1440"/>
+            <w:tcW w:type="dxa" w:w="2324"/>
             <w:vAlign w:val="center"/>
-            <w:shd w:fill="F2F6FA"/>
+            <w:tcMar>
+              <w:top w:w="75" w:type="dxa"/>
+              <w:bottom w:w="75" w:type="dxa"/>
+              <w:left w:w="95" w:type="dxa"/>
+              <w:right w:w="95" w:type="dxa"/>
+            </w:tcMar>
+            <w:shd w:fill="F1F5F8"/>
+            <w:tcBorders>
+              <w:top w:val="single" w:sz="4" w:color="D9D9D9"/>
+              <w:left w:val="single" w:sz="4" w:color="D9D9D9"/>
+              <w:bottom w:val="single" w:sz="4" w:color="D9D9D9"/>
+              <w:right w:val="single" w:sz="4" w:color="D9D9D9"/>
+            </w:tcBorders>
           </w:tcPr>
           <w:p>
             <w:pPr>
-              <w:jc w:val="left"/>
+              <w:spacing w:after="20" w:before="20" w:line="247" w:lineRule="auto"/>
             </w:pPr>
-            <w:r/>
             <w:r>
               <w:rPr>
                 <w:rFonts w:ascii="Arial" w:hAnsi="Arial"/>
-                <w:b w:val="0"/>
-                <w:sz w:val="19"/>
-              </w:rPr>
-              <w:t>Eco.Lab1</w:t>
-            </w:r>
-          </w:p>
-        </w:tc>
-        <w:tc>
-          <w:tcPr>
-            <w:tcW w:type="dxa" w:w="2880"/>
-            <w:vAlign w:val="center"/>
-            <w:shd w:fill="F2F6FA"/>
-          </w:tcPr>
-          <w:p>
-            <w:pPr>
-              <w:jc w:val="left"/>
-            </w:pPr>
-            <w:r/>
-            <w:r>
-              <w:rPr>
-                <w:rFonts w:ascii="Arial" w:hAnsi="Arial"/>
-                <w:b w:val="0"/>
-                <w:sz w:val="19"/>
-              </w:rPr>
-              <w:t>polyfit и calculator facade</w:t>
-            </w:r>
-          </w:p>
-        </w:tc>
-        <w:tc>
-          <w:tcPr>
-            <w:tcW w:type="dxa" w:w="2232"/>
-            <w:vAlign w:val="center"/>
-            <w:shd w:fill="F2F6FA"/>
-          </w:tcPr>
-          <w:p>
-            <w:pPr>
-              <w:jc w:val="left"/>
-            </w:pPr>
-            <w:r/>
-            <w:r>
-              <w:rPr>
-                <w:rFonts w:ascii="Arial" w:hAnsi="Arial"/>
-                <w:b w:val="0"/>
-                <w:sz w:val="19"/>
-              </w:rPr>
-              <w:t>Агрегируется Eco.Lab2</w:t>
-            </w:r>
-          </w:p>
-        </w:tc>
-        <w:tc>
-          <w:tcPr>
-            <w:tcW w:type="dxa" w:w="2880"/>
-            <w:vAlign w:val="center"/>
-            <w:shd w:fill="F2F6FA"/>
-          </w:tcPr>
-          <w:p>
-            <w:pPr>
-              <w:jc w:val="left"/>
-            </w:pPr>
-            <w:r/>
-            <w:r>
-              <w:rPr>
-                <w:rFonts w:ascii="Arial" w:hAnsi="Arial"/>
-                <w:b w:val="0"/>
-                <w:sz w:val="19"/>
-              </w:rPr>
-              <w:t>IEcoLab1, IEcoPolynomialMath, X, Y</w:t>
-            </w:r>
-          </w:p>
-        </w:tc>
-      </w:tr>
-      <w:tr>
-        <w:tc>
-          <w:tcPr>
-            <w:tcW w:type="dxa" w:w="1440"/>
-            <w:vAlign w:val="center"/>
-          </w:tcPr>
-          <w:p>
-            <w:pPr>
-              <w:jc w:val="left"/>
-            </w:pPr>
-            <w:r/>
-            <w:r>
-              <w:rPr>
-                <w:rFonts w:ascii="Arial" w:hAnsi="Arial"/>
-                <w:b w:val="0"/>
-                <w:sz w:val="19"/>
+                <w:sz w:val="18"/>
               </w:rPr>
               <w:t>Eco.Lab2</w:t>
             </w:r>
@@ -824,61 +2131,32 @@
         </w:tc>
         <w:tc>
           <w:tcPr>
-            <w:tcW w:type="dxa" w:w="2880"/>
+            <w:tcW w:type="dxa" w:w="7313"/>
             <w:vAlign w:val="center"/>
+            <w:tcMar>
+              <w:top w:w="75" w:type="dxa"/>
+              <w:bottom w:w="75" w:type="dxa"/>
+              <w:left w:w="95" w:type="dxa"/>
+              <w:right w:w="95" w:type="dxa"/>
+            </w:tcMar>
+            <w:shd w:fill="F1F5F8"/>
+            <w:tcBorders>
+              <w:top w:val="single" w:sz="4" w:color="D9D9D9"/>
+              <w:left w:val="single" w:sz="4" w:color="D9D9D9"/>
+              <w:bottom w:val="single" w:sz="4" w:color="D9D9D9"/>
+              <w:right w:val="single" w:sz="4" w:color="D9D9D9"/>
+            </w:tcBorders>
           </w:tcPr>
           <w:p>
             <w:pPr>
-              <w:jc w:val="left"/>
+              <w:spacing w:after="20" w:before="20" w:line="247" w:lineRule="auto"/>
             </w:pPr>
-            <w:r/>
             <w:r>
               <w:rPr>
                 <w:rFonts w:ascii="Arial" w:hAnsi="Arial"/>
-                <w:b w:val="0"/>
-                <w:sz w:val="19"/>
+                <w:sz w:val="18"/>
               </w:rPr>
-              <w:t>Внешний компоновщик</w:t>
-            </w:r>
-          </w:p>
-        </w:tc>
-        <w:tc>
-          <w:tcPr>
-            <w:tcW w:type="dxa" w:w="2232"/>
-            <w:vAlign w:val="center"/>
-          </w:tcPr>
-          <w:p>
-            <w:pPr>
-              <w:jc w:val="left"/>
-            </w:pPr>
-            <w:r/>
-            <w:r>
-              <w:rPr>
-                <w:rFonts w:ascii="Arial" w:hAnsi="Arial"/>
-                <w:b w:val="0"/>
-                <w:sz w:val="19"/>
-              </w:rPr>
-              <w:t>Владеет графом</w:t>
-            </w:r>
-          </w:p>
-        </w:tc>
-        <w:tc>
-          <w:tcPr>
-            <w:tcW w:type="dxa" w:w="2880"/>
-            <w:vAlign w:val="center"/>
-          </w:tcPr>
-          <w:p>
-            <w:pPr>
-              <w:jc w:val="left"/>
-            </w:pPr>
-            <w:r/>
-            <w:r>
-              <w:rPr>
-                <w:rFonts w:ascii="Arial" w:hAnsi="Arial"/>
-                <w:b w:val="0"/>
-                <w:sz w:val="19"/>
-              </w:rPr>
-              <w:t>IEcoLab2, IEcoLab1, X, Y</w:t>
+              <w:t>D3B3E2F1-8D21-4A6B-9A40-440000000065</w:t>
             </w:r>
           </w:p>
         </w:tc>
@@ -886,365 +2164,40 @@
     </w:tbl>
     <w:p>
       <w:pPr>
+        <w:widowControl/>
         <w:spacing w:after="40"/>
       </w:pPr>
     </w:p>
     <w:p>
       <w:pPr>
-        <w:pStyle w:val="Heading1"/>
+        <w:pStyle w:val="Heading2"/>
       </w:pPr>
       <w:r>
-        <w:t>3. Интерфейсы ACOM</w:t>
+        <w:rPr>
+          <w:color w:val="000000"/>
+        </w:rPr>
+        <w:t>Ошибки и ограничения контракта</w:t>
+      </w:r>
+    </w:p>
+    <w:p>
+      <w:pPr>
+        <w:widowControl/>
+      </w:pPr>
+      <w:r>
+        <w:t>QueryInterface очищает выход до проверки me/riid, поддерживает IEcoUnknown и отвергает неизвестный IID. Для агрегированного создания outer допускается только с IID_IEcoUnknown. TryDivision сообщает об ошибке при b = 0 и обнуляет выход. Division при недопустимом вызове возвращает 0; статус ошибки следует получать через TryDivision.</w:t>
+      </w:r>
+    </w:p>
+    <w:p>
+      <w:pPr>
+        <w:widowControl/>
+      </w:pPr>
+      <w:r>
+        <w:t>Заголовки и IDL находятся в SharedFiles. Контракт IDL обновлён; генерация межпроцессного маршалинга в данную лабораторную работу не входит. Численный и компонентный код компилируется как C89 без стандартных заголовков/прямых вызовов libc.</w:t>
       </w:r>
     </w:p>
     <w:p>
       <w:r>
-        <w:t>IEcoCalculatorX содержит операции Addition и Subtraction. IEcoCalculatorY содержит Multiplication, Division и TryDivision. Первые четыре метода совместимы с учебным примером из задания и возвращают числовой результат напрямую. TryDivision возвращает int16_t и записывает результат через out-параметр, поэтому деление на ноль обрабатывается без неопределённого поведения.</w:t>
-      </w:r>
-    </w:p>
-    <w:tbl>
-      <w:tblPr>
-        <w:tblStyle w:val="TableGrid"/>
-        <w:tblW w:type="auto" w:w="0"/>
-        <w:jc w:val="center"/>
-        <w:tblLook w:firstColumn="1" w:firstRow="1" w:lastColumn="0" w:lastRow="0" w:noHBand="0" w:noVBand="1" w:val="04A0"/>
-      </w:tblPr>
-      <w:tblGrid>
-        <w:gridCol w:w="3336"/>
-        <w:gridCol w:w="3336"/>
-        <w:gridCol w:w="3336"/>
-      </w:tblGrid>
-      <w:tr>
-        <w:tc>
-          <w:tcPr>
-            <w:tcW w:type="dxa" w:w="1872"/>
-            <w:vAlign w:val="center"/>
-            <w:shd w:fill="1F4E78"/>
-          </w:tcPr>
-          <w:p>
-            <w:pPr>
-              <w:jc w:val="left"/>
-            </w:pPr>
-            <w:r/>
-            <w:r>
-              <w:rPr>
-                <w:rFonts w:ascii="Arial" w:hAnsi="Arial"/>
-                <w:b/>
-                <w:color w:val="FFFFFF"/>
-                <w:sz w:val="19"/>
-              </w:rPr>
-              <w:t>Интерфейс</w:t>
-            </w:r>
-          </w:p>
-        </w:tc>
-        <w:tc>
-          <w:tcPr>
-            <w:tcW w:type="dxa" w:w="4608"/>
-            <w:vAlign w:val="center"/>
-            <w:shd w:fill="1F4E78"/>
-          </w:tcPr>
-          <w:p>
-            <w:pPr>
-              <w:jc w:val="left"/>
-            </w:pPr>
-            <w:r/>
-            <w:r>
-              <w:rPr>
-                <w:rFonts w:ascii="Arial" w:hAnsi="Arial"/>
-                <w:b/>
-                <w:color w:val="FFFFFF"/>
-                <w:sz w:val="19"/>
-              </w:rPr>
-              <w:t>Ключевые методы</w:t>
-            </w:r>
-          </w:p>
-        </w:tc>
-        <w:tc>
-          <w:tcPr>
-            <w:tcW w:type="dxa" w:w="2304"/>
-            <w:vAlign w:val="center"/>
-            <w:shd w:fill="1F4E78"/>
-          </w:tcPr>
-          <w:p>
-            <w:pPr>
-              <w:jc w:val="left"/>
-            </w:pPr>
-            <w:r/>
-            <w:r>
-              <w:rPr>
-                <w:rFonts w:ascii="Arial" w:hAnsi="Arial"/>
-                <w:b/>
-                <w:color w:val="FFFFFF"/>
-                <w:sz w:val="19"/>
-              </w:rPr>
-              <w:t>IID</w:t>
-            </w:r>
-          </w:p>
-        </w:tc>
-      </w:tr>
-      <w:tr>
-        <w:tc>
-          <w:tcPr>
-            <w:tcW w:type="dxa" w:w="1872"/>
-            <w:vAlign w:val="center"/>
-          </w:tcPr>
-          <w:p>
-            <w:pPr>
-              <w:jc w:val="left"/>
-            </w:pPr>
-            <w:r/>
-            <w:r>
-              <w:rPr>
-                <w:rFonts w:ascii="Arial" w:hAnsi="Arial"/>
-                <w:b w:val="0"/>
-                <w:sz w:val="19"/>
-              </w:rPr>
-              <w:t>IEcoCalculatorX</w:t>
-            </w:r>
-          </w:p>
-        </w:tc>
-        <w:tc>
-          <w:tcPr>
-            <w:tcW w:type="dxa" w:w="4608"/>
-            <w:vAlign w:val="center"/>
-          </w:tcPr>
-          <w:p>
-            <w:pPr>
-              <w:jc w:val="left"/>
-            </w:pPr>
-            <w:r/>
-            <w:r>
-              <w:rPr>
-                <w:rFonts w:ascii="Arial" w:hAnsi="Arial"/>
-                <w:b w:val="0"/>
-                <w:sz w:val="19"/>
-              </w:rPr>
-              <w:t>Addition, Subtraction</w:t>
-            </w:r>
-          </w:p>
-        </w:tc>
-        <w:tc>
-          <w:tcPr>
-            <w:tcW w:type="dxa" w:w="2304"/>
-            <w:vAlign w:val="center"/>
-          </w:tcPr>
-          <w:p>
-            <w:pPr>
-              <w:jc w:val="left"/>
-            </w:pPr>
-            <w:r/>
-            <w:r>
-              <w:rPr>
-                <w:rFonts w:ascii="Arial" w:hAnsi="Arial"/>
-                <w:b w:val="0"/>
-                <w:sz w:val="19"/>
-              </w:rPr>
-              <w:t>...0050</w:t>
-            </w:r>
-          </w:p>
-        </w:tc>
-      </w:tr>
-      <w:tr>
-        <w:tc>
-          <w:tcPr>
-            <w:tcW w:type="dxa" w:w="1872"/>
-            <w:vAlign w:val="center"/>
-            <w:shd w:fill="F2F6FA"/>
-          </w:tcPr>
-          <w:p>
-            <w:pPr>
-              <w:jc w:val="left"/>
-            </w:pPr>
-            <w:r/>
-            <w:r>
-              <w:rPr>
-                <w:rFonts w:ascii="Arial" w:hAnsi="Arial"/>
-                <w:b w:val="0"/>
-                <w:sz w:val="19"/>
-              </w:rPr>
-              <w:t>IEcoCalculatorY</w:t>
-            </w:r>
-          </w:p>
-        </w:tc>
-        <w:tc>
-          <w:tcPr>
-            <w:tcW w:type="dxa" w:w="4608"/>
-            <w:vAlign w:val="center"/>
-            <w:shd w:fill="F2F6FA"/>
-          </w:tcPr>
-          <w:p>
-            <w:pPr>
-              <w:jc w:val="left"/>
-            </w:pPr>
-            <w:r/>
-            <w:r>
-              <w:rPr>
-                <w:rFonts w:ascii="Arial" w:hAnsi="Arial"/>
-                <w:b w:val="0"/>
-                <w:sz w:val="19"/>
-              </w:rPr>
-              <w:t>Multiplication, Division, TryDivision</w:t>
-            </w:r>
-          </w:p>
-        </w:tc>
-        <w:tc>
-          <w:tcPr>
-            <w:tcW w:type="dxa" w:w="2304"/>
-            <w:vAlign w:val="center"/>
-            <w:shd w:fill="F2F6FA"/>
-          </w:tcPr>
-          <w:p>
-            <w:pPr>
-              <w:jc w:val="left"/>
-            </w:pPr>
-            <w:r/>
-            <w:r>
-              <w:rPr>
-                <w:rFonts w:ascii="Arial" w:hAnsi="Arial"/>
-                <w:b w:val="0"/>
-                <w:sz w:val="19"/>
-              </w:rPr>
-              <w:t>...0051</w:t>
-            </w:r>
-          </w:p>
-        </w:tc>
-      </w:tr>
-      <w:tr>
-        <w:tc>
-          <w:tcPr>
-            <w:tcW w:type="dxa" w:w="1872"/>
-            <w:vAlign w:val="center"/>
-          </w:tcPr>
-          <w:p>
-            <w:pPr>
-              <w:jc w:val="left"/>
-            </w:pPr>
-            <w:r/>
-            <w:r>
-              <w:rPr>
-                <w:rFonts w:ascii="Arial" w:hAnsi="Arial"/>
-                <w:b w:val="0"/>
-                <w:sz w:val="19"/>
-              </w:rPr>
-              <w:t>IEcoLab1</w:t>
-            </w:r>
-          </w:p>
-        </w:tc>
-        <w:tc>
-          <w:tcPr>
-            <w:tcW w:type="dxa" w:w="4608"/>
-            <w:vAlign w:val="center"/>
-          </w:tcPr>
-          <w:p>
-            <w:pPr>
-              <w:jc w:val="left"/>
-            </w:pPr>
-            <w:r/>
-            <w:r>
-              <w:rPr>
-                <w:rFonts w:ascii="Arial" w:hAnsi="Arial"/>
-                <w:b w:val="0"/>
-                <w:sz w:val="19"/>
-              </w:rPr>
-              <w:t>QueryInterface, AddRef, Release</w:t>
-            </w:r>
-          </w:p>
-        </w:tc>
-        <w:tc>
-          <w:tcPr>
-            <w:tcW w:type="dxa" w:w="2304"/>
-            <w:vAlign w:val="center"/>
-          </w:tcPr>
-          <w:p>
-            <w:pPr>
-              <w:jc w:val="left"/>
-            </w:pPr>
-            <w:r/>
-            <w:r>
-              <w:rPr>
-                <w:rFonts w:ascii="Arial" w:hAnsi="Arial"/>
-                <w:b w:val="0"/>
-                <w:sz w:val="19"/>
-              </w:rPr>
-              <w:t>...0052</w:t>
-            </w:r>
-          </w:p>
-        </w:tc>
-      </w:tr>
-      <w:tr>
-        <w:tc>
-          <w:tcPr>
-            <w:tcW w:type="dxa" w:w="1872"/>
-            <w:vAlign w:val="center"/>
-            <w:shd w:fill="F2F6FA"/>
-          </w:tcPr>
-          <w:p>
-            <w:pPr>
-              <w:jc w:val="left"/>
-            </w:pPr>
-            <w:r/>
-            <w:r>
-              <w:rPr>
-                <w:rFonts w:ascii="Arial" w:hAnsi="Arial"/>
-                <w:b w:val="0"/>
-                <w:sz w:val="19"/>
-              </w:rPr>
-              <w:t>IEcoLab2</w:t>
-            </w:r>
-          </w:p>
-        </w:tc>
-        <w:tc>
-          <w:tcPr>
-            <w:tcW w:type="dxa" w:w="4608"/>
-            <w:vAlign w:val="center"/>
-            <w:shd w:fill="F2F6FA"/>
-          </w:tcPr>
-          <w:p>
-            <w:pPr>
-              <w:jc w:val="left"/>
-            </w:pPr>
-            <w:r/>
-            <w:r>
-              <w:rPr>
-                <w:rFonts w:ascii="Arial" w:hAnsi="Arial"/>
-                <w:b w:val="0"/>
-                <w:sz w:val="19"/>
-              </w:rPr>
-              <w:t>QueryInterface, AddRef, Release</w:t>
-            </w:r>
-          </w:p>
-        </w:tc>
-        <w:tc>
-          <w:tcPr>
-            <w:tcW w:type="dxa" w:w="2304"/>
-            <w:vAlign w:val="center"/>
-            <w:shd w:fill="F2F6FA"/>
-          </w:tcPr>
-          <w:p>
-            <w:pPr>
-              <w:jc w:val="left"/>
-            </w:pPr>
-            <w:r/>
-            <w:r>
-              <w:rPr>
-                <w:rFonts w:ascii="Arial" w:hAnsi="Arial"/>
-                <w:b w:val="0"/>
-                <w:sz w:val="19"/>
-              </w:rPr>
-              <w:t>...0053</w:t>
-            </w:r>
-          </w:p>
-        </w:tc>
-      </w:tr>
-    </w:tbl>
-    <w:p>
-      <w:pPr>
-        <w:spacing w:after="40"/>
-      </w:pPr>
-    </w:p>
-    <w:p>
-      <w:r>
-        <w:t>Для A–E и Eco.Lab2 определены отдельные CID. QueryInterface очищает out-параметр до обработки запроса, проверяет me и riid и возвращает ERR_ECO_NOINTERFACE для неизвестного идентификатора.</w:t>
+        <w:br w:type="page"/>
       </w:r>
     </w:p>
     <w:p>
@@ -1252,38 +2205,98 @@
         <w:pStyle w:val="Heading1"/>
       </w:pPr>
       <w:r>
-        <w:t>4. Включение и агрегирование</w:t>
+        <w:rPr>
+          <w:color w:val="000000"/>
+        </w:rPr>
+        <w:t>4 Включение и управление агрегатом</w:t>
       </w:r>
     </w:p>
     <w:p>
       <w:pPr>
-        <w:pStyle w:val="Heading2"/>
+        <w:widowControl/>
       </w:pPr>
       <w:r>
-        <w:t>4.1. Включение</w:t>
+        <w:t>При включении внешний объект владеет обычным дочерним интерфейсом и вызывает его Release при уничтожении. Публичный фасад внешнего объекта перенаправляет операции, сохраняя собственную identity. Дочерний объект сохраняет независимый IEcoUnknown.</w:t>
+      </w:r>
+    </w:p>
+    <w:p>
+      <w:pPr>
+        <w:widowControl/>
+      </w:pPr>
+      <w:r>
+        <w:t>При агрегировании нужны два уровня unknown: публичный делегирует управляющему unknown владельца, приватный неделегирующий управляет внутренним временем жизни. Возврат совпадающего публичного unknown сам по себе недостаточен: требуется корректное освобождение через приватную ссылку.</w:t>
+      </w:r>
+    </w:p>
+    <w:p>
+      <w:pPr>
+        <w:widowControl/>
+        <w:spacing w:after="40"/>
+        <w:jc w:val="center"/>
+      </w:pPr>
+      <w:r>
+        <w:drawing>
+          <wp:inline xmlns:a="http://schemas.openxmlformats.org/drawingml/2006/main" xmlns:pic="http://schemas.openxmlformats.org/drawingml/2006/picture">
+            <wp:extent cx="6048000" cy="4147200"/>
+            <wp:docPr id="2" name="Picture 2"/>
+            <wp:cNvGraphicFramePr>
+              <a:graphicFrameLocks noChangeAspect="1"/>
+            </wp:cNvGraphicFramePr>
+            <a:graphic>
+              <a:graphicData uri="http://schemas.openxmlformats.org/drawingml/2006/picture">
+                <pic:pic>
+                  <pic:nvPicPr>
+                    <pic:cNvPr id="0" name="lab2_lifetime.png"/>
+                    <pic:cNvPicPr/>
+                  </pic:nvPicPr>
+                  <pic:blipFill>
+                    <a:blip r:embed="rId12"/>
+                    <a:stretch>
+                      <a:fillRect/>
+                    </a:stretch>
+                  </pic:blipFill>
+                  <pic:spPr>
+                    <a:xfrm>
+                      <a:off x="0" y="0"/>
+                      <a:ext cx="6048000" cy="4147200"/>
+                    </a:xfrm>
+                    <a:prstGeom prst="rect"/>
+                  </pic:spPr>
+                </pic:pic>
+              </a:graphicData>
+            </a:graphic>
+          </wp:inline>
+        </w:drawing>
+      </w:r>
+    </w:p>
+    <w:p>
+      <w:pPr>
+        <w:pStyle w:val="Caption"/>
+        <w:widowControl/>
+        <w:jc w:val="center"/>
+      </w:pPr>
+      <w:r>
+        <w:t>Рисунок 2. Разделение публичных ссылок и приватного времени жизни</w:t>
+      </w:r>
+    </w:p>
+    <w:p>
+      <w:pPr>
+        <w:widowControl/>
+      </w:pPr>
+      <w:r>
+        <w:t>Lab2 создаёт Lab1 с outer = Lab2 и IID_IEcoUnknown. Полученную приватную ссылку хранит до разрушения. Когда клиент получает Lab1, X/Y или PolynomialMath, AddRef увеличивает внешний счётчик. Эти интерфейсы остаются рабочими после освобождения отдельной корневой ссылки клиента.</w:t>
+      </w:r>
+    </w:p>
+    <w:p>
+      <w:pPr>
+        <w:widowControl/>
+      </w:pPr>
+      <w:r>
+        <w:t>Последний внешний Release сначала освобождает private unknown Lab1 и включённый E, затем system и allocator. E аналогично освобождает private unknown своего B. Внешний код не приводит интерфейсы к структурам чужих компонентов и не вызывает их конкретные destroy-функции.</w:t>
       </w:r>
     </w:p>
     <w:p>
       <w:r>
-        <w:t>Включённый компонент создаётся внешним объектом и хранится как дочерний интерфейс. Внешний объект владеет ссылкой и освобождает её при завершении. Identity включённого объекта остаётся самостоятельной.</w:t>
-      </w:r>
-    </w:p>
-    <w:p>
-      <w:pPr>
-        <w:pStyle w:val="Heading2"/>
-      </w:pPr>
-      <w:r>
-        <w:t>4.2. Агрегирование</w:t>
-      </w:r>
-    </w:p>
-    <w:p>
-      <w:r>
-        <w:t>При создании B, E и Eco.Lab1 фабрика получает pIUnknownOuter, которым является controlling unknown Eco.Lab2. Запрос IEcoUnknown агрегированной части возвращает identity внешнего объекта. Eco.Lab2 хранит обычные A/C/D-интерфейсы как владеемые ссылки, а агрегированные Lab1/B/E views — как borrowed views; при завершении он освобождает агрегированные объекты через owner-aware destroy до освобождения allocator и system.</w:t>
-      </w:r>
-    </w:p>
-    <w:p>
-      <w:r>
-        <w:t>UnitTest получает IEcoUnknown через Eco.Lab2 и через агрегированный Eco.Lab1, после чего сравнивает указатели identity. Это подтверждает работу внешнего агрегирования.</w:t>
+        <w:br w:type="page"/>
       </w:r>
     </w:p>
     <w:p>
@@ -1291,78 +2304,58 @@
         <w:pStyle w:val="Heading1"/>
       </w:pPr>
       <w:r>
-        <w:t>5. Реализация Eco.Lab2</w:t>
-      </w:r>
-    </w:p>
-    <w:p>
-      <w:r>
-        <w:t>Eco.Lab2 регистрируется через IEcoInterfaceBus1 как CID_EcoLab2. При создании он получает allocator и system, запрашивает Eco.Lab1, компоненты A–E и сохраняет необходимые интерфейсы. Через собственный QueryInterface наружу выдаются IEcoLab1, IEcoCalculatorX и IEcoCalculatorY.</w:t>
-      </w:r>
-    </w:p>
-    <w:p>
-      <w:r>
-        <w:t>В численном коде не используются math.h, malloc, free, memcpy, memset или printf. Память выделяется через IEcoMemoryAllocator1. Существующая polyfit-функциональность Lab1 не изменяет результаты предыдущей лабораторной работы.</w:t>
+        <w:rPr>
+          <w:color w:val="000000"/>
+        </w:rPr>
+        <w:t>5 Методика тестирования и результаты</w:t>
       </w:r>
     </w:p>
     <w:p>
       <w:pPr>
-        <w:pStyle w:val="Heading1"/>
+        <w:widowControl/>
       </w:pPr>
       <w:r>
-        <w:t>6. UnitTest и критерии проверки</w:t>
-      </w:r>
-    </w:p>
-    <w:p>
-      <w:r>
-        <w:t>Eco UnitTest использует реальные factory и IEcoInterfaceBus1. Тестовый allocator присутствует только в Host UnitTest лабораторной работы №1 и не подменяет component, factory, interface bus или результат QueryInterface.</w:t>
+        <w:t>Host-тест использует явно обозначенный тестовый allocator для локального численного и контрактного контроля. Eco-тест работает с настоящим Framework и шиной: фабрики и QueryInterface не подменяются. Тестовый наблюдатель allocator считает реальные выделения компонента и позволяет отказать на конкретном Alloc.</w:t>
       </w:r>
     </w:p>
     <w:tbl>
       <w:tblPr>
-        <w:tblStyle w:val="TableGrid"/>
         <w:tblW w:type="auto" w:w="0"/>
         <w:jc w:val="center"/>
+        <w:tblLayout w:type="fixed"/>
         <w:tblLook w:firstColumn="1" w:firstRow="1" w:lastColumn="0" w:lastRow="0" w:noHBand="0" w:noVBand="1" w:val="04A0"/>
       </w:tblPr>
       <w:tblGrid>
-        <w:gridCol w:w="3336"/>
-        <w:gridCol w:w="3336"/>
-        <w:gridCol w:w="3336"/>
+        <w:gridCol w:w="4819"/>
+        <w:gridCol w:w="4819"/>
       </w:tblGrid>
       <w:tr>
+        <w:trPr>
+          <w:cantSplit/>
+          <w:tblHeader/>
+        </w:trPr>
         <w:tc>
           <w:tcPr>
-            <w:tcW w:type="dxa" w:w="1728"/>
+            <w:tcW w:type="dxa" w:w="3515"/>
             <w:vAlign w:val="center"/>
-            <w:shd w:fill="1F4E78"/>
+            <w:tcMar>
+              <w:top w:w="75" w:type="dxa"/>
+              <w:bottom w:w="75" w:type="dxa"/>
+              <w:left w:w="95" w:type="dxa"/>
+              <w:right w:w="95" w:type="dxa"/>
+            </w:tcMar>
+            <w:shd w:fill="24577A"/>
+            <w:tcBorders>
+              <w:top w:val="single" w:sz="4" w:color="D9D9D9"/>
+              <w:left w:val="single" w:sz="4" w:color="D9D9D9"/>
+              <w:bottom w:val="single" w:sz="4" w:color="D9D9D9"/>
+              <w:right w:val="single" w:sz="4" w:color="D9D9D9"/>
+            </w:tcBorders>
           </w:tcPr>
           <w:p>
             <w:pPr>
-              <w:jc w:val="left"/>
+              <w:spacing w:after="20" w:before="20" w:line="247" w:lineRule="auto"/>
             </w:pPr>
-            <w:r/>
-            <w:r>
-              <w:rPr>
-                <w:rFonts w:ascii="Arial" w:hAnsi="Arial"/>
-                <w:b/>
-                <w:color w:val="FFFFFF"/>
-                <w:sz w:val="19"/>
-              </w:rPr>
-              <w:t>Группа</w:t>
-            </w:r>
-          </w:p>
-        </w:tc>
-        <w:tc>
-          <w:tcPr>
-            <w:tcW w:type="dxa" w:w="5040"/>
-            <w:vAlign w:val="center"/>
-            <w:shd w:fill="1F4E78"/>
-          </w:tcPr>
-          <w:p>
-            <w:pPr>
-              <w:jc w:val="left"/>
-            </w:pPr>
-            <w:r/>
             <w:r>
               <w:rPr>
                 <w:rFonts w:ascii="Arial" w:hAnsi="Arial"/>
@@ -1376,15 +2369,26 @@
         </w:tc>
         <w:tc>
           <w:tcPr>
-            <w:tcW w:type="dxa" w:w="1728"/>
+            <w:tcW w:type="dxa" w:w="6123"/>
             <w:vAlign w:val="center"/>
-            <w:shd w:fill="1F4E78"/>
+            <w:tcMar>
+              <w:top w:w="75" w:type="dxa"/>
+              <w:bottom w:w="75" w:type="dxa"/>
+              <w:left w:w="95" w:type="dxa"/>
+              <w:right w:w="95" w:type="dxa"/>
+            </w:tcMar>
+            <w:shd w:fill="24577A"/>
+            <w:tcBorders>
+              <w:top w:val="single" w:sz="4" w:color="D9D9D9"/>
+              <w:left w:val="single" w:sz="4" w:color="D9D9D9"/>
+              <w:bottom w:val="single" w:sz="4" w:color="D9D9D9"/>
+              <w:right w:val="single" w:sz="4" w:color="D9D9D9"/>
+            </w:tcBorders>
           </w:tcPr>
           <w:p>
             <w:pPr>
-              <w:jc w:val="left"/>
+              <w:spacing w:after="20" w:before="20" w:line="247" w:lineRule="auto"/>
             </w:pPr>
-            <w:r/>
             <w:r>
               <w:rPr>
                 <w:rFonts w:ascii="Arial" w:hAnsi="Arial"/>
@@ -1392,470 +2396,105 @@
                 <w:color w:val="FFFFFF"/>
                 <w:sz w:val="19"/>
               </w:rPr>
-              <w:t>Результат</w:t>
+              <w:t>Наблюдаемый результат</w:t>
             </w:r>
           </w:p>
         </w:tc>
       </w:tr>
       <w:tr>
+        <w:trPr>
+          <w:cantSplit/>
+        </w:trPr>
         <w:tc>
           <w:tcPr>
-            <w:tcW w:type="dxa" w:w="1728"/>
+            <w:tcW w:type="dxa" w:w="3515"/>
             <w:vAlign w:val="center"/>
+            <w:tcMar>
+              <w:top w:w="75" w:type="dxa"/>
+              <w:bottom w:w="75" w:type="dxa"/>
+              <w:left w:w="95" w:type="dxa"/>
+              <w:right w:w="95" w:type="dxa"/>
+            </w:tcMar>
+            <w:tcBorders>
+              <w:top w:val="single" w:sz="4" w:color="D9D9D9"/>
+              <w:left w:val="single" w:sz="4" w:color="D9D9D9"/>
+              <w:bottom w:val="single" w:sz="4" w:color="D9D9D9"/>
+              <w:right w:val="single" w:sz="4" w:color="D9D9D9"/>
+            </w:tcBorders>
           </w:tcPr>
           <w:p>
             <w:pPr>
-              <w:jc w:val="left"/>
+              <w:spacing w:after="20" w:before="20" w:line="247" w:lineRule="auto"/>
             </w:pPr>
-            <w:r/>
             <w:r>
               <w:rPr>
                 <w:rFonts w:ascii="Arial" w:hAnsi="Arial"/>
-                <w:b w:val="0"/>
                 <w:sz w:val="19"/>
               </w:rPr>
-              <w:t>Host Lab1</w:t>
+              <w:t>Host UnitTest</w:t>
             </w:r>
           </w:p>
         </w:tc>
         <w:tc>
           <w:tcPr>
-            <w:tcW w:type="dxa" w:w="5040"/>
+            <w:tcW w:type="dxa" w:w="6123"/>
             <w:vAlign w:val="center"/>
+            <w:tcMar>
+              <w:top w:w="75" w:type="dxa"/>
+              <w:bottom w:w="75" w:type="dxa"/>
+              <w:left w:w="95" w:type="dxa"/>
+              <w:right w:w="95" w:type="dxa"/>
+            </w:tcMar>
+            <w:tcBorders>
+              <w:top w:val="single" w:sz="4" w:color="D9D9D9"/>
+              <w:left w:val="single" w:sz="4" w:color="D9D9D9"/>
+              <w:bottom w:val="single" w:sz="4" w:color="D9D9D9"/>
+              <w:right w:val="single" w:sz="4" w:color="D9D9D9"/>
+            </w:tcBorders>
           </w:tcPr>
           <w:p>
             <w:pPr>
-              <w:jc w:val="left"/>
+              <w:spacing w:after="20" w:before="20" w:line="247" w:lineRule="auto"/>
             </w:pPr>
-            <w:r/>
             <w:r>
               <w:rPr>
                 <w:rFonts w:ascii="Arial" w:hAnsi="Arial"/>
-                <w:b w:val="0"/>
                 <w:sz w:val="19"/>
               </w:rPr>
-              <w:t>polyfit, типы, ошибки, allocator</w:t>
-            </w:r>
-          </w:p>
-        </w:tc>
-        <w:tc>
-          <w:tcPr>
-            <w:tcW w:type="dxa" w:w="1728"/>
-            <w:vAlign w:val="center"/>
-          </w:tcPr>
-          <w:p>
-            <w:pPr>
-              <w:jc w:val="left"/>
-            </w:pPr>
-            <w:r/>
-            <w:r>
-              <w:rPr>
-                <w:rFonts w:ascii="Arial" w:hAnsi="Arial"/>
-                <w:b w:val="0"/>
-                <w:sz w:val="19"/>
-              </w:rPr>
-              <w:t>72/0</w:t>
+              <w:t>167 проверок, ошибок 0</w:t>
             </w:r>
           </w:p>
         </w:tc>
       </w:tr>
       <w:tr>
+        <w:trPr>
+          <w:cantSplit/>
+        </w:trPr>
         <w:tc>
           <w:tcPr>
-            <w:tcW w:type="dxa" w:w="1728"/>
+            <w:tcW w:type="dxa" w:w="3515"/>
             <w:vAlign w:val="center"/>
-            <w:shd w:fill="F2F6FA"/>
+            <w:tcMar>
+              <w:top w:w="75" w:type="dxa"/>
+              <w:bottom w:w="75" w:type="dxa"/>
+              <w:left w:w="95" w:type="dxa"/>
+              <w:right w:w="95" w:type="dxa"/>
+            </w:tcMar>
+            <w:shd w:fill="F1F5F8"/>
+            <w:tcBorders>
+              <w:top w:val="single" w:sz="4" w:color="D9D9D9"/>
+              <w:left w:val="single" w:sz="4" w:color="D9D9D9"/>
+              <w:bottom w:val="single" w:sz="4" w:color="D9D9D9"/>
+              <w:right w:val="single" w:sz="4" w:color="D9D9D9"/>
+            </w:tcBorders>
           </w:tcPr>
           <w:p>
             <w:pPr>
-              <w:jc w:val="left"/>
+              <w:spacing w:after="20" w:before="20" w:line="247" w:lineRule="auto"/>
             </w:pPr>
-            <w:r/>
             <w:r>
               <w:rPr>
                 <w:rFonts w:ascii="Arial" w:hAnsi="Arial"/>
-                <w:b w:val="0"/>
-                <w:sz w:val="19"/>
-              </w:rPr>
-              <w:t>A–E</w:t>
-            </w:r>
-          </w:p>
-        </w:tc>
-        <w:tc>
-          <w:tcPr>
-            <w:tcW w:type="dxa" w:w="5040"/>
-            <w:vAlign w:val="center"/>
-            <w:shd w:fill="F2F6FA"/>
-          </w:tcPr>
-          <w:p>
-            <w:pPr>
-              <w:jc w:val="left"/>
-            </w:pPr>
-            <w:r/>
-            <w:r>
-              <w:rPr>
-                <w:rFonts w:ascii="Arial" w:hAnsi="Arial"/>
-                <w:b w:val="0"/>
-                <w:sz w:val="19"/>
-              </w:rPr>
-              <w:t>Получение компонентов по CID</w:t>
-            </w:r>
-          </w:p>
-        </w:tc>
-        <w:tc>
-          <w:tcPr>
-            <w:tcW w:type="dxa" w:w="1728"/>
-            <w:vAlign w:val="center"/>
-            <w:shd w:fill="F2F6FA"/>
-          </w:tcPr>
-          <w:p>
-            <w:pPr>
-              <w:jc w:val="left"/>
-            </w:pPr>
-            <w:r/>
-            <w:r>
-              <w:rPr>
-                <w:rFonts w:ascii="Arial" w:hAnsi="Arial"/>
-                <w:b w:val="0"/>
-                <w:sz w:val="19"/>
-              </w:rPr>
-              <w:t>выполнено</w:t>
-            </w:r>
-          </w:p>
-        </w:tc>
-      </w:tr>
-      <w:tr>
-        <w:tc>
-          <w:tcPr>
-            <w:tcW w:type="dxa" w:w="1728"/>
-            <w:vAlign w:val="center"/>
-          </w:tcPr>
-          <w:p>
-            <w:pPr>
-              <w:jc w:val="left"/>
-            </w:pPr>
-            <w:r/>
-            <w:r>
-              <w:rPr>
-                <w:rFonts w:ascii="Arial" w:hAnsi="Arial"/>
-                <w:b w:val="0"/>
-                <w:sz w:val="19"/>
-              </w:rPr>
-              <w:t>CalculatorX</w:t>
-            </w:r>
-          </w:p>
-        </w:tc>
-        <w:tc>
-          <w:tcPr>
-            <w:tcW w:type="dxa" w:w="5040"/>
-            <w:vAlign w:val="center"/>
-          </w:tcPr>
-          <w:p>
-            <w:pPr>
-              <w:jc w:val="left"/>
-            </w:pPr>
-            <w:r/>
-            <w:r>
-              <w:rPr>
-                <w:rFonts w:ascii="Arial" w:hAnsi="Arial"/>
-                <w:b w:val="0"/>
-                <w:sz w:val="19"/>
-              </w:rPr>
-              <w:t>Addition/Subtraction</w:t>
-            </w:r>
-          </w:p>
-        </w:tc>
-        <w:tc>
-          <w:tcPr>
-            <w:tcW w:type="dxa" w:w="1728"/>
-            <w:vAlign w:val="center"/>
-          </w:tcPr>
-          <w:p>
-            <w:pPr>
-              <w:jc w:val="left"/>
-            </w:pPr>
-            <w:r/>
-            <w:r>
-              <w:rPr>
-                <w:rFonts w:ascii="Arial" w:hAnsi="Arial"/>
-                <w:b w:val="0"/>
-                <w:sz w:val="19"/>
-              </w:rPr>
-              <w:t>выполнено</w:t>
-            </w:r>
-          </w:p>
-        </w:tc>
-      </w:tr>
-      <w:tr>
-        <w:tc>
-          <w:tcPr>
-            <w:tcW w:type="dxa" w:w="1728"/>
-            <w:vAlign w:val="center"/>
-            <w:shd w:fill="F2F6FA"/>
-          </w:tcPr>
-          <w:p>
-            <w:pPr>
-              <w:jc w:val="left"/>
-            </w:pPr>
-            <w:r/>
-            <w:r>
-              <w:rPr>
-                <w:rFonts w:ascii="Arial" w:hAnsi="Arial"/>
-                <w:b w:val="0"/>
-                <w:sz w:val="19"/>
-              </w:rPr>
-              <w:t>CalculatorY</w:t>
-            </w:r>
-          </w:p>
-        </w:tc>
-        <w:tc>
-          <w:tcPr>
-            <w:tcW w:type="dxa" w:w="5040"/>
-            <w:vAlign w:val="center"/>
-            <w:shd w:fill="F2F6FA"/>
-          </w:tcPr>
-          <w:p>
-            <w:pPr>
-              <w:jc w:val="left"/>
-            </w:pPr>
-            <w:r/>
-            <w:r>
-              <w:rPr>
-                <w:rFonts w:ascii="Arial" w:hAnsi="Arial"/>
-                <w:b w:val="0"/>
-                <w:sz w:val="19"/>
-              </w:rPr>
-              <w:t>Multiplication/Division</w:t>
-            </w:r>
-          </w:p>
-        </w:tc>
-        <w:tc>
-          <w:tcPr>
-            <w:tcW w:type="dxa" w:w="1728"/>
-            <w:vAlign w:val="center"/>
-            <w:shd w:fill="F2F6FA"/>
-          </w:tcPr>
-          <w:p>
-            <w:pPr>
-              <w:jc w:val="left"/>
-            </w:pPr>
-            <w:r/>
-            <w:r>
-              <w:rPr>
-                <w:rFonts w:ascii="Arial" w:hAnsi="Arial"/>
-                <w:b w:val="0"/>
-                <w:sz w:val="19"/>
-              </w:rPr>
-              <w:t>выполнено</w:t>
-            </w:r>
-          </w:p>
-        </w:tc>
-      </w:tr>
-      <w:tr>
-        <w:tc>
-          <w:tcPr>
-            <w:tcW w:type="dxa" w:w="1728"/>
-            <w:vAlign w:val="center"/>
-          </w:tcPr>
-          <w:p>
-            <w:pPr>
-              <w:jc w:val="left"/>
-            </w:pPr>
-            <w:r/>
-            <w:r>
-              <w:rPr>
-                <w:rFonts w:ascii="Arial" w:hAnsi="Arial"/>
-                <w:b w:val="0"/>
-                <w:sz w:val="19"/>
-              </w:rPr>
-              <w:t>Ошибки</w:t>
-            </w:r>
-          </w:p>
-        </w:tc>
-        <w:tc>
-          <w:tcPr>
-            <w:tcW w:type="dxa" w:w="5040"/>
-            <w:vAlign w:val="center"/>
-          </w:tcPr>
-          <w:p>
-            <w:pPr>
-              <w:jc w:val="left"/>
-            </w:pPr>
-            <w:r/>
-            <w:r>
-              <w:rPr>
-                <w:rFonts w:ascii="Arial" w:hAnsi="Arial"/>
-                <w:b w:val="0"/>
-                <w:sz w:val="19"/>
-              </w:rPr>
-              <w:t>TryDivision при делении на ноль</w:t>
-            </w:r>
-          </w:p>
-        </w:tc>
-        <w:tc>
-          <w:tcPr>
-            <w:tcW w:type="dxa" w:w="1728"/>
-            <w:vAlign w:val="center"/>
-          </w:tcPr>
-          <w:p>
-            <w:pPr>
-              <w:jc w:val="left"/>
-            </w:pPr>
-            <w:r/>
-            <w:r>
-              <w:rPr>
-                <w:rFonts w:ascii="Arial" w:hAnsi="Arial"/>
-                <w:b w:val="0"/>
-                <w:sz w:val="19"/>
-              </w:rPr>
-              <w:t>выполнено</w:t>
-            </w:r>
-          </w:p>
-        </w:tc>
-      </w:tr>
-      <w:tr>
-        <w:tc>
-          <w:tcPr>
-            <w:tcW w:type="dxa" w:w="1728"/>
-            <w:vAlign w:val="center"/>
-            <w:shd w:fill="F2F6FA"/>
-          </w:tcPr>
-          <w:p>
-            <w:pPr>
-              <w:jc w:val="left"/>
-            </w:pPr>
-            <w:r/>
-            <w:r>
-              <w:rPr>
-                <w:rFonts w:ascii="Arial" w:hAnsi="Arial"/>
-                <w:b w:val="0"/>
-                <w:sz w:val="19"/>
-              </w:rPr>
-              <w:t>QueryInterface</w:t>
-            </w:r>
-          </w:p>
-        </w:tc>
-        <w:tc>
-          <w:tcPr>
-            <w:tcW w:type="dxa" w:w="5040"/>
-            <w:vAlign w:val="center"/>
-            <w:shd w:fill="F2F6FA"/>
-          </w:tcPr>
-          <w:p>
-            <w:pPr>
-              <w:jc w:val="left"/>
-            </w:pPr>
-            <w:r/>
-            <w:r>
-              <w:rPr>
-                <w:rFonts w:ascii="Arial" w:hAnsi="Arial"/>
-                <w:b w:val="0"/>
-                <w:sz w:val="19"/>
-              </w:rPr>
-              <w:t>Lab1↔X/Y и Lab2→Lab1/X/Y</w:t>
-            </w:r>
-          </w:p>
-        </w:tc>
-        <w:tc>
-          <w:tcPr>
-            <w:tcW w:type="dxa" w:w="1728"/>
-            <w:vAlign w:val="center"/>
-            <w:shd w:fill="F2F6FA"/>
-          </w:tcPr>
-          <w:p>
-            <w:pPr>
-              <w:jc w:val="left"/>
-            </w:pPr>
-            <w:r/>
-            <w:r>
-              <w:rPr>
-                <w:rFonts w:ascii="Arial" w:hAnsi="Arial"/>
-                <w:b w:val="0"/>
-                <w:sz w:val="19"/>
-              </w:rPr>
-              <w:t>выполнено</w:t>
-            </w:r>
-          </w:p>
-        </w:tc>
-      </w:tr>
-      <w:tr>
-        <w:tc>
-          <w:tcPr>
-            <w:tcW w:type="dxa" w:w="1728"/>
-            <w:vAlign w:val="center"/>
-          </w:tcPr>
-          <w:p>
-            <w:pPr>
-              <w:jc w:val="left"/>
-            </w:pPr>
-            <w:r/>
-            <w:r>
-              <w:rPr>
-                <w:rFonts w:ascii="Arial" w:hAnsi="Arial"/>
-                <w:b w:val="0"/>
-                <w:sz w:val="19"/>
-              </w:rPr>
-              <w:t>Aggregation</w:t>
-            </w:r>
-          </w:p>
-        </w:tc>
-        <w:tc>
-          <w:tcPr>
-            <w:tcW w:type="dxa" w:w="5040"/>
-            <w:vAlign w:val="center"/>
-          </w:tcPr>
-          <w:p>
-            <w:pPr>
-              <w:jc w:val="left"/>
-            </w:pPr>
-            <w:r/>
-            <w:r>
-              <w:rPr>
-                <w:rFonts w:ascii="Arial" w:hAnsi="Arial"/>
-                <w:b w:val="0"/>
-                <w:sz w:val="19"/>
-              </w:rPr>
-              <w:t>controlling unknown для B/E/Lab1</w:t>
-            </w:r>
-          </w:p>
-        </w:tc>
-        <w:tc>
-          <w:tcPr>
-            <w:tcW w:type="dxa" w:w="1728"/>
-            <w:vAlign w:val="center"/>
-          </w:tcPr>
-          <w:p>
-            <w:pPr>
-              <w:jc w:val="left"/>
-            </w:pPr>
-            <w:r/>
-            <w:r>
-              <w:rPr>
-                <w:rFonts w:ascii="Arial" w:hAnsi="Arial"/>
-                <w:b w:val="0"/>
-                <w:sz w:val="19"/>
-              </w:rPr>
-              <w:t>выполнено</w:t>
-            </w:r>
-          </w:p>
-        </w:tc>
-      </w:tr>
-      <w:tr>
-        <w:tc>
-          <w:tcPr>
-            <w:tcW w:type="dxa" w:w="1728"/>
-            <w:vAlign w:val="center"/>
-            <w:shd w:fill="F2F6FA"/>
-          </w:tcPr>
-          <w:p>
-            <w:pPr>
-              <w:jc w:val="left"/>
-            </w:pPr>
-            <w:r/>
-            <w:r>
-              <w:rPr>
-                <w:rFonts w:ascii="Arial" w:hAnsi="Arial"/>
-                <w:b w:val="0"/>
                 <w:sz w:val="19"/>
               </w:rPr>
               <w:t>Eco integration</w:t>
@@ -1864,43 +2503,361 @@
         </w:tc>
         <w:tc>
           <w:tcPr>
-            <w:tcW w:type="dxa" w:w="5040"/>
+            <w:tcW w:type="dxa" w:w="6123"/>
             <w:vAlign w:val="center"/>
-            <w:shd w:fill="F2F6FA"/>
+            <w:tcMar>
+              <w:top w:w="75" w:type="dxa"/>
+              <w:bottom w:w="75" w:type="dxa"/>
+              <w:left w:w="95" w:type="dxa"/>
+              <w:right w:w="95" w:type="dxa"/>
+            </w:tcMar>
+            <w:shd w:fill="F1F5F8"/>
+            <w:tcBorders>
+              <w:top w:val="single" w:sz="4" w:color="D9D9D9"/>
+              <w:left w:val="single" w:sz="4" w:color="D9D9D9"/>
+              <w:bottom w:val="single" w:sz="4" w:color="D9D9D9"/>
+              <w:right w:val="single" w:sz="4" w:color="D9D9D9"/>
+            </w:tcBorders>
           </w:tcPr>
           <w:p>
             <w:pPr>
-              <w:jc w:val="left"/>
+              <w:spacing w:after="20" w:before="20" w:line="247" w:lineRule="auto"/>
             </w:pPr>
-            <w:r/>
             <w:r>
               <w:rPr>
                 <w:rFonts w:ascii="Arial" w:hAnsi="Arial"/>
-                <w:b w:val="0"/>
                 <w:sz w:val="19"/>
               </w:rPr>
-              <w:t>полный Eco UnitTest</w:t>
+              <w:t>953 проверки, ошибок 0</w:t>
+            </w:r>
+          </w:p>
+        </w:tc>
+      </w:tr>
+      <w:tr>
+        <w:trPr>
+          <w:cantSplit/>
+        </w:trPr>
+        <w:tc>
+          <w:tcPr>
+            <w:tcW w:type="dxa" w:w="3515"/>
+            <w:vAlign w:val="center"/>
+            <w:tcMar>
+              <w:top w:w="75" w:type="dxa"/>
+              <w:bottom w:w="75" w:type="dxa"/>
+              <w:left w:w="95" w:type="dxa"/>
+              <w:right w:w="95" w:type="dxa"/>
+            </w:tcMar>
+            <w:tcBorders>
+              <w:top w:val="single" w:sz="4" w:color="D9D9D9"/>
+              <w:left w:val="single" w:sz="4" w:color="D9D9D9"/>
+              <w:bottom w:val="single" w:sz="4" w:color="D9D9D9"/>
+              <w:right w:val="single" w:sz="4" w:color="D9D9D9"/>
+            </w:tcBorders>
+          </w:tcPr>
+          <w:p>
+            <w:pPr>
+              <w:spacing w:after="20" w:before="20" w:line="247" w:lineRule="auto"/>
+            </w:pPr>
+            <w:r>
+              <w:rPr>
+                <w:rFonts w:ascii="Arial" w:hAnsi="Arial"/>
+                <w:sz w:val="19"/>
+              </w:rPr>
+              <w:t>Баланс памяти Eco</w:t>
             </w:r>
           </w:p>
         </w:tc>
         <w:tc>
           <w:tcPr>
-            <w:tcW w:type="dxa" w:w="1728"/>
+            <w:tcW w:type="dxa" w:w="6123"/>
             <w:vAlign w:val="center"/>
-            <w:shd w:fill="F2F6FA"/>
+            <w:tcMar>
+              <w:top w:w="75" w:type="dxa"/>
+              <w:bottom w:w="75" w:type="dxa"/>
+              <w:left w:w="95" w:type="dxa"/>
+              <w:right w:w="95" w:type="dxa"/>
+            </w:tcMar>
+            <w:tcBorders>
+              <w:top w:val="single" w:sz="4" w:color="D9D9D9"/>
+              <w:left w:val="single" w:sz="4" w:color="D9D9D9"/>
+              <w:bottom w:val="single" w:sz="4" w:color="D9D9D9"/>
+              <w:right w:val="single" w:sz="4" w:color="D9D9D9"/>
+            </w:tcBorders>
           </w:tcPr>
           <w:p>
             <w:pPr>
-              <w:jc w:val="left"/>
+              <w:spacing w:after="20" w:before="20" w:line="247" w:lineRule="auto"/>
             </w:pPr>
-            <w:r/>
             <w:r>
               <w:rPr>
                 <w:rFonts w:ascii="Arial" w:hAnsi="Arial"/>
-                <w:b w:val="0"/>
                 <w:sz w:val="19"/>
               </w:rPr>
-              <w:t>108/0</w:t>
+              <w:t>Выделено 348; освобождено 348; живых блоков 0</w:t>
+            </w:r>
+          </w:p>
+        </w:tc>
+      </w:tr>
+      <w:tr>
+        <w:trPr>
+          <w:cantSplit/>
+        </w:trPr>
+        <w:tc>
+          <w:tcPr>
+            <w:tcW w:type="dxa" w:w="3515"/>
+            <w:vAlign w:val="center"/>
+            <w:tcMar>
+              <w:top w:w="75" w:type="dxa"/>
+              <w:bottom w:w="75" w:type="dxa"/>
+              <w:left w:w="95" w:type="dxa"/>
+              <w:right w:w="95" w:type="dxa"/>
+            </w:tcMar>
+            <w:shd w:fill="F1F5F8"/>
+            <w:tcBorders>
+              <w:top w:val="single" w:sz="4" w:color="D9D9D9"/>
+              <w:left w:val="single" w:sz="4" w:color="D9D9D9"/>
+              <w:bottom w:val="single" w:sz="4" w:color="D9D9D9"/>
+              <w:right w:val="single" w:sz="4" w:color="D9D9D9"/>
+            </w:tcBorders>
+          </w:tcPr>
+          <w:p>
+            <w:pPr>
+              <w:spacing w:after="20" w:before="20" w:line="247" w:lineRule="auto"/>
+            </w:pPr>
+            <w:r>
+              <w:rPr>
+                <w:rFonts w:ascii="Arial" w:hAnsi="Arial"/>
+                <w:sz w:val="19"/>
+              </w:rPr>
+              <w:t>Dynamic Debug</w:t>
+            </w:r>
+          </w:p>
+        </w:tc>
+        <w:tc>
+          <w:tcPr>
+            <w:tcW w:type="dxa" w:w="6123"/>
+            <w:vAlign w:val="center"/>
+            <w:tcMar>
+              <w:top w:w="75" w:type="dxa"/>
+              <w:bottom w:w="75" w:type="dxa"/>
+              <w:left w:w="95" w:type="dxa"/>
+              <w:right w:w="95" w:type="dxa"/>
+            </w:tcMar>
+            <w:shd w:fill="F1F5F8"/>
+            <w:tcBorders>
+              <w:top w:val="single" w:sz="4" w:color="D9D9D9"/>
+              <w:left w:val="single" w:sz="4" w:color="D9D9D9"/>
+              <w:bottom w:val="single" w:sz="4" w:color="D9D9D9"/>
+              <w:right w:val="single" w:sz="4" w:color="D9D9D9"/>
+            </w:tcBorders>
+          </w:tcPr>
+          <w:p>
+            <w:pPr>
+              <w:spacing w:after="20" w:before="20" w:line="247" w:lineRule="auto"/>
+            </w:pPr>
+            <w:r>
+              <w:rPr>
+                <w:rFonts w:ascii="Arial" w:hAnsi="Arial"/>
+                <w:sz w:val="19"/>
+              </w:rPr>
+              <w:t>44 проверки, ошибок 0; загружены все 8 CID</w:t>
+            </w:r>
+          </w:p>
+        </w:tc>
+      </w:tr>
+      <w:tr>
+        <w:trPr>
+          <w:cantSplit/>
+        </w:trPr>
+        <w:tc>
+          <w:tcPr>
+            <w:tcW w:type="dxa" w:w="3515"/>
+            <w:vAlign w:val="center"/>
+            <w:tcMar>
+              <w:top w:w="75" w:type="dxa"/>
+              <w:bottom w:w="75" w:type="dxa"/>
+              <w:left w:w="95" w:type="dxa"/>
+              <w:right w:w="95" w:type="dxa"/>
+            </w:tcMar>
+            <w:tcBorders>
+              <w:top w:val="single" w:sz="4" w:color="D9D9D9"/>
+              <w:left w:val="single" w:sz="4" w:color="D9D9D9"/>
+              <w:bottom w:val="single" w:sz="4" w:color="D9D9D9"/>
+              <w:right w:val="single" w:sz="4" w:color="D9D9D9"/>
+            </w:tcBorders>
+          </w:tcPr>
+          <w:p>
+            <w:pPr>
+              <w:spacing w:after="20" w:before="20" w:line="247" w:lineRule="auto"/>
+            </w:pPr>
+            <w:r>
+              <w:rPr>
+                <w:rFonts w:ascii="Arial" w:hAnsi="Arial"/>
+                <w:sz w:val="19"/>
+              </w:rPr>
+              <w:t>Dynamic Release</w:t>
+            </w:r>
+          </w:p>
+        </w:tc>
+        <w:tc>
+          <w:tcPr>
+            <w:tcW w:type="dxa" w:w="6123"/>
+            <w:vAlign w:val="center"/>
+            <w:tcMar>
+              <w:top w:w="75" w:type="dxa"/>
+              <w:bottom w:w="75" w:type="dxa"/>
+              <w:left w:w="95" w:type="dxa"/>
+              <w:right w:w="95" w:type="dxa"/>
+            </w:tcMar>
+            <w:tcBorders>
+              <w:top w:val="single" w:sz="4" w:color="D9D9D9"/>
+              <w:left w:val="single" w:sz="4" w:color="D9D9D9"/>
+              <w:bottom w:val="single" w:sz="4" w:color="D9D9D9"/>
+              <w:right w:val="single" w:sz="4" w:color="D9D9D9"/>
+            </w:tcBorders>
+          </w:tcPr>
+          <w:p>
+            <w:pPr>
+              <w:spacing w:after="20" w:before="20" w:line="247" w:lineRule="auto"/>
+            </w:pPr>
+            <w:r>
+              <w:rPr>
+                <w:rFonts w:ascii="Arial" w:hAnsi="Arial"/>
+                <w:sz w:val="19"/>
+              </w:rPr>
+              <w:t>44 проверки, ошибок 0; загружены все 8 CID</w:t>
+            </w:r>
+          </w:p>
+        </w:tc>
+      </w:tr>
+      <w:tr>
+        <w:trPr>
+          <w:cantSplit/>
+        </w:trPr>
+        <w:tc>
+          <w:tcPr>
+            <w:tcW w:type="dxa" w:w="3515"/>
+            <w:vAlign w:val="center"/>
+            <w:tcMar>
+              <w:top w:w="75" w:type="dxa"/>
+              <w:bottom w:w="75" w:type="dxa"/>
+              <w:left w:w="95" w:type="dxa"/>
+              <w:right w:w="95" w:type="dxa"/>
+            </w:tcMar>
+            <w:shd w:fill="F1F5F8"/>
+            <w:tcBorders>
+              <w:top w:val="single" w:sz="4" w:color="D9D9D9"/>
+              <w:left w:val="single" w:sz="4" w:color="D9D9D9"/>
+              <w:bottom w:val="single" w:sz="4" w:color="D9D9D9"/>
+              <w:right w:val="single" w:sz="4" w:color="D9D9D9"/>
+            </w:tcBorders>
+          </w:tcPr>
+          <w:p>
+            <w:pPr>
+              <w:spacing w:after="20" w:before="20" w:line="247" w:lineRule="auto"/>
+            </w:pPr>
+            <w:r>
+              <w:rPr>
+                <w:rFonts w:ascii="Arial" w:hAnsi="Arial"/>
+                <w:sz w:val="19"/>
+              </w:rPr>
+              <w:t>Пустой Dynamic runtime</w:t>
+            </w:r>
+          </w:p>
+        </w:tc>
+        <w:tc>
+          <w:tcPr>
+            <w:tcW w:type="dxa" w:w="6123"/>
+            <w:vAlign w:val="center"/>
+            <w:tcMar>
+              <w:top w:w="75" w:type="dxa"/>
+              <w:bottom w:w="75" w:type="dxa"/>
+              <w:left w:w="95" w:type="dxa"/>
+              <w:right w:w="95" w:type="dxa"/>
+            </w:tcMar>
+            <w:shd w:fill="F1F5F8"/>
+            <w:tcBorders>
+              <w:top w:val="single" w:sz="4" w:color="D9D9D9"/>
+              <w:left w:val="single" w:sz="4" w:color="D9D9D9"/>
+              <w:bottom w:val="single" w:sz="4" w:color="D9D9D9"/>
+              <w:right w:val="single" w:sz="4" w:color="D9D9D9"/>
+            </w:tcBorders>
+          </w:tcPr>
+          <w:p>
+            <w:pPr>
+              <w:spacing w:after="20" w:before="20" w:line="247" w:lineRule="auto"/>
+            </w:pPr>
+            <w:r>
+              <w:rPr>
+                <w:rFonts w:ascii="Arial" w:hAnsi="Arial"/>
+                <w:sz w:val="19"/>
+              </w:rPr>
+              <w:t>Отдельный процесс завершился с ненулевым кодом</w:t>
+            </w:r>
+          </w:p>
+        </w:tc>
+      </w:tr>
+      <w:tr>
+        <w:trPr>
+          <w:cantSplit/>
+        </w:trPr>
+        <w:tc>
+          <w:tcPr>
+            <w:tcW w:type="dxa" w:w="3515"/>
+            <w:vAlign w:val="center"/>
+            <w:tcMar>
+              <w:top w:w="75" w:type="dxa"/>
+              <w:bottom w:w="75" w:type="dxa"/>
+              <w:left w:w="95" w:type="dxa"/>
+              <w:right w:w="95" w:type="dxa"/>
+            </w:tcMar>
+            <w:tcBorders>
+              <w:top w:val="single" w:sz="4" w:color="D9D9D9"/>
+              <w:left w:val="single" w:sz="4" w:color="D9D9D9"/>
+              <w:bottom w:val="single" w:sz="4" w:color="D9D9D9"/>
+              <w:right w:val="single" w:sz="4" w:color="D9D9D9"/>
+            </w:tcBorders>
+          </w:tcPr>
+          <w:p>
+            <w:pPr>
+              <w:spacing w:after="20" w:before="20" w:line="247" w:lineRule="auto"/>
+            </w:pPr>
+            <w:r>
+              <w:rPr>
+                <w:rFonts w:ascii="Arial" w:hAnsi="Arial"/>
+                <w:sz w:val="19"/>
+              </w:rPr>
+              <w:t>C89 / отсутствие libc / ASan и UBSan</w:t>
+            </w:r>
+          </w:p>
+        </w:tc>
+        <w:tc>
+          <w:tcPr>
+            <w:tcW w:type="dxa" w:w="6123"/>
+            <w:vAlign w:val="center"/>
+            <w:tcMar>
+              <w:top w:w="75" w:type="dxa"/>
+              <w:bottom w:w="75" w:type="dxa"/>
+              <w:left w:w="95" w:type="dxa"/>
+              <w:right w:w="95" w:type="dxa"/>
+            </w:tcMar>
+            <w:tcBorders>
+              <w:top w:val="single" w:sz="4" w:color="D9D9D9"/>
+              <w:left w:val="single" w:sz="4" w:color="D9D9D9"/>
+              <w:bottom w:val="single" w:sz="4" w:color="D9D9D9"/>
+              <w:right w:val="single" w:sz="4" w:color="D9D9D9"/>
+            </w:tcBorders>
+          </w:tcPr>
+          <w:p>
+            <w:pPr>
+              <w:spacing w:after="20" w:before="20" w:line="247" w:lineRule="auto"/>
+            </w:pPr>
+            <w:r>
+              <w:rPr>
+                <w:rFonts w:ascii="Arial" w:hAnsi="Arial"/>
+                <w:sz w:val="19"/>
+              </w:rPr>
+              <w:t>Контрольные команды завершились успешно</w:t>
             </w:r>
           </w:p>
         </w:tc>
@@ -1908,101 +2865,76 @@
     </w:tbl>
     <w:p>
       <w:pPr>
+        <w:widowControl/>
         <w:spacing w:after="40"/>
       </w:pPr>
     </w:p>
     <w:p>
       <w:pPr>
-        <w:pStyle w:val="Heading1"/>
+        <w:widowControl/>
       </w:pPr>
       <w:r>
-        <w:t>7. Сборка и результаты</w:t>
+        <w:t>Счётчик обозначает проверенные условия, а не независимые тестовые сценарии или процент покрытия. Число проверок отказов может зависеть от внутреннего количества выделений Framework. Отдельный контракт обязательных сценариев контролирует их выполнение.</w:t>
       </w:r>
     </w:p>
     <w:p>
+      <w:pPr>
+        <w:pStyle w:val="Heading2"/>
+      </w:pPr>
       <w:r>
-        <w:t>Сборка выполнена на macOS arm64 с Eco Framework, распакованным в /Users/danial2006/Downloads/Eco.Framework.</w:t>
+        <w:rPr>
+          <w:color w:val="000000"/>
+        </w:rPr>
+        <w:t>Состав интеграционных сценариев</w:t>
       </w:r>
     </w:p>
     <w:p>
       <w:pPr>
         <w:pStyle w:val="ListBullet"/>
+        <w:widowControl/>
       </w:pPr>
       <w:r>
-        <w:t>make check — 72 проверки Host UnitTest, строгий C89, отсутствие libc и sanitizer.</w:t>
+        <w:t>Восемь CID: матрицы QI, self-query, unknown, переходы в обе стороны, неизвестный IID и единая identity; отдельно C.X/C.Y и Lab2→Lab1→Lab2.</w:t>
       </w:r>
     </w:p>
     <w:p>
       <w:pPr>
         <w:pStyle w:val="ListBullet"/>
+        <w:widowControl/>
       </w:pPr>
       <w:r>
-        <w:t>make ECO_FRAMEWORK=/Users/danial2006/Downloads/Eco.Framework eco-test — 108 проверки, ошибок 0.</w:t>
+        <w:t>Восемь фабрик и восемь групп отказов allocator; для каждого ошибочного создания проверяются выходы, возврат счётчиков ссылок и живых блоков к исходному уровню.</w:t>
       </w:r>
     </w:p>
     <w:p>
       <w:pPr>
         <w:pStyle w:val="ListBullet"/>
+        <w:widowControl/>
       </w:pPr>
       <w:r>
-        <w:t>EcoLab1 Static Debug в Xcode — BUILD SUCCEEDED.</w:t>
+        <w:t>Шесть сценариев отсутствующих зависимостей, два сценария сохранения интерфейса после Release корня и три численных пути: normal, QR, facade Lab2.</w:t>
       </w:r>
     </w:p>
     <w:p>
       <w:pPr>
         <w:pStyle w:val="ListBullet"/>
+        <w:widowControl/>
       </w:pPr>
       <w:r>
-        <w:t>EcoLab1 Dynamic Release в Xcode — BUILD SUCCEEDED.</w:t>
+        <w:t>Положительные, отрицательные, дробные и нулевые аргументы; NULL, деление на ноль; обе реализации polyfit и объект результата.</w:t>
       </w:r>
     </w:p>
     <w:p>
       <w:pPr>
-        <w:pStyle w:val="ListBullet"/>
+        <w:widowControl/>
       </w:pPr>
       <w:r>
-        <w:t>EcoLab1UnitTest Static Debug в Xcode — BUILD SUCCEEDED.</w:t>
+        <w:t>AddressSanitizer и UndefinedBehaviorSanitizer запускаются для Host и реального Eco-клиента. LeakSanitizer на Darwin недоступен; поэтому отсутствие оставшихся блоков дополнительно подтверждается явным балансом allocator.</w:t>
       </w:r>
     </w:p>
     <w:p>
       <w:r>
-        <w:t>Производные каталоги Xcode и бинарные файлы не являются частью исходной поставки. В проекте сохранены исходники, интерфейсы, factory, UnitTest, скрипты и отчёт.</w:t>
-      </w:r>
-    </w:p>
-    <w:p>
-      <w:r>
-        <w:rPr>
-          <w:rFonts w:ascii="Arial" w:hAnsi="Arial"/>
-          <w:sz w:val="19"/>
-        </w:rPr>
-        <w:t>Команды Xcode:</w:t>
-      </w:r>
-    </w:p>
-    <w:p>
-      <w:r>
-        <w:rPr>
-          <w:rFonts w:ascii="Arial" w:hAnsi="Arial"/>
-          <w:sz w:val="19"/>
-        </w:rPr>
-        <w:t>xcodebuild -project AssemblyFiles/Mac/Xcode_v123/EcoLab1.xcodeproj -scheme Static -configuration Debug -derivedDataPath BuildFiles/XcodeComponentStaticDebug -jobs 1 ECO_FRAMEWORK=/Users/danial2006/Downloads/Eco.Framework CODE_SIGNING_ALLOWED=NO build</w:t>
-      </w:r>
-    </w:p>
-    <w:p>
-      <w:r>
-        <w:rPr>
-          <w:rFonts w:ascii="Arial" w:hAnsi="Arial"/>
-          <w:sz w:val="19"/>
-        </w:rPr>
-        <w:t>xcodebuild -project AssemblyFiles/Mac/Xcode_v123/EcoLab1.xcodeproj -scheme Dynamic -configuration Release -derivedDataPath BuildFiles/XcodeComponentDynamicRelease -jobs 1 ECO_FRAMEWORK=/Users/danial2006/Downloads/Eco.Framework CODE_SIGNING_ALLOWED=NO build</w:t>
-      </w:r>
-    </w:p>
-    <w:p>
-      <w:r>
-        <w:rPr>
-          <w:rFonts w:ascii="Arial" w:hAnsi="Arial"/>
-          <w:sz w:val="19"/>
-        </w:rPr>
-        <w:t>xcodebuild -project AssemblyFiles/Mac/Xcode_v123/EcoLab1UnitTest.xcodeproj -scheme Static -configuration Debug -derivedDataPath BuildFiles/XcodeUnitDebug -jobs 1 ECO_FRAMEWORK=/Users/danial2006/Downloads/Eco.Framework CODE_SIGNING_ALLOWED=NO build</w:t>
+        <w:br w:type="page"/>
       </w:r>
     </w:p>
     <w:p>
@@ -2010,19 +2942,266 @@
         <w:pStyle w:val="Heading1"/>
       </w:pPr>
       <w:r>
-        <w:t>8. Выводы</w:t>
+        <w:rPr>
+          <w:color w:val="000000"/>
+        </w:rPr>
+        <w:t>6 Сборка и настоящий Dynamic runtime</w:t>
+      </w:r>
+    </w:p>
+    <w:p>
+      <w:pPr>
+        <w:widowControl/>
+      </w:pPr>
+      <w:r>
+        <w:t>Окружение: macOS arm64, Xcode и официальный Eco.Framework из /Users/danial2006/Downloads/Eco.Framework. Команды запускаются из корня проекта. Сначала задаётся переменная окружения:</w:t>
+      </w:r>
+    </w:p>
+    <w:p>
+      <w:pPr>
+        <w:keepLines/>
+        <w:widowControl/>
+        <w:spacing w:after="160" w:line="252" w:lineRule="auto"/>
+        <w:shd w:fill="F2F5F7"/>
+      </w:pPr>
+      <w:r>
+        <w:rPr>
+          <w:rFonts w:ascii="Courier New" w:hAnsi="Courier New"/>
+          <w:sz w:val="17"/>
+        </w:rPr>
+        <w:t>export ECO_FRAMEWORK="/Users/danial2006/Downloads/Eco.Framework"</w:t>
+        <w:br/>
+        <w:t>make ECO_FRAMEWORK="$ECO_FRAMEWORK" check</w:t>
+        <w:br/>
+        <w:t>make ECO_FRAMEWORK="$ECO_FRAMEWORK" eco-test</w:t>
+      </w:r>
+    </w:p>
+    <w:p>
+      <w:pPr>
+        <w:widowControl/>
+      </w:pPr>
+      <w:r>
+        <w:t>Static-компонент и консольный UnitTest собраны в Debug и Release. Сборка клиента отдельно от его запуска; выполненные клиентские процессы дали результат из таблицы проверок.</w:t>
+      </w:r>
+    </w:p>
+    <w:p>
+      <w:pPr>
+        <w:keepLines/>
+        <w:widowControl/>
+        <w:spacing w:after="160" w:line="252" w:lineRule="auto"/>
+        <w:shd w:fill="F2F5F7"/>
+      </w:pPr>
+      <w:r>
+        <w:rPr>
+          <w:rFonts w:ascii="Courier New" w:hAnsi="Courier New"/>
+          <w:sz w:val="17"/>
+        </w:rPr>
+        <w:t>for configuration in Debug Release; do</w:t>
+        <w:br/>
+        <w:t xml:space="preserve">  xcodebuild -project AssemblyFiles/Mac/Xcode_v123/EcoLab1.xcodeproj \</w:t>
+        <w:br/>
+        <w:t xml:space="preserve">    -scheme Static -configuration "$configuration" -jobs 1 \</w:t>
+        <w:br/>
+        <w:t xml:space="preserve">    -derivedDataPath "BuildFiles/XcodeComponentStatic$configuration" \</w:t>
+        <w:br/>
+        <w:t xml:space="preserve">    ECO_FRAMEWORK="$ECO_FRAMEWORK" CODE_SIGNING_ALLOWED=NO build</w:t>
+        <w:br/>
+        <w:t xml:space="preserve">  xcodebuild -project AssemblyFiles/Mac/Xcode_v123/EcoLab1UnitTest.xcodeproj \</w:t>
+        <w:br/>
+        <w:t xml:space="preserve">    -scheme Static -configuration "$configuration" -jobs 1 \</w:t>
+        <w:br/>
+        <w:t xml:space="preserve">    -derivedDataPath "BuildFiles/XcodeUnit$configuration" \</w:t>
+        <w:br/>
+        <w:t xml:space="preserve">    ECO_FRAMEWORK="$ECO_FRAMEWORK" CODE_SIGNING_ALLOWED=NO build</w:t>
+        <w:br/>
+        <w:t>done</w:t>
+      </w:r>
+    </w:p>
+    <w:p>
+      <w:pPr>
+        <w:pStyle w:val="Heading2"/>
+      </w:pPr>
+      <w:r>
+        <w:rPr>
+          <w:color w:val="000000"/>
+        </w:rPr>
+        <w:t>Восемь отдельных динамических фабрик</w:t>
+      </w:r>
+    </w:p>
+    <w:p>
+      <w:pPr>
+        <w:keepLines/>
+        <w:widowControl/>
+        <w:spacing w:after="160" w:line="252" w:lineRule="auto"/>
+        <w:shd w:fill="F2F5F7"/>
+      </w:pPr>
+      <w:r>
+        <w:rPr>
+          <w:rFonts w:ascii="Courier New" w:hAnsi="Courier New"/>
+          <w:sz w:val="17"/>
+        </w:rPr>
+        <w:t>ECO_FRAMEWORK="$ECO_FRAMEWORK" CONFIGURATION=Release \</w:t>
+        <w:br/>
+        <w:t xml:space="preserve">  DesignFiles/Report/build_dynamic_runtime_macos.sh</w:t>
+        <w:br/>
+        <w:t>ECO_FRAMEWORK="$ECO_FRAMEWORK" CONFIGURATION=Debug \</w:t>
+        <w:br/>
+        <w:t xml:space="preserve">  DesignFiles/Report/build_dynamic_runtime_macos.sh</w:t>
+      </w:r>
+    </w:p>
+    <w:p>
+      <w:pPr>
+        <w:widowControl/>
+      </w:pPr>
+      <w:r>
+        <w:t>Скрипт собирает восемь dylib, названных реальными CID без дефисов. Селекторы фабрики: normal, POLYFIT_QR_ONLY, ECO_CALCULATOR_KIND=0..4 и ECO_LAB2_ONLY. Отдельный runtime-клиент линкует только официальные system/bus/memory/filesystem-библиотеки, без лабораторных исходников или статической лабораторной библиотеки.</w:t>
+      </w:r>
+    </w:p>
+    <w:p>
+      <w:pPr>
+        <w:widowControl/>
+      </w:pPr>
+      <w:r>
+        <w:t>Клиент вызывает QueryComponent, а официальный загрузчик ищет файлы в ECO_FRAMEWORK_RT. Статическая регистрация лабораторных фабрик отсутствует. DYLD_PRINT_LIBRARIES подтверждает загрузку всех восьми файлов. В свежем процессе с пустым runtime тест завершается ошибкой. Для каждой dylib проверены nm -u и otool -L.</w:t>
+      </w:r>
+    </w:p>
+    <w:p>
+      <w:pPr>
+        <w:widowControl/>
+      </w:pPr>
+      <w:r>
+        <w:t>Артефакты: BuildFiles/DynamicRuntime/{Debug,Release}. Полные логи Xcode, загрузчика, зависимостей и запуска: BuildFiles/DynamicRuntimeLogs/{Debug,Release}. Каждый CID использует отдельный derivedDataPath.</w:t>
       </w:r>
     </w:p>
     <w:p>
       <w:r>
-        <w:t>В лабораторной работе №2 реализован полноценный ACOM-граф: компоненты A–E, расширенный Eco.Lab1 и внешний Eco.Lab2. Продемонстрированы включение, агрегирование, controlling unknown, переходы QueryInterface и корректное управление временем жизни объектов. Реальные проверки через Eco Interface Bus завершились результатом 108 успешных проверки без ошибок, а тесты polyfit лабораторной работы №1 сохранены.</w:t>
+        <w:br w:type="page"/>
+      </w:r>
+    </w:p>
+    <w:p>
+      <w:pPr>
+        <w:pStyle w:val="Heading1"/>
+      </w:pPr>
+      <w:r>
+        <w:rPr>
+          <w:color w:val="000000"/>
+        </w:rPr>
+        <w:t>7 Анализ результатов и ограничения</w:t>
+      </w:r>
+    </w:p>
+    <w:p>
+      <w:pPr>
+        <w:widowControl/>
+      </w:pPr>
+      <w:r>
+        <w:t>Матрицы интерфейсов проверяют свойство транзитивности QueryInterface и общую identity. Баланс 348/348 при живых блоках 0 подтверждает освобождение отслеживаемых выделений данного прогона, включая детерминированные отказы. Это сильнее проверки только нормального разрушения, но не является доказательством отсутствия всех возможных дефектов.</w:t>
+      </w:r>
+    </w:p>
+    <w:p>
+      <w:pPr>
+        <w:widowControl/>
+      </w:pPr>
+      <w:r>
+        <w:t>Dynamic-клиент подтверждает дополнительный сценарий: реальные библиотеки загружаются официальной шиной без статических лабораторных фабрик. Пустой runtime служит отрицательным контролем — клиент не способен выдать успешный результат без файлов компонентов.</w:t>
+      </w:r>
+    </w:p>
+    <w:p>
+      <w:pPr>
+        <w:pStyle w:val="Heading2"/>
+      </w:pPr>
+      <w:r>
+        <w:rPr>
+          <w:color w:val="000000"/>
+        </w:rPr>
+        <w:t>Независимое сравнение полиномиальной аппроксимации</w:t>
+      </w:r>
+    </w:p>
+    <w:p>
+      <w:pPr>
+        <w:widowControl/>
+      </w:pPr>
+      <w:r>
+        <w:t>Регрессионные результаты Lab1 сверены с SciPy 1.15.3 (scipy.linalg.lstsq), NumPy 2.1.3 (numpy.linalg.lstsq) и фактическим запуском MATLAB R2026b. Используются девять наборов данных для двух алгоритмов; SciPy и NumPy дают 36 сравнений массивов коэффициентов. MATLAB отдельно проверяет 18 результатов компонента. Сохранённые JSON, вывод и сравнения находятся в DesignFiles/Reference.</w:t>
+      </w:r>
+    </w:p>
+    <w:p>
+      <w:pPr>
+        <w:widowControl/>
+      </w:pPr>
+      <w:r>
+        <w:t>Сравниваются все коэффициенты с заранее заданными абсолютным и относительным допусками для каждого набора. Общий протокол обусловливания входной задачи записан в reference_cases.py; независимые библиотеки решают подготовленную задачу МНК. Наборы включают точные полиномы, шумную линейную зависимость, постоянную функцию и крайние масштабы. Эти эталоны проверяют численную часть и дополняют контрактные тесты ACOM.</w:t>
+      </w:r>
+    </w:p>
+    <w:p>
+      <w:pPr>
+        <w:pStyle w:val="Heading2"/>
+      </w:pPr>
+      <w:r>
+        <w:rPr>
+          <w:color w:val="000000"/>
+        </w:rPr>
+        <w:t>Ограничения платформы и проверки</w:t>
+      </w:r>
+    </w:p>
+    <w:p>
+      <w:pPr>
+        <w:pStyle w:val="ListBullet"/>
+        <w:widowControl/>
+      </w:pPr>
+      <w:r>
+        <w:t>Windows/Linux/EcoOS: списки исходников исправлены, но сборки этих платформ не заявляются выполненными. Без официального ECO_TOOLCHAIN матрица возвращает SKIPPED.</w:t>
+      </w:r>
+    </w:p>
+    <w:p>
+      <w:pPr>
+        <w:pStyle w:val="ListBullet"/>
+        <w:widowControl/>
+      </w:pPr>
+      <w:r>
+        <w:t>Официальной Eco.StdIO.C89 arm64 в архиве нет. Консольные клиенты используют stdio; компонент остаётся без прямых вызовов libc. macOS добавляет платформенную libSystem; собственные обращения контролируются nm -u.</w:t>
+      </w:r>
+    </w:p>
+    <w:p>
+      <w:pPr>
+        <w:pStyle w:val="ListBullet"/>
+        <w:widowControl/>
+      </w:pPr>
+      <w:r>
+        <w:t>В поставленной шине учтён порядок снятия регистрации: компоненты снимаются в обратном порядке, после начала снятия новые запросы не выполняются. Framework не исправляется локально.</w:t>
+      </w:r>
+    </w:p>
+    <w:p>
+      <w:pPr>
+        <w:pStyle w:val="Heading2"/>
+      </w:pPr>
+      <w:r>
+        <w:rPr>
+          <w:color w:val="000000"/>
+        </w:rPr>
+        <w:t>Вывод</w:t>
+      </w:r>
+    </w:p>
+    <w:p>
+      <w:pPr>
+        <w:widowControl/>
+      </w:pPr>
+      <w:r>
+        <w:t>Реализованы включение A–E в реальный граф вызовов, агрегирование B и внешнее агрегирование Eco.Lab1. Публичные интерфейсы получают через QueryInterface, а частное время жизни агрегатов управляется через неделегирующий unknown. Функциональность polyfit сохранена и прошла регрессионное и независимое сравнение. Условия максимального варианта подтверждены описанными сценариями на macOS arm64; окончательную оценку выставляет преподаватель.</w:t>
+      </w:r>
+    </w:p>
+    <w:p>
+      <w:pPr>
+        <w:pStyle w:val="Caption"/>
+        <w:widowControl/>
+      </w:pPr>
+      <w:r>
+        <w:t>Источники: Задание_2.pdf, стр. 1–4; Eco.Education / 001.InsideACOM, Lesson03 (B), Lesson06 (D), Lesson07 (E); официальные заголовки IEcoUnknown, IEcoComponentFactory, IEcoInterfaceBus1, IEcoMemoryAllocator1. Репозиторий материалов: https://github.com/peerf-eco/Eco.Education. Системный промпт хранится отдельно в DesignFiles/Prompt и в отчёт не включён.</w:t>
       </w:r>
     </w:p>
     <w:sectPr>
       <w:headerReference w:type="default" r:id="rId9"/>
       <w:footerReference w:type="default" r:id="rId10"/>
-      <w:pgSz w:w="12240" w:h="15840"/>
-      <w:pgMar w:top="1152" w:right="1008" w:bottom="1080" w:left="1224" w:header="720" w:footer="720" w:gutter="0"/>
+      <w:pgSz w:w="11906" w:h="16838"/>
+      <w:pgMar w:top="1020" w:right="1134" w:bottom="964" w:left="1134" w:header="454" w:footer="454" w:gutter="0"/>
       <w:cols w:space="720"/>
       <w:docGrid w:linePitch="360"/>
     </w:sectPr>
@@ -2037,15 +3216,6 @@
       <w:pStyle w:val="Footer"/>
       <w:jc w:val="center"/>
     </w:pPr>
-    <w:r>
-      <w:rPr>
-        <w:rFonts w:ascii="Arial" w:hAnsi="Arial"/>
-        <w:color w:val="646464"/>
-        <w:sz w:val="16"/>
-      </w:rPr>
-      <w:t xml:space="preserve">Анвари Д.А. | 24ТИДИ | Страница </w:t>
-    </w:r>
-    <w:r/>
     <w:fldSimple w:instr="PAGE"/>
   </w:p>
 </w:ftr>
@@ -2061,10 +3231,10 @@
     <w:r>
       <w:rPr>
         <w:rFonts w:ascii="Arial" w:hAnsi="Arial"/>
-        <w:color w:val="646464"/>
+        <w:color w:val="000000"/>
         <w:sz w:val="16"/>
       </w:rPr>
-      <w:t>Лабораторная работа №2 по АСОМ</w:t>
+      <w:t>ACOM  •  Лабораторная работа 2</w:t>
     </w:r>
   </w:p>
 </w:hdr>
@@ -2433,9 +3603,12 @@
     <w:name w:val="Normal"/>
     <w:qFormat/>
     <w:rsid w:val="00FC693F"/>
+    <w:pPr>
+      <w:spacing w:after="120" w:line="269" w:lineRule="auto"/>
+    </w:pPr>
     <w:rPr>
-      <w:rFonts w:ascii="Arial" w:hAnsi="Arial" w:eastAsia="Arial"/>
-      <w:sz w:val="21"/>
+      <w:rFonts w:ascii="Arial" w:hAnsi="Arial"/>
+      <w:sz w:val="22"/>
     </w:rPr>
   </w:style>
   <w:style w:type="paragraph" w:styleId="Header">
@@ -2452,6 +3625,9 @@
       </w:tabs>
       <w:spacing w:after="0" w:line="240" w:lineRule="auto"/>
     </w:pPr>
+    <w:rPr>
+      <w:color w:val="000000"/>
+    </w:rPr>
   </w:style>
   <w:style w:type="character" w:customStyle="1" w:styleId="HeaderChar">
     <w:name w:val="Header Char"/>
@@ -2493,14 +3669,14 @@
     <w:pPr>
       <w:keepNext/>
       <w:keepLines/>
-      <w:spacing w:before="480" w:after="0"/>
+      <w:spacing w:before="140" w:after="200"/>
       <w:outlineLvl w:val="0"/>
     </w:pPr>
     <w:rPr>
-      <w:rFonts w:asciiTheme="majorHAnsi" w:eastAsiaTheme="majorEastAsia" w:hAnsiTheme="majorHAnsi" w:cstheme="majorBidi" w:ascii="Arial" w:hAnsi="Arial" w:eastAsia="Arial"/>
+      <w:rFonts w:asciiTheme="majorHAnsi" w:eastAsiaTheme="majorEastAsia" w:hAnsiTheme="majorHAnsi" w:cstheme="majorBidi" w:ascii="Arial" w:hAnsi="Arial"/>
       <w:b/>
       <w:bCs/>
-      <w:color w:val="1F4E78"/>
+      <w:color w:val="000000"/>
       <w:sz w:val="32"/>
       <w:szCs w:val="28"/>
     </w:rPr>
@@ -2517,14 +3693,14 @@
     <w:pPr>
       <w:keepNext/>
       <w:keepLines/>
-      <w:spacing w:before="200" w:after="0"/>
+      <w:spacing w:before="140" w:after="200"/>
       <w:outlineLvl w:val="1"/>
     </w:pPr>
     <w:rPr>
-      <w:rFonts w:asciiTheme="majorHAnsi" w:eastAsiaTheme="majorEastAsia" w:hAnsiTheme="majorHAnsi" w:cstheme="majorBidi" w:ascii="Arial" w:hAnsi="Arial" w:eastAsia="Arial"/>
+      <w:rFonts w:asciiTheme="majorHAnsi" w:eastAsiaTheme="majorEastAsia" w:hAnsiTheme="majorHAnsi" w:cstheme="majorBidi" w:ascii="Arial" w:hAnsi="Arial"/>
       <w:b/>
       <w:bCs/>
-      <w:color w:val="2F5597"/>
+      <w:color w:val="000000"/>
       <w:sz w:val="24"/>
       <w:szCs w:val="26"/>
     </w:rPr>
@@ -2545,11 +3721,10 @@
       <w:outlineLvl w:val="2"/>
     </w:pPr>
     <w:rPr>
-      <w:rFonts w:asciiTheme="majorHAnsi" w:eastAsiaTheme="majorEastAsia" w:hAnsiTheme="majorHAnsi" w:cstheme="majorBidi" w:ascii="Arial" w:hAnsi="Arial" w:eastAsia="Arial"/>
+      <w:rFonts w:asciiTheme="majorHAnsi" w:eastAsiaTheme="majorEastAsia" w:hAnsiTheme="majorHAnsi" w:cstheme="majorBidi"/>
       <w:b/>
       <w:bCs/>
-      <w:color w:val="2F5597"/>
-      <w:sz w:val="22"/>
+      <w:color w:val="000000"/>
     </w:rPr>
   </w:style>
   <w:style w:type="paragraph" w:styleId="Heading4">
@@ -2780,19 +3955,17 @@
     <w:qFormat/>
     <w:rsid w:val="00FC693F"/>
     <w:pPr>
-      <w:pBdr>
-        <w:bottom w:val="single" w:sz="8" w:space="4" w:color="4F81BD" w:themeColor="accent1"/>
-      </w:pBdr>
-      <w:spacing w:after="300" w:line="240" w:lineRule="auto"/>
+      <w:keepNext/>
+      <w:spacing w:after="200" w:line="240" w:lineRule="auto" w:before="0"/>
       <w:contextualSpacing/>
     </w:pPr>
     <w:rPr>
-      <w:rFonts w:asciiTheme="majorHAnsi" w:eastAsiaTheme="majorEastAsia" w:hAnsiTheme="majorHAnsi" w:cstheme="majorBidi" w:ascii="Arial" w:hAnsi="Arial" w:eastAsia="Arial"/>
+      <w:rFonts w:asciiTheme="majorHAnsi" w:eastAsiaTheme="majorEastAsia" w:hAnsiTheme="majorHAnsi" w:cstheme="majorBidi" w:ascii="Arial" w:hAnsi="Arial"/>
       <w:b/>
-      <w:color w:val="1F4E78"/>
+      <w:color w:val="000000"/>
       <w:spacing w:val="5"/>
       <w:kern w:val="28"/>
-      <w:sz w:val="48"/>
+      <w:sz w:val="50"/>
       <w:szCs w:val="52"/>
     </w:rPr>
   </w:style>
@@ -2828,7 +4001,7 @@
       <w:rFonts w:asciiTheme="majorHAnsi" w:eastAsiaTheme="majorEastAsia" w:hAnsiTheme="majorHAnsi" w:cstheme="majorBidi"/>
       <w:i/>
       <w:iCs/>
-      <w:color w:val="4F81BD" w:themeColor="accent1"/>
+      <w:color w:val="000000"/>
       <w:spacing w:val="15"/>
       <w:sz w:val="24"/>
       <w:szCs w:val="24"/>
@@ -2869,8 +4042,12 @@
     <w:unhideWhenUsed/>
     <w:rsid w:val="00AA1D8D"/>
     <w:pPr>
-      <w:spacing w:after="120"/>
+      <w:spacing w:after="120" w:line="269" w:lineRule="auto"/>
     </w:pPr>
+    <w:rPr>
+      <w:rFonts w:ascii="Arial" w:hAnsi="Arial"/>
+      <w:sz w:val="22"/>
+    </w:rPr>
   </w:style>
   <w:style w:type="character" w:customStyle="1" w:styleId="BodyTextChar">
     <w:name w:val="Body Text Char"/>
@@ -3227,12 +4404,14 @@
     <w:qFormat/>
     <w:rsid w:val="00FC693F"/>
     <w:pPr>
-      <w:spacing w:line="240" w:lineRule="auto"/>
+      <w:keepNext w:val="0"/>
+      <w:spacing w:line="269" w:lineRule="auto" w:after="160"/>
     </w:pPr>
     <w:rPr>
+      <w:rFonts w:ascii="Arial" w:hAnsi="Arial"/>
       <w:b/>
       <w:bCs/>
-      <w:color w:val="4F81BD" w:themeColor="accent1"/>
+      <w:color w:val="4D5962"/>
       <w:sz w:val="18"/>
       <w:szCs w:val="18"/>
     </w:rPr>

</xml_diff>

<commit_message>
Update Lab2 report location and guard integer precision
</commit_message>
<xml_diff>
--- a/DesignFiles/Report/EcoLab2_Report.docx
+++ b/DesignFiles/Report/EcoLab2_Report.docx
@@ -90,7 +90,7 @@
         <w:jc w:val="center"/>
       </w:pPr>
       <w:r>
-        <w:t>Москва, 2026</w:t>
+        <w:t>Нижний Новгород, 2026</w:t>
       </w:r>
     </w:p>
     <w:p>
@@ -2186,6 +2186,9 @@
       <w:r>
         <w:t>QueryInterface очищает выход до проверки me/riid, поддерживает IEcoUnknown и отвергает неизвестный IID. Для агрегированного создания outer допускается только с IID_IEcoUnknown. TryDivision сообщает об ошибке при b = 0 и обнуляет выход. Division при недопустимом вызове возвращает 0; статус ошибки следует получать через TryDivision.</w:t>
       </w:r>
+      <w:r>
+        <w:t xml:space="preserve"> Если целочисленный вход нельзя точно преобразовать во внутренний long double, polyfit возвращает ERR__POLYFIT_PRECISION (1005) с нулевыми коэффициентами.</w:t>
+      </w:r>
     </w:p>
     <w:p>
       <w:pPr>
@@ -2193,6 +2196,9 @@
       </w:pPr>
       <w:r>
         <w:t>Заголовки и IDL находятся в SharedFiles. Контракт IDL обновлён; генерация межпроцессного маршалинга в данную лабораторную работу не входит. Численный и компонентный код компилируется как C89 без стандартных заголовков/прямых вызовов libc.</w:t>
+      </w:r>
+      <w:r>
+        <w:t xml:space="preserve"> На macOS arm64 long double имеет точность double; некоторые 64-битные long отклоняются этой проверкой. Полный диапазон long без потери точности здесь не заявляется.</w:t>
       </w:r>
     </w:p>
     <w:p>
@@ -2461,7 +2467,7 @@
                 <w:rFonts w:ascii="Arial" w:hAnsi="Arial"/>
                 <w:sz w:val="19"/>
               </w:rPr>
-              <w:t>167 проверок, ошибок 0</w:t>
+              <w:t>183 проверок, ошибок 0</w:t>
             </w:r>
           </w:p>
         </w:tc>
@@ -2528,7 +2534,7 @@
                 <w:rFonts w:ascii="Arial" w:hAnsi="Arial"/>
                 <w:sz w:val="19"/>
               </w:rPr>
-              <w:t>953 проверки, ошибок 0</w:t>
+              <w:t>977 проверки, ошибок 0</w:t>
             </w:r>
           </w:p>
         </w:tc>
@@ -2593,7 +2599,7 @@
                 <w:rFonts w:ascii="Arial" w:hAnsi="Arial"/>
                 <w:sz w:val="19"/>
               </w:rPr>
-              <w:t>Выделено 348; освобождено 348; живых блоков 0</w:t>
+              <w:t>Выделено 345; освобождено 345; живых блоков 0</w:t>
             </w:r>
           </w:p>
         </w:tc>
@@ -3093,7 +3099,7 @@
         <w:widowControl/>
       </w:pPr>
       <w:r>
-        <w:t>Матрицы интерфейсов проверяют свойство транзитивности QueryInterface и общую identity. Баланс 348/348 при живых блоках 0 подтверждает освобождение отслеживаемых выделений данного прогона, включая детерминированные отказы. Это сильнее проверки только нормального разрушения, но не является доказательством отсутствия всех возможных дефектов.</w:t>
+        <w:t>Матрицы интерфейсов проверяют свойство транзитивности QueryInterface и общую identity. Баланс 345/345 при живых блоках 0 подтверждает освобождение отслеживаемых выделений данного прогона, включая детерминированные отказы. Это сильнее проверки только нормального разрушения, но не является доказательством отсутствия всех возможных дефектов.</w:t>
       </w:r>
     </w:p>
     <w:p>

</xml_diff>

<commit_message>
Align Lab2 with ACOM contracts and nested aggregation
Restore official calculator ABI and A/C substitution, add Horner through included components, and verify independent static and dynamic clients. Update report, documentation and verification logs; remove the ripgrep requirement from libc checks.
</commit_message>
<xml_diff>
--- a/DesignFiles/Report/EcoLab2_Report.docx
+++ b/DesignFiles/Report/EcoLab2_Report.docx
@@ -15,9 +15,6 @@
         <w:jc w:val="center"/>
       </w:pPr>
       <w:r>
-        <w:rPr>
-          <w:color w:val="000000"/>
-        </w:rPr>
         <w:t>Лабораторная работа 2</w:t>
       </w:r>
     </w:p>
@@ -103,9 +100,6 @@
         <w:pStyle w:val="Heading1"/>
       </w:pPr>
       <w:r>
-        <w:rPr>
-          <w:color w:val="000000"/>
-        </w:rPr>
         <w:t>1 Постановка задачи и критерии</w:t>
       </w:r>
     </w:p>
@@ -114,7 +108,7 @@
         <w:widowControl/>
       </w:pPr>
       <w:r>
-        <w:t>Цель работы — расширить компонент полиномиальной аппроксимации из ЛР1 калькуляторными интерфейсами и показать реальное взаимодействие ACOM-компонентов через включение и агрегирование. Для внешнего компонента Eco.Lab2 компонент Eco.Lab1 поддерживает агрегирование с общим управляющим IEcoUnknown.</w:t>
+        <w:t>Лабораторная работа расширяет компонент полиномиальной аппроксимации из ЛР1 калькуляторными интерфейсами. Реализованы включение и агрегирование ACOM-компонентов, внешний Eco.Lab2 и получение интерфейсов через QueryInterface. Проверка выполнена на macOS arm64 с официальным Eco Framework; исходники Framework не изменялись.</w:t>
       </w:r>
     </w:p>
     <w:p>
@@ -122,7 +116,7 @@
         <w:widowControl/>
       </w:pPr>
       <w:r>
-        <w:t>Работа выполнена по «Задание_2.pdf». Максимальный критерий требует нового Eco.Lab2, поддержки внешнего агрегирования Eco.Lab1 и демонстрации включения/агрегирования всех A, B, C, D, E, Eco.Lab1. В клиенте необходимо показать переходы QueryInterface между поддерживаемыми интерфейсами.</w:t>
+        <w:t>Основание — «Задание_2.pdf». Для варианта на 9–10 баллов требуется внешний Eco.Lab2, агрегирование существующего Eco.Lab1 и демонстрация A, B, C, D, E, Eco.Lab1. Приведённые ниже результаты подтверждают проверенные свойства реализации; итоговую оценку определяет преподаватель.</w:t>
       </w:r>
     </w:p>
     <w:tbl>
@@ -151,13 +145,7 @@
               <w:left w:w="95" w:type="dxa"/>
               <w:right w:w="95" w:type="dxa"/>
             </w:tcMar>
-            <w:shd w:fill="24577A"/>
-            <w:tcBorders>
-              <w:top w:val="single" w:sz="4" w:color="D9D9D9"/>
-              <w:left w:val="single" w:sz="4" w:color="D9D9D9"/>
-              <w:bottom w:val="single" w:sz="4" w:color="D9D9D9"/>
-              <w:right w:val="single" w:sz="4" w:color="D9D9D9"/>
-            </w:tcBorders>
+            <w:shd w:fill="E6E6E6"/>
           </w:tcPr>
           <w:p>
             <w:pPr>
@@ -167,10 +155,10 @@
               <w:rPr>
                 <w:rFonts w:ascii="Arial" w:hAnsi="Arial"/>
                 <w:b/>
-                <w:color w:val="FFFFFF"/>
+                <w:color w:val="000000"/>
                 <w:sz w:val="19"/>
               </w:rPr>
-              <w:t>Требование задания</w:t>
+              <w:t>Требование</w:t>
             </w:r>
           </w:p>
         </w:tc>
@@ -184,13 +172,7 @@
               <w:left w:w="95" w:type="dxa"/>
               <w:right w:w="95" w:type="dxa"/>
             </w:tcMar>
-            <w:shd w:fill="24577A"/>
-            <w:tcBorders>
-              <w:top w:val="single" w:sz="4" w:color="D9D9D9"/>
-              <w:left w:val="single" w:sz="4" w:color="D9D9D9"/>
-              <w:bottom w:val="single" w:sz="4" w:color="D9D9D9"/>
-              <w:right w:val="single" w:sz="4" w:color="D9D9D9"/>
-            </w:tcBorders>
+            <w:shd w:fill="E6E6E6"/>
           </w:tcPr>
           <w:p>
             <w:pPr>
@@ -200,10 +182,10 @@
               <w:rPr>
                 <w:rFonts w:ascii="Arial" w:hAnsi="Arial"/>
                 <w:b/>
-                <w:color w:val="FFFFFF"/>
+                <w:color w:val="000000"/>
                 <w:sz w:val="19"/>
               </w:rPr>
-              <w:t>Подтверждение в проекте</w:t>
+              <w:t>Реализация</w:t>
             </w:r>
           </w:p>
         </w:tc>
@@ -222,12 +204,6 @@
               <w:left w:w="95" w:type="dxa"/>
               <w:right w:w="95" w:type="dxa"/>
             </w:tcMar>
-            <w:tcBorders>
-              <w:top w:val="single" w:sz="4" w:color="D9D9D9"/>
-              <w:left w:val="single" w:sz="4" w:color="D9D9D9"/>
-              <w:bottom w:val="single" w:sz="4" w:color="D9D9D9"/>
-              <w:right w:val="single" w:sz="4" w:color="D9D9D9"/>
-            </w:tcBorders>
           </w:tcPr>
           <w:p>
             <w:pPr>
@@ -238,7 +214,7 @@
                 <w:rFonts w:ascii="Arial" w:hAnsi="Arial"/>
                 <w:sz w:val="19"/>
               </w:rPr>
-              <w:t>Добавить калькулятор в прежний компонент</w:t>
+              <w:t>Калькулятор в прежнем компоненте</w:t>
             </w:r>
           </w:p>
         </w:tc>
@@ -252,12 +228,6 @@
               <w:left w:w="95" w:type="dxa"/>
               <w:right w:w="95" w:type="dxa"/>
             </w:tcMar>
-            <w:tcBorders>
-              <w:top w:val="single" w:sz="4" w:color="D9D9D9"/>
-              <w:left w:val="single" w:sz="4" w:color="D9D9D9"/>
-              <w:bottom w:val="single" w:sz="4" w:color="D9D9D9"/>
-              <w:right w:val="single" w:sz="4" w:color="D9D9D9"/>
-            </w:tcBorders>
           </w:tcPr>
           <w:p>
             <w:pPr>
@@ -268,7 +238,7 @@
                 <w:rFonts w:ascii="Arial" w:hAnsi="Arial"/>
                 <w:sz w:val="19"/>
               </w:rPr>
-              <w:t>Lab1 включает C; операции фасадов делегируются его X/Y</w:t>
+              <w:t>Lab1 агрегирует B для X и включает E для Y</w:t>
             </w:r>
           </w:p>
         </w:tc>
@@ -287,13 +257,7 @@
               <w:left w:w="95" w:type="dxa"/>
               <w:right w:w="95" w:type="dxa"/>
             </w:tcMar>
-            <w:shd w:fill="F1F5F8"/>
-            <w:tcBorders>
-              <w:top w:val="single" w:sz="4" w:color="D9D9D9"/>
-              <w:left w:val="single" w:sz="4" w:color="D9D9D9"/>
-              <w:bottom w:val="single" w:sz="4" w:color="D9D9D9"/>
-              <w:right w:val="single" w:sz="4" w:color="D9D9D9"/>
-            </w:tcBorders>
+            <w:shd w:fill="F7F7F7"/>
           </w:tcPr>
           <w:p>
             <w:pPr>
@@ -304,7 +268,7 @@
                 <w:rFonts w:ascii="Arial" w:hAnsi="Arial"/>
                 <w:sz w:val="19"/>
               </w:rPr>
-              <w:t>Показать A–E в механизме композиции</w:t>
+              <w:t>Включение и агрегирование A–E</w:t>
             </w:r>
           </w:p>
         </w:tc>
@@ -318,13 +282,7 @@
               <w:left w:w="95" w:type="dxa"/>
               <w:right w:w="95" w:type="dxa"/>
             </w:tcMar>
-            <w:shd w:fill="F1F5F8"/>
-            <w:tcBorders>
-              <w:top w:val="single" w:sz="4" w:color="D9D9D9"/>
-              <w:left w:val="single" w:sz="4" w:color="D9D9D9"/>
-              <w:bottom w:val="single" w:sz="4" w:color="D9D9D9"/>
-              <w:right w:val="single" w:sz="4" w:color="D9D9D9"/>
-            </w:tcBorders>
+            <w:shd w:fill="F7F7F7"/>
           </w:tcPr>
           <w:p>
             <w:pPr>
@@ -335,7 +293,7 @@
                 <w:rFonts w:ascii="Arial" w:hAnsi="Arial"/>
                 <w:sz w:val="19"/>
               </w:rPr>
-              <w:t>Lab1→C→A/D→B и Lab2→E→B; каждый узел участвует в вызовах</w:t>
+              <w:t>D включает B, E агрегирует B; A/C заменяют друг друга по одному CID</w:t>
             </w:r>
           </w:p>
         </w:tc>
@@ -354,12 +312,6 @@
               <w:left w:w="95" w:type="dxa"/>
               <w:right w:w="95" w:type="dxa"/>
             </w:tcMar>
-            <w:tcBorders>
-              <w:top w:val="single" w:sz="4" w:color="D9D9D9"/>
-              <w:left w:val="single" w:sz="4" w:color="D9D9D9"/>
-              <w:bottom w:val="single" w:sz="4" w:color="D9D9D9"/>
-              <w:right w:val="single" w:sz="4" w:color="D9D9D9"/>
-            </w:tcBorders>
           </w:tcPr>
           <w:p>
             <w:pPr>
@@ -384,12 +336,6 @@
               <w:left w:w="95" w:type="dxa"/>
               <w:right w:w="95" w:type="dxa"/>
             </w:tcMar>
-            <w:tcBorders>
-              <w:top w:val="single" w:sz="4" w:color="D9D9D9"/>
-              <w:left w:val="single" w:sz="4" w:color="D9D9D9"/>
-              <w:bottom w:val="single" w:sz="4" w:color="D9D9D9"/>
-              <w:right w:val="single" w:sz="4" w:color="D9D9D9"/>
-            </w:tcBorders>
           </w:tcPr>
           <w:p>
             <w:pPr>
@@ -400,7 +346,7 @@
                 <w:rFonts w:ascii="Arial" w:hAnsi="Arial"/>
                 <w:sz w:val="19"/>
               </w:rPr>
-              <w:t>Lab2 хранит приватный unknown Lab1; публичные QI/AddRef/Release используют внешний unknown</w:t>
+              <w:t>Lab2 → Lab1 → B; общий controlling unknown</w:t>
             </w:r>
           </w:p>
         </w:tc>
@@ -419,13 +365,7 @@
               <w:left w:w="95" w:type="dxa"/>
               <w:right w:w="95" w:type="dxa"/>
             </w:tcMar>
-            <w:shd w:fill="F1F5F8"/>
-            <w:tcBorders>
-              <w:top w:val="single" w:sz="4" w:color="D9D9D9"/>
-              <w:left w:val="single" w:sz="4" w:color="D9D9D9"/>
-              <w:bottom w:val="single" w:sz="4" w:color="D9D9D9"/>
-              <w:right w:val="single" w:sz="4" w:color="D9D9D9"/>
-            </w:tcBorders>
+            <w:shd w:fill="F7F7F7"/>
           </w:tcPr>
           <w:p>
             <w:pPr>
@@ -436,7 +376,7 @@
                 <w:rFonts w:ascii="Arial" w:hAnsi="Arial"/>
                 <w:sz w:val="19"/>
               </w:rPr>
-              <w:t>Получать интерфейсы через QueryInterface</w:t>
+              <w:t>Переходы QueryInterface</w:t>
             </w:r>
           </w:p>
         </w:tc>
@@ -450,13 +390,7 @@
               <w:left w:w="95" w:type="dxa"/>
               <w:right w:w="95" w:type="dxa"/>
             </w:tcMar>
-            <w:shd w:fill="F1F5F8"/>
-            <w:tcBorders>
-              <w:top w:val="single" w:sz="4" w:color="D9D9D9"/>
-              <w:left w:val="single" w:sz="4" w:color="D9D9D9"/>
-              <w:bottom w:val="single" w:sz="4" w:color="D9D9D9"/>
-              <w:right w:val="single" w:sz="4" w:color="D9D9D9"/>
-            </w:tcBorders>
+            <w:shd w:fill="F7F7F7"/>
           </w:tcPr>
           <w:p>
             <w:pPr>
@@ -467,7 +401,7 @@
                 <w:rFonts w:ascii="Arial" w:hAnsi="Arial"/>
                 <w:sz w:val="19"/>
               </w:rPr>
-              <w:t>Проверяются матрицы переходов для всех восьми CID, включая Lab2→Lab1→Lab2</w:t>
+              <w:t>Матрицы всех поддерживаемых интерфейсов, включая X → Lab2</w:t>
             </w:r>
           </w:p>
         </w:tc>
@@ -486,12 +420,6 @@
               <w:left w:w="95" w:type="dxa"/>
               <w:right w:w="95" w:type="dxa"/>
             </w:tcMar>
-            <w:tcBorders>
-              <w:top w:val="single" w:sz="4" w:color="D9D9D9"/>
-              <w:left w:val="single" w:sz="4" w:color="D9D9D9"/>
-              <w:bottom w:val="single" w:sz="4" w:color="D9D9D9"/>
-              <w:right w:val="single" w:sz="4" w:color="D9D9D9"/>
-            </w:tcBorders>
           </w:tcPr>
           <w:p>
             <w:pPr>
@@ -502,7 +430,7 @@
                 <w:rFonts w:ascii="Arial" w:hAnsi="Arial"/>
                 <w:sz w:val="19"/>
               </w:rPr>
-              <w:t>Предоставить исходники, клиент, сборку и Word</w:t>
+              <w:t>Реальное взаимодействие</w:t>
             </w:r>
           </w:p>
         </w:tc>
@@ -516,12 +444,6 @@
               <w:left w:w="95" w:type="dxa"/>
               <w:right w:w="95" w:type="dxa"/>
             </w:tcMar>
-            <w:tcBorders>
-              <w:top w:val="single" w:sz="4" w:color="D9D9D9"/>
-              <w:left w:val="single" w:sz="4" w:color="D9D9D9"/>
-              <w:bottom w:val="single" w:sz="4" w:color="D9D9D9"/>
-              <w:right w:val="single" w:sz="4" w:color="D9D9D9"/>
-            </w:tcBorders>
           </w:tcPr>
           <w:p>
             <w:pPr>
@@ -532,7 +454,62 @@
                 <w:rFonts w:ascii="Arial" w:hAnsi="Arial"/>
                 <w:sz w:val="19"/>
               </w:rPr>
-              <w:t>C/H/IDL, Eco UnitTest, Xcode-проекты, Dynamic runtime-скрипт и настоящий отчёт</w:t>
+              <w:t>Horner вызывает Addition у A/C и Multiplication у D</w:t>
+            </w:r>
+          </w:p>
+        </w:tc>
+      </w:tr>
+      <w:tr>
+        <w:trPr>
+          <w:cantSplit/>
+        </w:trPr>
+        <w:tc>
+          <w:tcPr>
+            <w:tcW w:type="dxa" w:w="2891"/>
+            <w:vAlign w:val="center"/>
+            <w:tcMar>
+              <w:top w:w="75" w:type="dxa"/>
+              <w:bottom w:w="75" w:type="dxa"/>
+              <w:left w:w="95" w:type="dxa"/>
+              <w:right w:w="95" w:type="dxa"/>
+            </w:tcMar>
+            <w:shd w:fill="F7F7F7"/>
+          </w:tcPr>
+          <w:p>
+            <w:pPr>
+              <w:spacing w:after="20" w:before="20" w:line="247" w:lineRule="auto"/>
+            </w:pPr>
+            <w:r>
+              <w:rPr>
+                <w:rFonts w:ascii="Arial" w:hAnsi="Arial"/>
+                <w:sz w:val="19"/>
+              </w:rPr>
+              <w:t>Отдельный клиент и серверы</w:t>
+            </w:r>
+          </w:p>
+        </w:tc>
+        <w:tc>
+          <w:tcPr>
+            <w:tcW w:type="dxa" w:w="6746"/>
+            <w:vAlign w:val="center"/>
+            <w:tcMar>
+              <w:top w:w="75" w:type="dxa"/>
+              <w:bottom w:w="75" w:type="dxa"/>
+              <w:left w:w="95" w:type="dxa"/>
+              <w:right w:w="95" w:type="dxa"/>
+            </w:tcMar>
+            <w:shd w:fill="F7F7F7"/>
+          </w:tcPr>
+          <w:p>
+            <w:pPr>
+              <w:spacing w:after="20" w:before="20" w:line="247" w:lineRule="auto"/>
+            </w:pPr>
+            <w:r>
+              <w:rPr>
+                <w:rFonts w:ascii="Arial" w:hAnsi="Arial"/>
+                <w:sz w:val="19"/>
+              </w:rPr>
+              <w:t>Готовые архивы компонентов и один неизменяемый объект клиента</w:t>
             </w:r>
           </w:p>
         </w:tc>
@@ -549,10 +526,7 @@
         <w:pStyle w:val="Heading2"/>
       </w:pPr>
       <w:r>
-        <w:rPr>
-          <w:color w:val="000000"/>
-        </w:rPr>
-        <w:t>Материалы и границы работы</w:t>
+        <w:t>Материалы и совместимость</w:t>
       </w:r>
     </w:p>
     <w:p>
@@ -560,7 +534,7 @@
         <w:widowControl/>
       </w:pPr>
       <w:r>
-        <w:t>Архитектура опирается на уроки 001.InsideACOM: B имеет делегирующий и неделегирующий unknown; D включает X-компонент; E агрегирует B. Для согласованного API с дробными аргументами введены собственные double-интерфейсы с новыми IID. Бинарная совместимость с целочисленными интерфейсами примеров не заявляется.</w:t>
+        <w:t>Контракты проверены по InsideACOM и репозиторию Zzzpize/EcoLab1, commit 57d07171c5c92b492ac3f1fd48b93ce2155dd67c. Применены официальные целочисленные X/Y и CID A–E. Клиент собирается по неизменённым учебным заголовкам; собственное безопасное деление вынесено в отдельный интерфейс.</w:t>
       </w:r>
     </w:p>
     <w:p>
@@ -568,7 +542,7 @@
         <w:widowControl/>
       </w:pPr>
       <w:r>
-        <w:t>Существующая функциональность Lab1 сохранена: пять типов polyfit, нормальные уравнения/Гаусс и QR/Givens, FitVector и IEcoPolynomial. Основная проверенная платформа — macOS arm64 с официальным Eco Framework. Исходники Framework не изменялись.</w:t>
+        <w:t>Функциональность ЛР1 сохранена: polyfit для пяти типов, нормальные уравнения/Гаусс и QR/Givens, FitVector, IEcoPolynomial и прежние CID. Численное ядро не менялось. Новые калькуляторные операции принимают int16, а не double; типы численного API polyfit остаются прежними.</w:t>
       </w:r>
     </w:p>
     <w:p>
@@ -581,9 +555,6 @@
         <w:pStyle w:val="Heading1"/>
       </w:pPr>
       <w:r>
-        <w:rPr>
-          <w:color w:val="000000"/>
-        </w:rPr>
         <w:t>2 Компонентная архитектура</w:t>
       </w:r>
     </w:p>
@@ -596,7 +567,7 @@
       <w:r>
         <w:drawing>
           <wp:inline xmlns:a="http://schemas.openxmlformats.org/drawingml/2006/main" xmlns:pic="http://schemas.openxmlformats.org/drawingml/2006/picture">
-            <wp:extent cx="5652000" cy="4973760"/>
+            <wp:extent cx="6048000" cy="3024000"/>
             <wp:docPr id="1" name="Picture 1"/>
             <wp:cNvGraphicFramePr>
               <a:graphicFrameLocks noChangeAspect="1"/>
@@ -617,7 +588,7 @@
                   <pic:spPr>
                     <a:xfrm>
                       <a:off x="0" y="0"/>
-                      <a:ext cx="5652000" cy="4973760"/>
+                      <a:ext cx="6048000" cy="3024000"/>
                     </a:xfrm>
                     <a:prstGeom prst="rect"/>
                   </pic:spPr>
@@ -635,7 +606,7 @@
         <w:jc w:val="center"/>
       </w:pPr>
       <w:r>
-        <w:t>Рисунок 1. Реальная схема создания и владения компонентами</w:t>
+        <w:t>Рисунок 1. Владение объектами и пути вызовов в Lab2</w:t>
       </w:r>
     </w:p>
     <w:p>
@@ -643,7 +614,7 @@
         <w:widowControl/>
       </w:pPr>
       <w:r>
-        <w:t>На схеме B₁ и B₂ — разные экземпляры одной фабрики. D владеет обычной ссылкой B₁, а E владеет приватным неделегирующим unknown B₂. Все компоненты создаются через IEcoInterfaceBus1::QueryComponent по соответствующему CID.</w:t>
+        <w:t>Сплошные стрелки означают включение, пунктирные — агрегирование. B1, B2 и B3 — разные экземпляры одной фабрики. Все зависимости Eco-режима создаются через IEcoInterfaceBus1::QueryComponent. При отсутствии E Lab1 использует D; при отсутствии B компонент D включает A/C. Ошибка выделения памяти не запускает резервный путь.</w:t>
       </w:r>
     </w:p>
     <w:tbl>
@@ -664,7 +635,7 @@
         </w:trPr>
         <w:tc>
           <w:tcPr>
-            <w:tcW w:type="dxa" w:w="3969"/>
+            <w:tcW w:type="dxa" w:w="3685"/>
             <w:vAlign w:val="center"/>
             <w:tcMar>
               <w:top w:w="75" w:type="dxa"/>
@@ -672,13 +643,7 @@
               <w:left w:w="95" w:type="dxa"/>
               <w:right w:w="95" w:type="dxa"/>
             </w:tcMar>
-            <w:shd w:fill="24577A"/>
-            <w:tcBorders>
-              <w:top w:val="single" w:sz="4" w:color="D9D9D9"/>
-              <w:left w:val="single" w:sz="4" w:color="D9D9D9"/>
-              <w:bottom w:val="single" w:sz="4" w:color="D9D9D9"/>
-              <w:right w:val="single" w:sz="4" w:color="D9D9D9"/>
-            </w:tcBorders>
+            <w:shd w:fill="E6E6E6"/>
           </w:tcPr>
           <w:p>
             <w:pPr>
@@ -688,16 +653,16 @@
               <w:rPr>
                 <w:rFonts w:ascii="Arial" w:hAnsi="Arial"/>
                 <w:b/>
-                <w:color w:val="FFFFFF"/>
-                <w:sz w:val="18"/>
+                <w:color w:val="000000"/>
+                <w:sz w:val="19"/>
               </w:rPr>
-              <w:t>Операция через внешний Lab2</w:t>
+              <w:t>Вызов</w:t>
             </w:r>
           </w:p>
         </w:tc>
         <w:tc>
           <w:tcPr>
-            <w:tcW w:type="dxa" w:w="5669"/>
+            <w:tcW w:type="dxa" w:w="5953"/>
             <w:vAlign w:val="center"/>
             <w:tcMar>
               <w:top w:w="75" w:type="dxa"/>
@@ -705,13 +670,7 @@
               <w:left w:w="95" w:type="dxa"/>
               <w:right w:w="95" w:type="dxa"/>
             </w:tcMar>
-            <w:shd w:fill="24577A"/>
-            <w:tcBorders>
-              <w:top w:val="single" w:sz="4" w:color="D9D9D9"/>
-              <w:left w:val="single" w:sz="4" w:color="D9D9D9"/>
-              <w:bottom w:val="single" w:sz="4" w:color="D9D9D9"/>
-              <w:right w:val="single" w:sz="4" w:color="D9D9D9"/>
-            </w:tcBorders>
+            <w:shd w:fill="E6E6E6"/>
           </w:tcPr>
           <w:p>
             <w:pPr>
@@ -721,10 +680,10 @@
               <w:rPr>
                 <w:rFonts w:ascii="Arial" w:hAnsi="Arial"/>
                 <w:b/>
-                <w:color w:val="FFFFFF"/>
-                <w:sz w:val="18"/>
+                <w:color w:val="000000"/>
+                <w:sz w:val="19"/>
               </w:rPr>
-              <w:t>Путь вызова</w:t>
+              <w:t>Реальный исполнитель</w:t>
             </w:r>
           </w:p>
         </w:tc>
@@ -735,7 +694,7 @@
         </w:trPr>
         <w:tc>
           <w:tcPr>
-            <w:tcW w:type="dxa" w:w="3969"/>
+            <w:tcW w:type="dxa" w:w="3685"/>
             <w:vAlign w:val="center"/>
             <w:tcMar>
               <w:top w:w="75" w:type="dxa"/>
@@ -743,12 +702,6 @@
               <w:left w:w="95" w:type="dxa"/>
               <w:right w:w="95" w:type="dxa"/>
             </w:tcMar>
-            <w:tcBorders>
-              <w:top w:val="single" w:sz="4" w:color="D9D9D9"/>
-              <w:left w:val="single" w:sz="4" w:color="D9D9D9"/>
-              <w:bottom w:val="single" w:sz="4" w:color="D9D9D9"/>
-              <w:right w:val="single" w:sz="4" w:color="D9D9D9"/>
-            </w:tcBorders>
           </w:tcPr>
           <w:p>
             <w:pPr>
@@ -757,15 +710,15 @@
             <w:r>
               <w:rPr>
                 <w:rFonts w:ascii="Arial" w:hAnsi="Arial"/>
-                <w:sz w:val="18"/>
+                <w:sz w:val="19"/>
               </w:rPr>
-              <w:t>Addition</w:t>
+              <w:t>Lab2.QueryInterface(X)</w:t>
             </w:r>
           </w:p>
         </w:tc>
         <w:tc>
           <w:tcPr>
-            <w:tcW w:type="dxa" w:w="5669"/>
+            <w:tcW w:type="dxa" w:w="5953"/>
             <w:vAlign w:val="center"/>
             <w:tcMar>
               <w:top w:w="75" w:type="dxa"/>
@@ -773,12 +726,6 @@
               <w:left w:w="95" w:type="dxa"/>
               <w:right w:w="95" w:type="dxa"/>
             </w:tcMar>
-            <w:tcBorders>
-              <w:top w:val="single" w:sz="4" w:color="D9D9D9"/>
-              <w:left w:val="single" w:sz="4" w:color="D9D9D9"/>
-              <w:bottom w:val="single" w:sz="4" w:color="D9D9D9"/>
-              <w:right w:val="single" w:sz="4" w:color="D9D9D9"/>
-            </w:tcBorders>
           </w:tcPr>
           <w:p>
             <w:pPr>
@@ -787,9 +734,9 @@
             <w:r>
               <w:rPr>
                 <w:rFonts w:ascii="Arial" w:hAnsi="Arial"/>
-                <w:sz w:val="18"/>
+                <w:sz w:val="19"/>
               </w:rPr>
-              <w:t>Lab2.X → Lab1.X → C.X → A.X</w:t>
+              <w:t>B1.X из цепочки Lab2 → Lab1 → B1</w:t>
             </w:r>
           </w:p>
         </w:tc>
@@ -800,7 +747,7 @@
         </w:trPr>
         <w:tc>
           <w:tcPr>
-            <w:tcW w:type="dxa" w:w="3969"/>
+            <w:tcW w:type="dxa" w:w="3685"/>
             <w:vAlign w:val="center"/>
             <w:tcMar>
               <w:top w:w="75" w:type="dxa"/>
@@ -808,13 +755,7 @@
               <w:left w:w="95" w:type="dxa"/>
               <w:right w:w="95" w:type="dxa"/>
             </w:tcMar>
-            <w:shd w:fill="F1F5F8"/>
-            <w:tcBorders>
-              <w:top w:val="single" w:sz="4" w:color="D9D9D9"/>
-              <w:left w:val="single" w:sz="4" w:color="D9D9D9"/>
-              <w:bottom w:val="single" w:sz="4" w:color="D9D9D9"/>
-              <w:right w:val="single" w:sz="4" w:color="D9D9D9"/>
-            </w:tcBorders>
+            <w:shd w:fill="F7F7F7"/>
           </w:tcPr>
           <w:p>
             <w:pPr>
@@ -823,15 +764,15 @@
             <w:r>
               <w:rPr>
                 <w:rFonts w:ascii="Arial" w:hAnsi="Arial"/>
-                <w:sz w:val="18"/>
+                <w:sz w:val="19"/>
               </w:rPr>
-              <w:t>Subtraction</w:t>
+              <w:t>Lab2.QueryInterface(Y)</w:t>
             </w:r>
           </w:p>
         </w:tc>
         <w:tc>
           <w:tcPr>
-            <w:tcW w:type="dxa" w:w="5669"/>
+            <w:tcW w:type="dxa" w:w="5953"/>
             <w:vAlign w:val="center"/>
             <w:tcMar>
               <w:top w:w="75" w:type="dxa"/>
@@ -839,13 +780,7 @@
               <w:left w:w="95" w:type="dxa"/>
               <w:right w:w="95" w:type="dxa"/>
             </w:tcMar>
-            <w:shd w:fill="F1F5F8"/>
-            <w:tcBorders>
-              <w:top w:val="single" w:sz="4" w:color="D9D9D9"/>
-              <w:left w:val="single" w:sz="4" w:color="D9D9D9"/>
-              <w:bottom w:val="single" w:sz="4" w:color="D9D9D9"/>
-              <w:right w:val="single" w:sz="4" w:color="D9D9D9"/>
-            </w:tcBorders>
+            <w:shd w:fill="F7F7F7"/>
           </w:tcPr>
           <w:p>
             <w:pPr>
@@ -854,9 +789,9 @@
             <w:r>
               <w:rPr>
                 <w:rFonts w:ascii="Arial" w:hAnsi="Arial"/>
-                <w:sz w:val="18"/>
+                <w:sz w:val="19"/>
               </w:rPr>
-              <w:t>Lab2.X → Lab1.X → C.X → D.X → B₁.X</w:t>
+              <w:t>Фасад Lab1.Y → включённый E.Y</w:t>
             </w:r>
           </w:p>
         </w:tc>
@@ -867,7 +802,7 @@
         </w:trPr>
         <w:tc>
           <w:tcPr>
-            <w:tcW w:type="dxa" w:w="3969"/>
+            <w:tcW w:type="dxa" w:w="3685"/>
             <w:vAlign w:val="center"/>
             <w:tcMar>
               <w:top w:w="75" w:type="dxa"/>
@@ -875,12 +810,6 @@
               <w:left w:w="95" w:type="dxa"/>
               <w:right w:w="95" w:type="dxa"/>
             </w:tcMar>
-            <w:tcBorders>
-              <w:top w:val="single" w:sz="4" w:color="D9D9D9"/>
-              <w:left w:val="single" w:sz="4" w:color="D9D9D9"/>
-              <w:bottom w:val="single" w:sz="4" w:color="D9D9D9"/>
-              <w:right w:val="single" w:sz="4" w:color="D9D9D9"/>
-            </w:tcBorders>
           </w:tcPr>
           <w:p>
             <w:pPr>
@@ -889,15 +818,15 @@
             <w:r>
               <w:rPr>
                 <w:rFonts w:ascii="Arial" w:hAnsi="Arial"/>
-                <w:sz w:val="18"/>
+                <w:sz w:val="19"/>
               </w:rPr>
-              <w:t>Multiplication / Division / TryDivision</w:t>
+              <w:t>Horner: произведение и сумма</w:t>
             </w:r>
           </w:p>
         </w:tc>
         <w:tc>
           <w:tcPr>
-            <w:tcW w:type="dxa" w:w="5669"/>
+            <w:tcW w:type="dxa" w:w="5953"/>
             <w:vAlign w:val="center"/>
             <w:tcMar>
               <w:top w:w="75" w:type="dxa"/>
@@ -905,12 +834,6 @@
               <w:left w:w="95" w:type="dxa"/>
               <w:right w:w="95" w:type="dxa"/>
             </w:tcMar>
-            <w:tcBorders>
-              <w:top w:val="single" w:sz="4" w:color="D9D9D9"/>
-              <w:left w:val="single" w:sz="4" w:color="D9D9D9"/>
-              <w:bottom w:val="single" w:sz="4" w:color="D9D9D9"/>
-              <w:right w:val="single" w:sz="4" w:color="D9D9D9"/>
-            </w:tcBorders>
           </w:tcPr>
           <w:p>
             <w:pPr>
@@ -919,9 +842,9 @@
             <w:r>
               <w:rPr>
                 <w:rFonts w:ascii="Arial" w:hAnsi="Arial"/>
-                <w:sz w:val="18"/>
+                <w:sz w:val="19"/>
               </w:rPr>
-              <w:t>Lab2.Y → включённый E.Y</w:t>
+              <w:t>D.Y.Multiplication и A/C.X.Addition</w:t>
             </w:r>
           </w:p>
         </w:tc>
@@ -932,7 +855,7 @@
         </w:trPr>
         <w:tc>
           <w:tcPr>
-            <w:tcW w:type="dxa" w:w="3969"/>
+            <w:tcW w:type="dxa" w:w="3685"/>
             <w:vAlign w:val="center"/>
             <w:tcMar>
               <w:top w:w="75" w:type="dxa"/>
@@ -940,13 +863,7 @@
               <w:left w:w="95" w:type="dxa"/>
               <w:right w:w="95" w:type="dxa"/>
             </w:tcMar>
-            <w:shd w:fill="F1F5F8"/>
-            <w:tcBorders>
-              <w:top w:val="single" w:sz="4" w:color="D9D9D9"/>
-              <w:left w:val="single" w:sz="4" w:color="D9D9D9"/>
-              <w:bottom w:val="single" w:sz="4" w:color="D9D9D9"/>
-              <w:right w:val="single" w:sz="4" w:color="D9D9D9"/>
-            </w:tcBorders>
+            <w:shd w:fill="F7F7F7"/>
           </w:tcPr>
           <w:p>
             <w:pPr>
@@ -955,15 +872,15 @@
             <w:r>
               <w:rPr>
                 <w:rFonts w:ascii="Arial" w:hAnsi="Arial"/>
-                <w:sz w:val="18"/>
+                <w:sz w:val="19"/>
               </w:rPr>
-              <w:t>CalculatorX самостоятельного E</w:t>
+              <w:t>D.QueryInterface(X)</w:t>
             </w:r>
           </w:p>
         </w:tc>
         <w:tc>
           <w:tcPr>
-            <w:tcW w:type="dxa" w:w="5669"/>
+            <w:tcW w:type="dxa" w:w="5953"/>
             <w:vAlign w:val="center"/>
             <w:tcMar>
               <w:top w:w="75" w:type="dxa"/>
@@ -971,13 +888,7 @@
               <w:left w:w="95" w:type="dxa"/>
               <w:right w:w="95" w:type="dxa"/>
             </w:tcMar>
-            <w:shd w:fill="F1F5F8"/>
-            <w:tcBorders>
-              <w:top w:val="single" w:sz="4" w:color="D9D9D9"/>
-              <w:left w:val="single" w:sz="4" w:color="D9D9D9"/>
-              <w:bottom w:val="single" w:sz="4" w:color="D9D9D9"/>
-              <w:right w:val="single" w:sz="4" w:color="D9D9D9"/>
-            </w:tcBorders>
+            <w:shd w:fill="F7F7F7"/>
           </w:tcPr>
           <w:p>
             <w:pPr>
@@ -986,9 +897,62 @@
             <w:r>
               <w:rPr>
                 <w:rFonts w:ascii="Arial" w:hAnsi="Arial"/>
-                <w:sz w:val="18"/>
+                <w:sz w:val="19"/>
               </w:rPr>
-              <w:t>E.QueryInterface(X) → агрегированный B₂.X</w:t>
+              <w:t>Фасад D.X → включённый B3.X</w:t>
+            </w:r>
+          </w:p>
+        </w:tc>
+      </w:tr>
+      <w:tr>
+        <w:trPr>
+          <w:cantSplit/>
+        </w:trPr>
+        <w:tc>
+          <w:tcPr>
+            <w:tcW w:type="dxa" w:w="3685"/>
+            <w:vAlign w:val="center"/>
+            <w:tcMar>
+              <w:top w:w="75" w:type="dxa"/>
+              <w:bottom w:w="75" w:type="dxa"/>
+              <w:left w:w="95" w:type="dxa"/>
+              <w:right w:w="95" w:type="dxa"/>
+            </w:tcMar>
+          </w:tcPr>
+          <w:p>
+            <w:pPr>
+              <w:spacing w:after="20" w:before="20" w:line="247" w:lineRule="auto"/>
+            </w:pPr>
+            <w:r>
+              <w:rPr>
+                <w:rFonts w:ascii="Arial" w:hAnsi="Arial"/>
+                <w:sz w:val="19"/>
+              </w:rPr>
+              <w:t>E.QueryInterface(X)</w:t>
+            </w:r>
+          </w:p>
+        </w:tc>
+        <w:tc>
+          <w:tcPr>
+            <w:tcW w:type="dxa" w:w="5953"/>
+            <w:vAlign w:val="center"/>
+            <w:tcMar>
+              <w:top w:w="75" w:type="dxa"/>
+              <w:bottom w:w="75" w:type="dxa"/>
+              <w:left w:w="95" w:type="dxa"/>
+              <w:right w:w="95" w:type="dxa"/>
+            </w:tcMar>
+          </w:tcPr>
+          <w:p>
+            <w:pPr>
+              <w:spacing w:after="20" w:before="20" w:line="247" w:lineRule="auto"/>
+            </w:pPr>
+            <w:r>
+              <w:rPr>
+                <w:rFonts w:ascii="Arial" w:hAnsi="Arial"/>
+                <w:sz w:val="19"/>
+              </w:rPr>
+              <w:t>Агрегированный B2.X</w:t>
             </w:r>
           </w:p>
         </w:tc>
@@ -1005,7 +969,7 @@
         <w:widowControl/>
       </w:pPr>
       <w:r>
-        <w:t>Фасад Lab2.Y сохраняет identity Lab2 и вызывает включённый E. Внутренние A/D/C/E не выдаются клиенту как независимые identity внешнего объекта. Они остаются закрытыми деталями композиции.</w:t>
+        <w:t>C — независимая реализация X/Y, заменяющая A с тем же CID. В один runtime устанавливается A или C. Это проверяет заменяемость компонентов: остальные серверы и объект клиента при замене не перекомпилируются.</w:t>
       </w:r>
     </w:p>
     <w:p>
@@ -1018,10 +982,7 @@
         <w:pStyle w:val="Heading1"/>
       </w:pPr>
       <w:r>
-        <w:rPr>
-          <w:color w:val="000000"/>
-        </w:rPr>
-        <w:t>3 Публичные интерфейсы и идентификаторы</w:t>
+        <w:t>3 Публичные контракты и идентификаторы</w:t>
       </w:r>
     </w:p>
     <w:p>
@@ -1029,525 +990,7 @@
         <w:widowControl/>
       </w:pPr>
       <w:r>
-        <w:t>Методы CalculatorX/Y возвращают числовой результат напрямую. TryDivision возвращает int16_t и записывает результат через double*. IEcoLab1 и IEcoLab2 служат корневыми интерфейсами; их функциональные интерфейсы запрашиваются через QueryInterface.</w:t>
-      </w:r>
-    </w:p>
-    <w:tbl>
-      <w:tblPr>
-        <w:tblW w:type="auto" w:w="0"/>
-        <w:jc w:val="center"/>
-        <w:tblLayout w:type="fixed"/>
-        <w:tblLook w:firstColumn="1" w:firstRow="1" w:lastColumn="0" w:lastRow="0" w:noHBand="0" w:noVBand="1" w:val="04A0"/>
-      </w:tblPr>
-      <w:tblGrid>
-        <w:gridCol w:w="3213"/>
-        <w:gridCol w:w="3213"/>
-        <w:gridCol w:w="3213"/>
-      </w:tblGrid>
-      <w:tr>
-        <w:trPr>
-          <w:cantSplit/>
-          <w:tblHeader/>
-        </w:trPr>
-        <w:tc>
-          <w:tcPr>
-            <w:tcW w:type="dxa" w:w="2494"/>
-            <w:vAlign w:val="center"/>
-            <w:tcMar>
-              <w:top w:w="75" w:type="dxa"/>
-              <w:bottom w:w="75" w:type="dxa"/>
-              <w:left w:w="95" w:type="dxa"/>
-              <w:right w:w="95" w:type="dxa"/>
-            </w:tcMar>
-            <w:shd w:fill="24577A"/>
-            <w:tcBorders>
-              <w:top w:val="single" w:sz="4" w:color="D9D9D9"/>
-              <w:left w:val="single" w:sz="4" w:color="D9D9D9"/>
-              <w:bottom w:val="single" w:sz="4" w:color="D9D9D9"/>
-              <w:right w:val="single" w:sz="4" w:color="D9D9D9"/>
-            </w:tcBorders>
-          </w:tcPr>
-          <w:p>
-            <w:pPr>
-              <w:spacing w:after="20" w:before="20" w:line="247" w:lineRule="auto"/>
-            </w:pPr>
-            <w:r>
-              <w:rPr>
-                <w:rFonts w:ascii="Arial" w:hAnsi="Arial"/>
-                <w:b/>
-                <w:color w:val="FFFFFF"/>
-                <w:sz w:val="18"/>
-              </w:rPr>
-              <w:t>Интерфейс</w:t>
-            </w:r>
-          </w:p>
-        </w:tc>
-        <w:tc>
-          <w:tcPr>
-            <w:tcW w:type="dxa" w:w="4649"/>
-            <w:vAlign w:val="center"/>
-            <w:tcMar>
-              <w:top w:w="75" w:type="dxa"/>
-              <w:bottom w:w="75" w:type="dxa"/>
-              <w:left w:w="95" w:type="dxa"/>
-              <w:right w:w="95" w:type="dxa"/>
-            </w:tcMar>
-            <w:shd w:fill="24577A"/>
-            <w:tcBorders>
-              <w:top w:val="single" w:sz="4" w:color="D9D9D9"/>
-              <w:left w:val="single" w:sz="4" w:color="D9D9D9"/>
-              <w:bottom w:val="single" w:sz="4" w:color="D9D9D9"/>
-              <w:right w:val="single" w:sz="4" w:color="D9D9D9"/>
-            </w:tcBorders>
-          </w:tcPr>
-          <w:p>
-            <w:pPr>
-              <w:spacing w:after="20" w:before="20" w:line="247" w:lineRule="auto"/>
-            </w:pPr>
-            <w:r>
-              <w:rPr>
-                <w:rFonts w:ascii="Arial" w:hAnsi="Arial"/>
-                <w:b/>
-                <w:color w:val="FFFFFF"/>
-                <w:sz w:val="18"/>
-              </w:rPr>
-              <w:t>Методы</w:t>
-            </w:r>
-          </w:p>
-        </w:tc>
-        <w:tc>
-          <w:tcPr>
-            <w:tcW w:type="dxa" w:w="2494"/>
-            <w:vAlign w:val="center"/>
-            <w:tcMar>
-              <w:top w:w="75" w:type="dxa"/>
-              <w:bottom w:w="75" w:type="dxa"/>
-              <w:left w:w="95" w:type="dxa"/>
-              <w:right w:w="95" w:type="dxa"/>
-            </w:tcMar>
-            <w:shd w:fill="24577A"/>
-            <w:tcBorders>
-              <w:top w:val="single" w:sz="4" w:color="D9D9D9"/>
-              <w:left w:val="single" w:sz="4" w:color="D9D9D9"/>
-              <w:bottom w:val="single" w:sz="4" w:color="D9D9D9"/>
-              <w:right w:val="single" w:sz="4" w:color="D9D9D9"/>
-            </w:tcBorders>
-          </w:tcPr>
-          <w:p>
-            <w:pPr>
-              <w:spacing w:after="20" w:before="20" w:line="247" w:lineRule="auto"/>
-            </w:pPr>
-            <w:r>
-              <w:rPr>
-                <w:rFonts w:ascii="Arial" w:hAnsi="Arial"/>
-                <w:b/>
-                <w:color w:val="FFFFFF"/>
-                <w:sz w:val="18"/>
-              </w:rPr>
-              <w:t>Последний байт IID</w:t>
-            </w:r>
-          </w:p>
-        </w:tc>
-      </w:tr>
-      <w:tr>
-        <w:trPr>
-          <w:cantSplit/>
-        </w:trPr>
-        <w:tc>
-          <w:tcPr>
-            <w:tcW w:type="dxa" w:w="2494"/>
-            <w:vAlign w:val="center"/>
-            <w:tcMar>
-              <w:top w:w="75" w:type="dxa"/>
-              <w:bottom w:w="75" w:type="dxa"/>
-              <w:left w:w="95" w:type="dxa"/>
-              <w:right w:w="95" w:type="dxa"/>
-            </w:tcMar>
-            <w:tcBorders>
-              <w:top w:val="single" w:sz="4" w:color="D9D9D9"/>
-              <w:left w:val="single" w:sz="4" w:color="D9D9D9"/>
-              <w:bottom w:val="single" w:sz="4" w:color="D9D9D9"/>
-              <w:right w:val="single" w:sz="4" w:color="D9D9D9"/>
-            </w:tcBorders>
-          </w:tcPr>
-          <w:p>
-            <w:pPr>
-              <w:spacing w:after="20" w:before="20" w:line="247" w:lineRule="auto"/>
-            </w:pPr>
-            <w:r>
-              <w:rPr>
-                <w:rFonts w:ascii="Arial" w:hAnsi="Arial"/>
-                <w:sz w:val="18"/>
-              </w:rPr>
-              <w:t>IEcoCalculatorX</w:t>
-            </w:r>
-          </w:p>
-        </w:tc>
-        <w:tc>
-          <w:tcPr>
-            <w:tcW w:type="dxa" w:w="4649"/>
-            <w:vAlign w:val="center"/>
-            <w:tcMar>
-              <w:top w:w="75" w:type="dxa"/>
-              <w:bottom w:w="75" w:type="dxa"/>
-              <w:left w:w="95" w:type="dxa"/>
-              <w:right w:w="95" w:type="dxa"/>
-            </w:tcMar>
-            <w:tcBorders>
-              <w:top w:val="single" w:sz="4" w:color="D9D9D9"/>
-              <w:left w:val="single" w:sz="4" w:color="D9D9D9"/>
-              <w:bottom w:val="single" w:sz="4" w:color="D9D9D9"/>
-              <w:right w:val="single" w:sz="4" w:color="D9D9D9"/>
-            </w:tcBorders>
-          </w:tcPr>
-          <w:p>
-            <w:pPr>
-              <w:spacing w:after="20" w:before="20" w:line="247" w:lineRule="auto"/>
-            </w:pPr>
-            <w:r>
-              <w:rPr>
-                <w:rFonts w:ascii="Arial" w:hAnsi="Arial"/>
-                <w:sz w:val="18"/>
-              </w:rPr>
-              <w:t>Addition, Subtraction</w:t>
-            </w:r>
-          </w:p>
-        </w:tc>
-        <w:tc>
-          <w:tcPr>
-            <w:tcW w:type="dxa" w:w="2494"/>
-            <w:vAlign w:val="center"/>
-            <w:tcMar>
-              <w:top w:w="75" w:type="dxa"/>
-              <w:bottom w:w="75" w:type="dxa"/>
-              <w:left w:w="95" w:type="dxa"/>
-              <w:right w:w="95" w:type="dxa"/>
-            </w:tcMar>
-            <w:tcBorders>
-              <w:top w:val="single" w:sz="4" w:color="D9D9D9"/>
-              <w:left w:val="single" w:sz="4" w:color="D9D9D9"/>
-              <w:bottom w:val="single" w:sz="4" w:color="D9D9D9"/>
-              <w:right w:val="single" w:sz="4" w:color="D9D9D9"/>
-            </w:tcBorders>
-          </w:tcPr>
-          <w:p>
-            <w:pPr>
-              <w:spacing w:after="20" w:before="20" w:line="247" w:lineRule="auto"/>
-            </w:pPr>
-            <w:r>
-              <w:rPr>
-                <w:rFonts w:ascii="Arial" w:hAnsi="Arial"/>
-                <w:sz w:val="18"/>
-              </w:rPr>
-              <w:t>50</w:t>
-            </w:r>
-          </w:p>
-        </w:tc>
-      </w:tr>
-      <w:tr>
-        <w:trPr>
-          <w:cantSplit/>
-        </w:trPr>
-        <w:tc>
-          <w:tcPr>
-            <w:tcW w:type="dxa" w:w="2494"/>
-            <w:vAlign w:val="center"/>
-            <w:tcMar>
-              <w:top w:w="75" w:type="dxa"/>
-              <w:bottom w:w="75" w:type="dxa"/>
-              <w:left w:w="95" w:type="dxa"/>
-              <w:right w:w="95" w:type="dxa"/>
-            </w:tcMar>
-            <w:shd w:fill="F1F5F8"/>
-            <w:tcBorders>
-              <w:top w:val="single" w:sz="4" w:color="D9D9D9"/>
-              <w:left w:val="single" w:sz="4" w:color="D9D9D9"/>
-              <w:bottom w:val="single" w:sz="4" w:color="D9D9D9"/>
-              <w:right w:val="single" w:sz="4" w:color="D9D9D9"/>
-            </w:tcBorders>
-          </w:tcPr>
-          <w:p>
-            <w:pPr>
-              <w:spacing w:after="20" w:before="20" w:line="247" w:lineRule="auto"/>
-            </w:pPr>
-            <w:r>
-              <w:rPr>
-                <w:rFonts w:ascii="Arial" w:hAnsi="Arial"/>
-                <w:sz w:val="18"/>
-              </w:rPr>
-              <w:t>IEcoCalculatorY</w:t>
-            </w:r>
-          </w:p>
-        </w:tc>
-        <w:tc>
-          <w:tcPr>
-            <w:tcW w:type="dxa" w:w="4649"/>
-            <w:vAlign w:val="center"/>
-            <w:tcMar>
-              <w:top w:w="75" w:type="dxa"/>
-              <w:bottom w:w="75" w:type="dxa"/>
-              <w:left w:w="95" w:type="dxa"/>
-              <w:right w:w="95" w:type="dxa"/>
-            </w:tcMar>
-            <w:shd w:fill="F1F5F8"/>
-            <w:tcBorders>
-              <w:top w:val="single" w:sz="4" w:color="D9D9D9"/>
-              <w:left w:val="single" w:sz="4" w:color="D9D9D9"/>
-              <w:bottom w:val="single" w:sz="4" w:color="D9D9D9"/>
-              <w:right w:val="single" w:sz="4" w:color="D9D9D9"/>
-            </w:tcBorders>
-          </w:tcPr>
-          <w:p>
-            <w:pPr>
-              <w:spacing w:after="20" w:before="20" w:line="247" w:lineRule="auto"/>
-            </w:pPr>
-            <w:r>
-              <w:rPr>
-                <w:rFonts w:ascii="Arial" w:hAnsi="Arial"/>
-                <w:sz w:val="18"/>
-              </w:rPr>
-              <w:t>Multiplication, Division, TryDivision</w:t>
-            </w:r>
-          </w:p>
-        </w:tc>
-        <w:tc>
-          <w:tcPr>
-            <w:tcW w:type="dxa" w:w="2494"/>
-            <w:vAlign w:val="center"/>
-            <w:tcMar>
-              <w:top w:w="75" w:type="dxa"/>
-              <w:bottom w:w="75" w:type="dxa"/>
-              <w:left w:w="95" w:type="dxa"/>
-              <w:right w:w="95" w:type="dxa"/>
-            </w:tcMar>
-            <w:shd w:fill="F1F5F8"/>
-            <w:tcBorders>
-              <w:top w:val="single" w:sz="4" w:color="D9D9D9"/>
-              <w:left w:val="single" w:sz="4" w:color="D9D9D9"/>
-              <w:bottom w:val="single" w:sz="4" w:color="D9D9D9"/>
-              <w:right w:val="single" w:sz="4" w:color="D9D9D9"/>
-            </w:tcBorders>
-          </w:tcPr>
-          <w:p>
-            <w:pPr>
-              <w:spacing w:after="20" w:before="20" w:line="247" w:lineRule="auto"/>
-            </w:pPr>
-            <w:r>
-              <w:rPr>
-                <w:rFonts w:ascii="Arial" w:hAnsi="Arial"/>
-                <w:sz w:val="18"/>
-              </w:rPr>
-              <w:t>51</w:t>
-            </w:r>
-          </w:p>
-        </w:tc>
-      </w:tr>
-      <w:tr>
-        <w:trPr>
-          <w:cantSplit/>
-        </w:trPr>
-        <w:tc>
-          <w:tcPr>
-            <w:tcW w:type="dxa" w:w="2494"/>
-            <w:vAlign w:val="center"/>
-            <w:tcMar>
-              <w:top w:w="75" w:type="dxa"/>
-              <w:bottom w:w="75" w:type="dxa"/>
-              <w:left w:w="95" w:type="dxa"/>
-              <w:right w:w="95" w:type="dxa"/>
-            </w:tcMar>
-            <w:tcBorders>
-              <w:top w:val="single" w:sz="4" w:color="D9D9D9"/>
-              <w:left w:val="single" w:sz="4" w:color="D9D9D9"/>
-              <w:bottom w:val="single" w:sz="4" w:color="D9D9D9"/>
-              <w:right w:val="single" w:sz="4" w:color="D9D9D9"/>
-            </w:tcBorders>
-          </w:tcPr>
-          <w:p>
-            <w:pPr>
-              <w:spacing w:after="20" w:before="20" w:line="247" w:lineRule="auto"/>
-            </w:pPr>
-            <w:r>
-              <w:rPr>
-                <w:rFonts w:ascii="Arial" w:hAnsi="Arial"/>
-                <w:sz w:val="18"/>
-              </w:rPr>
-              <w:t>IEcoLab1</w:t>
-            </w:r>
-          </w:p>
-        </w:tc>
-        <w:tc>
-          <w:tcPr>
-            <w:tcW w:type="dxa" w:w="4649"/>
-            <w:vAlign w:val="center"/>
-            <w:tcMar>
-              <w:top w:w="75" w:type="dxa"/>
-              <w:bottom w:w="75" w:type="dxa"/>
-              <w:left w:w="95" w:type="dxa"/>
-              <w:right w:w="95" w:type="dxa"/>
-            </w:tcMar>
-            <w:tcBorders>
-              <w:top w:val="single" w:sz="4" w:color="D9D9D9"/>
-              <w:left w:val="single" w:sz="4" w:color="D9D9D9"/>
-              <w:bottom w:val="single" w:sz="4" w:color="D9D9D9"/>
-              <w:right w:val="single" w:sz="4" w:color="D9D9D9"/>
-            </w:tcBorders>
-          </w:tcPr>
-          <w:p>
-            <w:pPr>
-              <w:spacing w:after="20" w:before="20" w:line="247" w:lineRule="auto"/>
-            </w:pPr>
-            <w:r>
-              <w:rPr>
-                <w:rFonts w:ascii="Arial" w:hAnsi="Arial"/>
-                <w:sz w:val="18"/>
-              </w:rPr>
-              <w:t>QueryInterface, AddRef, Release</w:t>
-            </w:r>
-          </w:p>
-        </w:tc>
-        <w:tc>
-          <w:tcPr>
-            <w:tcW w:type="dxa" w:w="2494"/>
-            <w:vAlign w:val="center"/>
-            <w:tcMar>
-              <w:top w:w="75" w:type="dxa"/>
-              <w:bottom w:w="75" w:type="dxa"/>
-              <w:left w:w="95" w:type="dxa"/>
-              <w:right w:w="95" w:type="dxa"/>
-            </w:tcMar>
-            <w:tcBorders>
-              <w:top w:val="single" w:sz="4" w:color="D9D9D9"/>
-              <w:left w:val="single" w:sz="4" w:color="D9D9D9"/>
-              <w:bottom w:val="single" w:sz="4" w:color="D9D9D9"/>
-              <w:right w:val="single" w:sz="4" w:color="D9D9D9"/>
-            </w:tcBorders>
-          </w:tcPr>
-          <w:p>
-            <w:pPr>
-              <w:spacing w:after="20" w:before="20" w:line="247" w:lineRule="auto"/>
-            </w:pPr>
-            <w:r>
-              <w:rPr>
-                <w:rFonts w:ascii="Arial" w:hAnsi="Arial"/>
-                <w:sz w:val="18"/>
-              </w:rPr>
-              <w:t>52</w:t>
-            </w:r>
-          </w:p>
-        </w:tc>
-      </w:tr>
-      <w:tr>
-        <w:trPr>
-          <w:cantSplit/>
-        </w:trPr>
-        <w:tc>
-          <w:tcPr>
-            <w:tcW w:type="dxa" w:w="2494"/>
-            <w:vAlign w:val="center"/>
-            <w:tcMar>
-              <w:top w:w="75" w:type="dxa"/>
-              <w:bottom w:w="75" w:type="dxa"/>
-              <w:left w:w="95" w:type="dxa"/>
-              <w:right w:w="95" w:type="dxa"/>
-            </w:tcMar>
-            <w:shd w:fill="F1F5F8"/>
-            <w:tcBorders>
-              <w:top w:val="single" w:sz="4" w:color="D9D9D9"/>
-              <w:left w:val="single" w:sz="4" w:color="D9D9D9"/>
-              <w:bottom w:val="single" w:sz="4" w:color="D9D9D9"/>
-              <w:right w:val="single" w:sz="4" w:color="D9D9D9"/>
-            </w:tcBorders>
-          </w:tcPr>
-          <w:p>
-            <w:pPr>
-              <w:spacing w:after="20" w:before="20" w:line="247" w:lineRule="auto"/>
-            </w:pPr>
-            <w:r>
-              <w:rPr>
-                <w:rFonts w:ascii="Arial" w:hAnsi="Arial"/>
-                <w:sz w:val="18"/>
-              </w:rPr>
-              <w:t>IEcoLab2</w:t>
-            </w:r>
-          </w:p>
-        </w:tc>
-        <w:tc>
-          <w:tcPr>
-            <w:tcW w:type="dxa" w:w="4649"/>
-            <w:vAlign w:val="center"/>
-            <w:tcMar>
-              <w:top w:w="75" w:type="dxa"/>
-              <w:bottom w:w="75" w:type="dxa"/>
-              <w:left w:w="95" w:type="dxa"/>
-              <w:right w:w="95" w:type="dxa"/>
-            </w:tcMar>
-            <w:shd w:fill="F1F5F8"/>
-            <w:tcBorders>
-              <w:top w:val="single" w:sz="4" w:color="D9D9D9"/>
-              <w:left w:val="single" w:sz="4" w:color="D9D9D9"/>
-              <w:bottom w:val="single" w:sz="4" w:color="D9D9D9"/>
-              <w:right w:val="single" w:sz="4" w:color="D9D9D9"/>
-            </w:tcBorders>
-          </w:tcPr>
-          <w:p>
-            <w:pPr>
-              <w:spacing w:after="20" w:before="20" w:line="247" w:lineRule="auto"/>
-            </w:pPr>
-            <w:r>
-              <w:rPr>
-                <w:rFonts w:ascii="Arial" w:hAnsi="Arial"/>
-                <w:sz w:val="18"/>
-              </w:rPr>
-              <w:t>QueryInterface, AddRef, Release</w:t>
-            </w:r>
-          </w:p>
-        </w:tc>
-        <w:tc>
-          <w:tcPr>
-            <w:tcW w:type="dxa" w:w="2494"/>
-            <w:vAlign w:val="center"/>
-            <w:tcMar>
-              <w:top w:w="75" w:type="dxa"/>
-              <w:bottom w:w="75" w:type="dxa"/>
-              <w:left w:w="95" w:type="dxa"/>
-              <w:right w:w="95" w:type="dxa"/>
-            </w:tcMar>
-            <w:shd w:fill="F1F5F8"/>
-            <w:tcBorders>
-              <w:top w:val="single" w:sz="4" w:color="D9D9D9"/>
-              <w:left w:val="single" w:sz="4" w:color="D9D9D9"/>
-              <w:bottom w:val="single" w:sz="4" w:color="D9D9D9"/>
-              <w:right w:val="single" w:sz="4" w:color="D9D9D9"/>
-            </w:tcBorders>
-          </w:tcPr>
-          <w:p>
-            <w:pPr>
-              <w:spacing w:after="20" w:before="20" w:line="247" w:lineRule="auto"/>
-            </w:pPr>
-            <w:r>
-              <w:rPr>
-                <w:rFonts w:ascii="Arial" w:hAnsi="Arial"/>
-                <w:sz w:val="18"/>
-              </w:rPr>
-              <w:t>53</w:t>
-            </w:r>
-          </w:p>
-        </w:tc>
-      </w:tr>
-    </w:tbl>
-    <w:p>
-      <w:pPr>
-        <w:widowControl/>
-        <w:spacing w:after="40"/>
-      </w:pPr>
-    </w:p>
-    <w:p>
-      <w:pPr>
-        <w:widowControl/>
-      </w:pPr>
-      <w:r>
-        <w:t>Общий префикс IID: D3B3E2F1-8D21-4A6B-9A40-4400000000. В конце добавляются две hex-цифры из таблицы. CID компонентов приведены полностью:</w:t>
+        <w:t>X и Y содержат ровно пять слотов vtable: QueryInterface, AddRef, Release и две арифметические операции. Аргументы — int16; Addition/Multiplication возвращают int32, Subtraction/Division — int16. Division округляет к нулю. Subtraction явно приводит результат по модулю 65536.</w:t>
       </w:r>
     </w:p>
     <w:tbl>
@@ -1568,7 +1011,7 @@
         </w:trPr>
         <w:tc>
           <w:tcPr>
-            <w:tcW w:type="dxa" w:w="2324"/>
+            <w:tcW w:type="dxa" w:w="2835"/>
             <w:vAlign w:val="center"/>
             <w:tcMar>
               <w:top w:w="75" w:type="dxa"/>
@@ -1576,13 +1019,7 @@
               <w:left w:w="95" w:type="dxa"/>
               <w:right w:w="95" w:type="dxa"/>
             </w:tcMar>
-            <w:shd w:fill="24577A"/>
-            <w:tcBorders>
-              <w:top w:val="single" w:sz="4" w:color="D9D9D9"/>
-              <w:left w:val="single" w:sz="4" w:color="D9D9D9"/>
-              <w:bottom w:val="single" w:sz="4" w:color="D9D9D9"/>
-              <w:right w:val="single" w:sz="4" w:color="D9D9D9"/>
-            </w:tcBorders>
+            <w:shd w:fill="E6E6E6"/>
           </w:tcPr>
           <w:p>
             <w:pPr>
@@ -1592,16 +1029,16 @@
               <w:rPr>
                 <w:rFonts w:ascii="Arial" w:hAnsi="Arial"/>
                 <w:b/>
-                <w:color w:val="FFFFFF"/>
+                <w:color w:val="000000"/>
                 <w:sz w:val="18"/>
               </w:rPr>
-              <w:t>Компонент</w:t>
+              <w:t>Интерфейс</w:t>
             </w:r>
           </w:p>
         </w:tc>
         <w:tc>
           <w:tcPr>
-            <w:tcW w:type="dxa" w:w="7313"/>
+            <w:tcW w:type="dxa" w:w="6803"/>
             <w:vAlign w:val="center"/>
             <w:tcMar>
               <w:top w:w="75" w:type="dxa"/>
@@ -1609,13 +1046,7 @@
               <w:left w:w="95" w:type="dxa"/>
               <w:right w:w="95" w:type="dxa"/>
             </w:tcMar>
-            <w:shd w:fill="24577A"/>
-            <w:tcBorders>
-              <w:top w:val="single" w:sz="4" w:color="D9D9D9"/>
-              <w:left w:val="single" w:sz="4" w:color="D9D9D9"/>
-              <w:bottom w:val="single" w:sz="4" w:color="D9D9D9"/>
-              <w:right w:val="single" w:sz="4" w:color="D9D9D9"/>
-            </w:tcBorders>
+            <w:shd w:fill="E6E6E6"/>
           </w:tcPr>
           <w:p>
             <w:pPr>
@@ -1625,7 +1056,354 @@
               <w:rPr>
                 <w:rFonts w:ascii="Arial" w:hAnsi="Arial"/>
                 <w:b/>
-                <w:color w:val="FFFFFF"/>
+                <w:color w:val="000000"/>
+                <w:sz w:val="18"/>
+              </w:rPr>
+              <w:t>IID</w:t>
+            </w:r>
+          </w:p>
+        </w:tc>
+      </w:tr>
+      <w:tr>
+        <w:trPr>
+          <w:cantSplit/>
+        </w:trPr>
+        <w:tc>
+          <w:tcPr>
+            <w:tcW w:type="dxa" w:w="2835"/>
+            <w:vAlign w:val="center"/>
+            <w:tcMar>
+              <w:top w:w="75" w:type="dxa"/>
+              <w:bottom w:w="75" w:type="dxa"/>
+              <w:left w:w="95" w:type="dxa"/>
+              <w:right w:w="95" w:type="dxa"/>
+            </w:tcMar>
+          </w:tcPr>
+          <w:p>
+            <w:pPr>
+              <w:spacing w:after="20" w:before="20" w:line="247" w:lineRule="auto"/>
+            </w:pPr>
+            <w:r>
+              <w:rPr>
+                <w:rFonts w:ascii="Arial" w:hAnsi="Arial"/>
+                <w:sz w:val="18"/>
+              </w:rPr>
+              <w:t>IEcoCalculatorX</w:t>
+            </w:r>
+          </w:p>
+        </w:tc>
+        <w:tc>
+          <w:tcPr>
+            <w:tcW w:type="dxa" w:w="6803"/>
+            <w:vAlign w:val="center"/>
+            <w:tcMar>
+              <w:top w:w="75" w:type="dxa"/>
+              <w:bottom w:w="75" w:type="dxa"/>
+              <w:left w:w="95" w:type="dxa"/>
+              <w:right w:w="95" w:type="dxa"/>
+            </w:tcMar>
+          </w:tcPr>
+          <w:p>
+            <w:pPr>
+              <w:spacing w:after="20" w:before="20" w:line="247" w:lineRule="auto"/>
+            </w:pPr>
+            <w:r>
+              <w:rPr>
+                <w:rFonts w:ascii="Arial" w:hAnsi="Arial"/>
+                <w:sz w:val="18"/>
+              </w:rPr>
+              <w:t>93221116-2248-4742-AE06-82819447843D</w:t>
+            </w:r>
+          </w:p>
+        </w:tc>
+      </w:tr>
+      <w:tr>
+        <w:trPr>
+          <w:cantSplit/>
+        </w:trPr>
+        <w:tc>
+          <w:tcPr>
+            <w:tcW w:type="dxa" w:w="2835"/>
+            <w:vAlign w:val="center"/>
+            <w:tcMar>
+              <w:top w:w="75" w:type="dxa"/>
+              <w:bottom w:w="75" w:type="dxa"/>
+              <w:left w:w="95" w:type="dxa"/>
+              <w:right w:w="95" w:type="dxa"/>
+            </w:tcMar>
+            <w:shd w:fill="F7F7F7"/>
+          </w:tcPr>
+          <w:p>
+            <w:pPr>
+              <w:spacing w:after="20" w:before="20" w:line="247" w:lineRule="auto"/>
+            </w:pPr>
+            <w:r>
+              <w:rPr>
+                <w:rFonts w:ascii="Arial" w:hAnsi="Arial"/>
+                <w:sz w:val="18"/>
+              </w:rPr>
+              <w:t>IEcoCalculatorY</w:t>
+            </w:r>
+          </w:p>
+        </w:tc>
+        <w:tc>
+          <w:tcPr>
+            <w:tcW w:type="dxa" w:w="6803"/>
+            <w:vAlign w:val="center"/>
+            <w:tcMar>
+              <w:top w:w="75" w:type="dxa"/>
+              <w:bottom w:w="75" w:type="dxa"/>
+              <w:left w:w="95" w:type="dxa"/>
+              <w:right w:w="95" w:type="dxa"/>
+            </w:tcMar>
+            <w:shd w:fill="F7F7F7"/>
+          </w:tcPr>
+          <w:p>
+            <w:pPr>
+              <w:spacing w:after="20" w:before="20" w:line="247" w:lineRule="auto"/>
+            </w:pPr>
+            <w:r>
+              <w:rPr>
+                <w:rFonts w:ascii="Arial" w:hAnsi="Arial"/>
+                <w:sz w:val="18"/>
+              </w:rPr>
+              <w:t>BD6414C2-9096-423E-A90C-04D77AFD1CAD</w:t>
+            </w:r>
+          </w:p>
+        </w:tc>
+      </w:tr>
+      <w:tr>
+        <w:trPr>
+          <w:cantSplit/>
+        </w:trPr>
+        <w:tc>
+          <w:tcPr>
+            <w:tcW w:type="dxa" w:w="2835"/>
+            <w:vAlign w:val="center"/>
+            <w:tcMar>
+              <w:top w:w="75" w:type="dxa"/>
+              <w:bottom w:w="75" w:type="dxa"/>
+              <w:left w:w="95" w:type="dxa"/>
+              <w:right w:w="95" w:type="dxa"/>
+            </w:tcMar>
+          </w:tcPr>
+          <w:p>
+            <w:pPr>
+              <w:spacing w:after="20" w:before="20" w:line="247" w:lineRule="auto"/>
+            </w:pPr>
+            <w:r>
+              <w:rPr>
+                <w:rFonts w:ascii="Arial" w:hAnsi="Arial"/>
+                <w:sz w:val="18"/>
+              </w:rPr>
+              <w:t>IEcoCalculatorSafe</w:t>
+            </w:r>
+          </w:p>
+        </w:tc>
+        <w:tc>
+          <w:tcPr>
+            <w:tcW w:type="dxa" w:w="6803"/>
+            <w:vAlign w:val="center"/>
+            <w:tcMar>
+              <w:top w:w="75" w:type="dxa"/>
+              <w:bottom w:w="75" w:type="dxa"/>
+              <w:left w:w="95" w:type="dxa"/>
+              <w:right w:w="95" w:type="dxa"/>
+            </w:tcMar>
+          </w:tcPr>
+          <w:p>
+            <w:pPr>
+              <w:spacing w:after="20" w:before="20" w:line="247" w:lineRule="auto"/>
+            </w:pPr>
+            <w:r>
+              <w:rPr>
+                <w:rFonts w:ascii="Arial" w:hAnsi="Arial"/>
+                <w:sz w:val="18"/>
+              </w:rPr>
+              <w:t>D3B3E2F1-8D21-4A6B-9A40-440000000054</w:t>
+            </w:r>
+          </w:p>
+        </w:tc>
+      </w:tr>
+      <w:tr>
+        <w:trPr>
+          <w:cantSplit/>
+        </w:trPr>
+        <w:tc>
+          <w:tcPr>
+            <w:tcW w:type="dxa" w:w="2835"/>
+            <w:vAlign w:val="center"/>
+            <w:tcMar>
+              <w:top w:w="75" w:type="dxa"/>
+              <w:bottom w:w="75" w:type="dxa"/>
+              <w:left w:w="95" w:type="dxa"/>
+              <w:right w:w="95" w:type="dxa"/>
+            </w:tcMar>
+            <w:shd w:fill="F7F7F7"/>
+          </w:tcPr>
+          <w:p>
+            <w:pPr>
+              <w:spacing w:after="20" w:before="20" w:line="247" w:lineRule="auto"/>
+            </w:pPr>
+            <w:r>
+              <w:rPr>
+                <w:rFonts w:ascii="Arial" w:hAnsi="Arial"/>
+                <w:sz w:val="18"/>
+              </w:rPr>
+              <w:t>IEcoLab1</w:t>
+            </w:r>
+          </w:p>
+        </w:tc>
+        <w:tc>
+          <w:tcPr>
+            <w:tcW w:type="dxa" w:w="6803"/>
+            <w:vAlign w:val="center"/>
+            <w:tcMar>
+              <w:top w:w="75" w:type="dxa"/>
+              <w:bottom w:w="75" w:type="dxa"/>
+              <w:left w:w="95" w:type="dxa"/>
+              <w:right w:w="95" w:type="dxa"/>
+            </w:tcMar>
+            <w:shd w:fill="F7F7F7"/>
+          </w:tcPr>
+          <w:p>
+            <w:pPr>
+              <w:spacing w:after="20" w:before="20" w:line="247" w:lineRule="auto"/>
+            </w:pPr>
+            <w:r>
+              <w:rPr>
+                <w:rFonts w:ascii="Arial" w:hAnsi="Arial"/>
+                <w:sz w:val="18"/>
+              </w:rPr>
+              <w:t>D3B3E2F1-8D21-4A6B-9A40-440000000052</w:t>
+            </w:r>
+          </w:p>
+        </w:tc>
+      </w:tr>
+      <w:tr>
+        <w:trPr>
+          <w:cantSplit/>
+        </w:trPr>
+        <w:tc>
+          <w:tcPr>
+            <w:tcW w:type="dxa" w:w="2835"/>
+            <w:vAlign w:val="center"/>
+            <w:tcMar>
+              <w:top w:w="75" w:type="dxa"/>
+              <w:bottom w:w="75" w:type="dxa"/>
+              <w:left w:w="95" w:type="dxa"/>
+              <w:right w:w="95" w:type="dxa"/>
+            </w:tcMar>
+          </w:tcPr>
+          <w:p>
+            <w:pPr>
+              <w:spacing w:after="20" w:before="20" w:line="247" w:lineRule="auto"/>
+            </w:pPr>
+            <w:r>
+              <w:rPr>
+                <w:rFonts w:ascii="Arial" w:hAnsi="Arial"/>
+                <w:sz w:val="18"/>
+              </w:rPr>
+              <w:t>IEcoLab2 с Horner</w:t>
+            </w:r>
+          </w:p>
+        </w:tc>
+        <w:tc>
+          <w:tcPr>
+            <w:tcW w:type="dxa" w:w="6803"/>
+            <w:vAlign w:val="center"/>
+            <w:tcMar>
+              <w:top w:w="75" w:type="dxa"/>
+              <w:bottom w:w="75" w:type="dxa"/>
+              <w:left w:w="95" w:type="dxa"/>
+              <w:right w:w="95" w:type="dxa"/>
+            </w:tcMar>
+          </w:tcPr>
+          <w:p>
+            <w:pPr>
+              <w:spacing w:after="20" w:before="20" w:line="247" w:lineRule="auto"/>
+            </w:pPr>
+            <w:r>
+              <w:rPr>
+                <w:rFonts w:ascii="Arial" w:hAnsi="Arial"/>
+                <w:sz w:val="18"/>
+              </w:rPr>
+              <w:t>D3B3E2F1-8D21-4A6B-9A40-440000000055</w:t>
+            </w:r>
+          </w:p>
+        </w:tc>
+      </w:tr>
+    </w:tbl>
+    <w:p>
+      <w:pPr>
+        <w:widowControl/>
+        <w:spacing w:after="40"/>
+      </w:pPr>
+    </w:p>
+    <w:tbl>
+      <w:tblPr>
+        <w:tblW w:type="auto" w:w="0"/>
+        <w:jc w:val="center"/>
+        <w:tblLayout w:type="fixed"/>
+        <w:tblLook w:firstColumn="1" w:firstRow="1" w:lastColumn="0" w:lastRow="0" w:noHBand="0" w:noVBand="1" w:val="04A0"/>
+      </w:tblPr>
+      <w:tblGrid>
+        <w:gridCol w:w="4819"/>
+        <w:gridCol w:w="4819"/>
+      </w:tblGrid>
+      <w:tr>
+        <w:trPr>
+          <w:cantSplit/>
+          <w:tblHeader/>
+        </w:trPr>
+        <w:tc>
+          <w:tcPr>
+            <w:tcW w:type="dxa" w:w="2835"/>
+            <w:vAlign w:val="center"/>
+            <w:tcMar>
+              <w:top w:w="75" w:type="dxa"/>
+              <w:bottom w:w="75" w:type="dxa"/>
+              <w:left w:w="95" w:type="dxa"/>
+              <w:right w:w="95" w:type="dxa"/>
+            </w:tcMar>
+            <w:shd w:fill="E6E6E6"/>
+          </w:tcPr>
+          <w:p>
+            <w:pPr>
+              <w:spacing w:after="20" w:before="20" w:line="247" w:lineRule="auto"/>
+            </w:pPr>
+            <w:r>
+              <w:rPr>
+                <w:rFonts w:ascii="Arial" w:hAnsi="Arial"/>
+                <w:b/>
+                <w:color w:val="000000"/>
+                <w:sz w:val="18"/>
+              </w:rPr>
+              <w:t>Компонент</w:t>
+            </w:r>
+          </w:p>
+        </w:tc>
+        <w:tc>
+          <w:tcPr>
+            <w:tcW w:type="dxa" w:w="6803"/>
+            <w:vAlign w:val="center"/>
+            <w:tcMar>
+              <w:top w:w="75" w:type="dxa"/>
+              <w:bottom w:w="75" w:type="dxa"/>
+              <w:left w:w="95" w:type="dxa"/>
+              <w:right w:w="95" w:type="dxa"/>
+            </w:tcMar>
+            <w:shd w:fill="E6E6E6"/>
+          </w:tcPr>
+          <w:p>
+            <w:pPr>
+              <w:spacing w:after="20" w:before="20" w:line="247" w:lineRule="auto"/>
+            </w:pPr>
+            <w:r>
+              <w:rPr>
+                <w:rFonts w:ascii="Arial" w:hAnsi="Arial"/>
+                <w:b/>
+                <w:color w:val="000000"/>
                 <w:sz w:val="18"/>
               </w:rPr>
               <w:t>CID</w:t>
@@ -1639,7 +1417,7 @@
         </w:trPr>
         <w:tc>
           <w:tcPr>
-            <w:tcW w:type="dxa" w:w="2324"/>
+            <w:tcW w:type="dxa" w:w="2835"/>
             <w:vAlign w:val="center"/>
             <w:tcMar>
               <w:top w:w="75" w:type="dxa"/>
@@ -1647,12 +1425,6 @@
               <w:left w:w="95" w:type="dxa"/>
               <w:right w:w="95" w:type="dxa"/>
             </w:tcMar>
-            <w:tcBorders>
-              <w:top w:val="single" w:sz="4" w:color="D9D9D9"/>
-              <w:left w:val="single" w:sz="4" w:color="D9D9D9"/>
-              <w:bottom w:val="single" w:sz="4" w:color="D9D9D9"/>
-              <w:right w:val="single" w:sz="4" w:color="D9D9D9"/>
-            </w:tcBorders>
           </w:tcPr>
           <w:p>
             <w:pPr>
@@ -1663,13 +1435,13 @@
                 <w:rFonts w:ascii="Arial" w:hAnsi="Arial"/>
                 <w:sz w:val="18"/>
               </w:rPr>
-              <w:t>Eco.Lab1 normal</w:t>
+              <w:t>A и C</w:t>
             </w:r>
           </w:p>
         </w:tc>
         <w:tc>
           <w:tcPr>
-            <w:tcW w:type="dxa" w:w="7313"/>
+            <w:tcW w:type="dxa" w:w="6803"/>
             <w:vAlign w:val="center"/>
             <w:tcMar>
               <w:top w:w="75" w:type="dxa"/>
@@ -1677,12 +1449,222 @@
               <w:left w:w="95" w:type="dxa"/>
               <w:right w:w="95" w:type="dxa"/>
             </w:tcMar>
-            <w:tcBorders>
-              <w:top w:val="single" w:sz="4" w:color="D9D9D9"/>
-              <w:left w:val="single" w:sz="4" w:color="D9D9D9"/>
-              <w:bottom w:val="single" w:sz="4" w:color="D9D9D9"/>
-              <w:right w:val="single" w:sz="4" w:color="D9D9D9"/>
-            </w:tcBorders>
+          </w:tcPr>
+          <w:p>
+            <w:pPr>
+              <w:spacing w:after="20" w:before="20" w:line="247" w:lineRule="auto"/>
+            </w:pPr>
+            <w:r>
+              <w:rPr>
+                <w:rFonts w:ascii="Arial" w:hAnsi="Arial"/>
+                <w:sz w:val="18"/>
+              </w:rPr>
+              <w:t>4828F655-2E45-40E7-8121-EBD220DC360E</w:t>
+            </w:r>
+          </w:p>
+        </w:tc>
+      </w:tr>
+      <w:tr>
+        <w:trPr>
+          <w:cantSplit/>
+        </w:trPr>
+        <w:tc>
+          <w:tcPr>
+            <w:tcW w:type="dxa" w:w="2835"/>
+            <w:vAlign w:val="center"/>
+            <w:tcMar>
+              <w:top w:w="75" w:type="dxa"/>
+              <w:bottom w:w="75" w:type="dxa"/>
+              <w:left w:w="95" w:type="dxa"/>
+              <w:right w:w="95" w:type="dxa"/>
+            </w:tcMar>
+            <w:shd w:fill="F7F7F7"/>
+          </w:tcPr>
+          <w:p>
+            <w:pPr>
+              <w:spacing w:after="20" w:before="20" w:line="247" w:lineRule="auto"/>
+            </w:pPr>
+            <w:r>
+              <w:rPr>
+                <w:rFonts w:ascii="Arial" w:hAnsi="Arial"/>
+                <w:sz w:val="18"/>
+              </w:rPr>
+              <w:t>B</w:t>
+            </w:r>
+          </w:p>
+        </w:tc>
+        <w:tc>
+          <w:tcPr>
+            <w:tcW w:type="dxa" w:w="6803"/>
+            <w:vAlign w:val="center"/>
+            <w:tcMar>
+              <w:top w:w="75" w:type="dxa"/>
+              <w:bottom w:w="75" w:type="dxa"/>
+              <w:left w:w="95" w:type="dxa"/>
+              <w:right w:w="95" w:type="dxa"/>
+            </w:tcMar>
+            <w:shd w:fill="F7F7F7"/>
+          </w:tcPr>
+          <w:p>
+            <w:pPr>
+              <w:spacing w:after="20" w:before="20" w:line="247" w:lineRule="auto"/>
+            </w:pPr>
+            <w:r>
+              <w:rPr>
+                <w:rFonts w:ascii="Arial" w:hAnsi="Arial"/>
+                <w:sz w:val="18"/>
+              </w:rPr>
+              <w:t>AE202E54-3CE5-4550-8996-03BD70C62565</w:t>
+            </w:r>
+          </w:p>
+        </w:tc>
+      </w:tr>
+      <w:tr>
+        <w:trPr>
+          <w:cantSplit/>
+        </w:trPr>
+        <w:tc>
+          <w:tcPr>
+            <w:tcW w:type="dxa" w:w="2835"/>
+            <w:vAlign w:val="center"/>
+            <w:tcMar>
+              <w:top w:w="75" w:type="dxa"/>
+              <w:bottom w:w="75" w:type="dxa"/>
+              <w:left w:w="95" w:type="dxa"/>
+              <w:right w:w="95" w:type="dxa"/>
+            </w:tcMar>
+          </w:tcPr>
+          <w:p>
+            <w:pPr>
+              <w:spacing w:after="20" w:before="20" w:line="247" w:lineRule="auto"/>
+            </w:pPr>
+            <w:r>
+              <w:rPr>
+                <w:rFonts w:ascii="Arial" w:hAnsi="Arial"/>
+                <w:sz w:val="18"/>
+              </w:rPr>
+              <w:t>D</w:t>
+            </w:r>
+          </w:p>
+        </w:tc>
+        <w:tc>
+          <w:tcPr>
+            <w:tcW w:type="dxa" w:w="6803"/>
+            <w:vAlign w:val="center"/>
+            <w:tcMar>
+              <w:top w:w="75" w:type="dxa"/>
+              <w:bottom w:w="75" w:type="dxa"/>
+              <w:left w:w="95" w:type="dxa"/>
+              <w:right w:w="95" w:type="dxa"/>
+            </w:tcMar>
+          </w:tcPr>
+          <w:p>
+            <w:pPr>
+              <w:spacing w:after="20" w:before="20" w:line="247" w:lineRule="auto"/>
+            </w:pPr>
+            <w:r>
+              <w:rPr>
+                <w:rFonts w:ascii="Arial" w:hAnsi="Arial"/>
+                <w:sz w:val="18"/>
+              </w:rPr>
+              <w:t>3A8E4467-7E82-475C-B4A3-719ED8397E61</w:t>
+            </w:r>
+          </w:p>
+        </w:tc>
+      </w:tr>
+      <w:tr>
+        <w:trPr>
+          <w:cantSplit/>
+        </w:trPr>
+        <w:tc>
+          <w:tcPr>
+            <w:tcW w:type="dxa" w:w="2835"/>
+            <w:vAlign w:val="center"/>
+            <w:tcMar>
+              <w:top w:w="75" w:type="dxa"/>
+              <w:bottom w:w="75" w:type="dxa"/>
+              <w:left w:w="95" w:type="dxa"/>
+              <w:right w:w="95" w:type="dxa"/>
+            </w:tcMar>
+            <w:shd w:fill="F7F7F7"/>
+          </w:tcPr>
+          <w:p>
+            <w:pPr>
+              <w:spacing w:after="20" w:before="20" w:line="247" w:lineRule="auto"/>
+            </w:pPr>
+            <w:r>
+              <w:rPr>
+                <w:rFonts w:ascii="Arial" w:hAnsi="Arial"/>
+                <w:sz w:val="18"/>
+              </w:rPr>
+              <w:t>E</w:t>
+            </w:r>
+          </w:p>
+        </w:tc>
+        <w:tc>
+          <w:tcPr>
+            <w:tcW w:type="dxa" w:w="6803"/>
+            <w:vAlign w:val="center"/>
+            <w:tcMar>
+              <w:top w:w="75" w:type="dxa"/>
+              <w:bottom w:w="75" w:type="dxa"/>
+              <w:left w:w="95" w:type="dxa"/>
+              <w:right w:w="95" w:type="dxa"/>
+            </w:tcMar>
+            <w:shd w:fill="F7F7F7"/>
+          </w:tcPr>
+          <w:p>
+            <w:pPr>
+              <w:spacing w:after="20" w:before="20" w:line="247" w:lineRule="auto"/>
+            </w:pPr>
+            <w:r>
+              <w:rPr>
+                <w:rFonts w:ascii="Arial" w:hAnsi="Arial"/>
+                <w:sz w:val="18"/>
+              </w:rPr>
+              <w:t>872FEF1D-E331-4B87-AD44-D1E7C232C2F0</w:t>
+            </w:r>
+          </w:p>
+        </w:tc>
+      </w:tr>
+      <w:tr>
+        <w:trPr>
+          <w:cantSplit/>
+        </w:trPr>
+        <w:tc>
+          <w:tcPr>
+            <w:tcW w:type="dxa" w:w="2835"/>
+            <w:vAlign w:val="center"/>
+            <w:tcMar>
+              <w:top w:w="75" w:type="dxa"/>
+              <w:bottom w:w="75" w:type="dxa"/>
+              <w:left w:w="95" w:type="dxa"/>
+              <w:right w:w="95" w:type="dxa"/>
+            </w:tcMar>
+          </w:tcPr>
+          <w:p>
+            <w:pPr>
+              <w:spacing w:after="20" w:before="20" w:line="247" w:lineRule="auto"/>
+            </w:pPr>
+            <w:r>
+              <w:rPr>
+                <w:rFonts w:ascii="Arial" w:hAnsi="Arial"/>
+                <w:sz w:val="18"/>
+              </w:rPr>
+              <w:t>Lab1 normal</w:t>
+            </w:r>
+          </w:p>
+        </w:tc>
+        <w:tc>
+          <w:tcPr>
+            <w:tcW w:type="dxa" w:w="6803"/>
+            <w:vAlign w:val="center"/>
+            <w:tcMar>
+              <w:top w:w="75" w:type="dxa"/>
+              <w:bottom w:w="75" w:type="dxa"/>
+              <w:left w:w="95" w:type="dxa"/>
+              <w:right w:w="95" w:type="dxa"/>
+            </w:tcMar>
           </w:tcPr>
           <w:p>
             <w:pPr>
@@ -1704,7 +1686,7 @@
         </w:trPr>
         <w:tc>
           <w:tcPr>
-            <w:tcW w:type="dxa" w:w="2324"/>
+            <w:tcW w:type="dxa" w:w="2835"/>
             <w:vAlign w:val="center"/>
             <w:tcMar>
               <w:top w:w="75" w:type="dxa"/>
@@ -1712,13 +1694,7 @@
               <w:left w:w="95" w:type="dxa"/>
               <w:right w:w="95" w:type="dxa"/>
             </w:tcMar>
-            <w:shd w:fill="F1F5F8"/>
-            <w:tcBorders>
-              <w:top w:val="single" w:sz="4" w:color="D9D9D9"/>
-              <w:left w:val="single" w:sz="4" w:color="D9D9D9"/>
-              <w:bottom w:val="single" w:sz="4" w:color="D9D9D9"/>
-              <w:right w:val="single" w:sz="4" w:color="D9D9D9"/>
-            </w:tcBorders>
+            <w:shd w:fill="F7F7F7"/>
           </w:tcPr>
           <w:p>
             <w:pPr>
@@ -1729,13 +1705,13 @@
                 <w:rFonts w:ascii="Arial" w:hAnsi="Arial"/>
                 <w:sz w:val="18"/>
               </w:rPr>
-              <w:t>Eco.Lab1 QR</w:t>
+              <w:t>Lab1 QR</w:t>
             </w:r>
           </w:p>
         </w:tc>
         <w:tc>
           <w:tcPr>
-            <w:tcW w:type="dxa" w:w="7313"/>
+            <w:tcW w:type="dxa" w:w="6803"/>
             <w:vAlign w:val="center"/>
             <w:tcMar>
               <w:top w:w="75" w:type="dxa"/>
@@ -1743,13 +1719,7 @@
               <w:left w:w="95" w:type="dxa"/>
               <w:right w:w="95" w:type="dxa"/>
             </w:tcMar>
-            <w:shd w:fill="F1F5F8"/>
-            <w:tcBorders>
-              <w:top w:val="single" w:sz="4" w:color="D9D9D9"/>
-              <w:left w:val="single" w:sz="4" w:color="D9D9D9"/>
-              <w:bottom w:val="single" w:sz="4" w:color="D9D9D9"/>
-              <w:right w:val="single" w:sz="4" w:color="D9D9D9"/>
-            </w:tcBorders>
+            <w:shd w:fill="F7F7F7"/>
           </w:tcPr>
           <w:p>
             <w:pPr>
@@ -1771,7 +1741,7 @@
         </w:trPr>
         <w:tc>
           <w:tcPr>
-            <w:tcW w:type="dxa" w:w="2324"/>
+            <w:tcW w:type="dxa" w:w="2835"/>
             <w:vAlign w:val="center"/>
             <w:tcMar>
               <w:top w:w="75" w:type="dxa"/>
@@ -1779,12 +1749,6 @@
               <w:left w:w="95" w:type="dxa"/>
               <w:right w:w="95" w:type="dxa"/>
             </w:tcMar>
-            <w:tcBorders>
-              <w:top w:val="single" w:sz="4" w:color="D9D9D9"/>
-              <w:left w:val="single" w:sz="4" w:color="D9D9D9"/>
-              <w:bottom w:val="single" w:sz="4" w:color="D9D9D9"/>
-              <w:right w:val="single" w:sz="4" w:color="D9D9D9"/>
-            </w:tcBorders>
           </w:tcPr>
           <w:p>
             <w:pPr>
@@ -1795,13 +1759,13 @@
                 <w:rFonts w:ascii="Arial" w:hAnsi="Arial"/>
                 <w:sz w:val="18"/>
               </w:rPr>
-              <w:t>A</w:t>
+              <w:t>Lab2</w:t>
             </w:r>
           </w:p>
         </w:tc>
         <w:tc>
           <w:tcPr>
-            <w:tcW w:type="dxa" w:w="7313"/>
+            <w:tcW w:type="dxa" w:w="6803"/>
             <w:vAlign w:val="center"/>
             <w:tcMar>
               <w:top w:w="75" w:type="dxa"/>
@@ -1809,343 +1773,6 @@
               <w:left w:w="95" w:type="dxa"/>
               <w:right w:w="95" w:type="dxa"/>
             </w:tcMar>
-            <w:tcBorders>
-              <w:top w:val="single" w:sz="4" w:color="D9D9D9"/>
-              <w:left w:val="single" w:sz="4" w:color="D9D9D9"/>
-              <w:bottom w:val="single" w:sz="4" w:color="D9D9D9"/>
-              <w:right w:val="single" w:sz="4" w:color="D9D9D9"/>
-            </w:tcBorders>
-          </w:tcPr>
-          <w:p>
-            <w:pPr>
-              <w:spacing w:after="20" w:before="20" w:line="247" w:lineRule="auto"/>
-            </w:pPr>
-            <w:r>
-              <w:rPr>
-                <w:rFonts w:ascii="Arial" w:hAnsi="Arial"/>
-                <w:sz w:val="18"/>
-              </w:rPr>
-              <w:t>D3B3E2F1-8D21-4A6B-9A40-440000000060</w:t>
-            </w:r>
-          </w:p>
-        </w:tc>
-      </w:tr>
-      <w:tr>
-        <w:trPr>
-          <w:cantSplit/>
-        </w:trPr>
-        <w:tc>
-          <w:tcPr>
-            <w:tcW w:type="dxa" w:w="2324"/>
-            <w:vAlign w:val="center"/>
-            <w:tcMar>
-              <w:top w:w="75" w:type="dxa"/>
-              <w:bottom w:w="75" w:type="dxa"/>
-              <w:left w:w="95" w:type="dxa"/>
-              <w:right w:w="95" w:type="dxa"/>
-            </w:tcMar>
-            <w:shd w:fill="F1F5F8"/>
-            <w:tcBorders>
-              <w:top w:val="single" w:sz="4" w:color="D9D9D9"/>
-              <w:left w:val="single" w:sz="4" w:color="D9D9D9"/>
-              <w:bottom w:val="single" w:sz="4" w:color="D9D9D9"/>
-              <w:right w:val="single" w:sz="4" w:color="D9D9D9"/>
-            </w:tcBorders>
-          </w:tcPr>
-          <w:p>
-            <w:pPr>
-              <w:spacing w:after="20" w:before="20" w:line="247" w:lineRule="auto"/>
-            </w:pPr>
-            <w:r>
-              <w:rPr>
-                <w:rFonts w:ascii="Arial" w:hAnsi="Arial"/>
-                <w:sz w:val="18"/>
-              </w:rPr>
-              <w:t>B</w:t>
-            </w:r>
-          </w:p>
-        </w:tc>
-        <w:tc>
-          <w:tcPr>
-            <w:tcW w:type="dxa" w:w="7313"/>
-            <w:vAlign w:val="center"/>
-            <w:tcMar>
-              <w:top w:w="75" w:type="dxa"/>
-              <w:bottom w:w="75" w:type="dxa"/>
-              <w:left w:w="95" w:type="dxa"/>
-              <w:right w:w="95" w:type="dxa"/>
-            </w:tcMar>
-            <w:shd w:fill="F1F5F8"/>
-            <w:tcBorders>
-              <w:top w:val="single" w:sz="4" w:color="D9D9D9"/>
-              <w:left w:val="single" w:sz="4" w:color="D9D9D9"/>
-              <w:bottom w:val="single" w:sz="4" w:color="D9D9D9"/>
-              <w:right w:val="single" w:sz="4" w:color="D9D9D9"/>
-            </w:tcBorders>
-          </w:tcPr>
-          <w:p>
-            <w:pPr>
-              <w:spacing w:after="20" w:before="20" w:line="247" w:lineRule="auto"/>
-            </w:pPr>
-            <w:r>
-              <w:rPr>
-                <w:rFonts w:ascii="Arial" w:hAnsi="Arial"/>
-                <w:sz w:val="18"/>
-              </w:rPr>
-              <w:t>D3B3E2F1-8D21-4A6B-9A40-440000000061</w:t>
-            </w:r>
-          </w:p>
-        </w:tc>
-      </w:tr>
-      <w:tr>
-        <w:trPr>
-          <w:cantSplit/>
-        </w:trPr>
-        <w:tc>
-          <w:tcPr>
-            <w:tcW w:type="dxa" w:w="2324"/>
-            <w:vAlign w:val="center"/>
-            <w:tcMar>
-              <w:top w:w="75" w:type="dxa"/>
-              <w:bottom w:w="75" w:type="dxa"/>
-              <w:left w:w="95" w:type="dxa"/>
-              <w:right w:w="95" w:type="dxa"/>
-            </w:tcMar>
-            <w:tcBorders>
-              <w:top w:val="single" w:sz="4" w:color="D9D9D9"/>
-              <w:left w:val="single" w:sz="4" w:color="D9D9D9"/>
-              <w:bottom w:val="single" w:sz="4" w:color="D9D9D9"/>
-              <w:right w:val="single" w:sz="4" w:color="D9D9D9"/>
-            </w:tcBorders>
-          </w:tcPr>
-          <w:p>
-            <w:pPr>
-              <w:spacing w:after="20" w:before="20" w:line="247" w:lineRule="auto"/>
-            </w:pPr>
-            <w:r>
-              <w:rPr>
-                <w:rFonts w:ascii="Arial" w:hAnsi="Arial"/>
-                <w:sz w:val="18"/>
-              </w:rPr>
-              <w:t>C</w:t>
-            </w:r>
-          </w:p>
-        </w:tc>
-        <w:tc>
-          <w:tcPr>
-            <w:tcW w:type="dxa" w:w="7313"/>
-            <w:vAlign w:val="center"/>
-            <w:tcMar>
-              <w:top w:w="75" w:type="dxa"/>
-              <w:bottom w:w="75" w:type="dxa"/>
-              <w:left w:w="95" w:type="dxa"/>
-              <w:right w:w="95" w:type="dxa"/>
-            </w:tcMar>
-            <w:tcBorders>
-              <w:top w:val="single" w:sz="4" w:color="D9D9D9"/>
-              <w:left w:val="single" w:sz="4" w:color="D9D9D9"/>
-              <w:bottom w:val="single" w:sz="4" w:color="D9D9D9"/>
-              <w:right w:val="single" w:sz="4" w:color="D9D9D9"/>
-            </w:tcBorders>
-          </w:tcPr>
-          <w:p>
-            <w:pPr>
-              <w:spacing w:after="20" w:before="20" w:line="247" w:lineRule="auto"/>
-            </w:pPr>
-            <w:r>
-              <w:rPr>
-                <w:rFonts w:ascii="Arial" w:hAnsi="Arial"/>
-                <w:sz w:val="18"/>
-              </w:rPr>
-              <w:t>D3B3E2F1-8D21-4A6B-9A40-440000000062</w:t>
-            </w:r>
-          </w:p>
-        </w:tc>
-      </w:tr>
-      <w:tr>
-        <w:trPr>
-          <w:cantSplit/>
-        </w:trPr>
-        <w:tc>
-          <w:tcPr>
-            <w:tcW w:type="dxa" w:w="2324"/>
-            <w:vAlign w:val="center"/>
-            <w:tcMar>
-              <w:top w:w="75" w:type="dxa"/>
-              <w:bottom w:w="75" w:type="dxa"/>
-              <w:left w:w="95" w:type="dxa"/>
-              <w:right w:w="95" w:type="dxa"/>
-            </w:tcMar>
-            <w:shd w:fill="F1F5F8"/>
-            <w:tcBorders>
-              <w:top w:val="single" w:sz="4" w:color="D9D9D9"/>
-              <w:left w:val="single" w:sz="4" w:color="D9D9D9"/>
-              <w:bottom w:val="single" w:sz="4" w:color="D9D9D9"/>
-              <w:right w:val="single" w:sz="4" w:color="D9D9D9"/>
-            </w:tcBorders>
-          </w:tcPr>
-          <w:p>
-            <w:pPr>
-              <w:spacing w:after="20" w:before="20" w:line="247" w:lineRule="auto"/>
-            </w:pPr>
-            <w:r>
-              <w:rPr>
-                <w:rFonts w:ascii="Arial" w:hAnsi="Arial"/>
-                <w:sz w:val="18"/>
-              </w:rPr>
-              <w:t>D</w:t>
-            </w:r>
-          </w:p>
-        </w:tc>
-        <w:tc>
-          <w:tcPr>
-            <w:tcW w:type="dxa" w:w="7313"/>
-            <w:vAlign w:val="center"/>
-            <w:tcMar>
-              <w:top w:w="75" w:type="dxa"/>
-              <w:bottom w:w="75" w:type="dxa"/>
-              <w:left w:w="95" w:type="dxa"/>
-              <w:right w:w="95" w:type="dxa"/>
-            </w:tcMar>
-            <w:shd w:fill="F1F5F8"/>
-            <w:tcBorders>
-              <w:top w:val="single" w:sz="4" w:color="D9D9D9"/>
-              <w:left w:val="single" w:sz="4" w:color="D9D9D9"/>
-              <w:bottom w:val="single" w:sz="4" w:color="D9D9D9"/>
-              <w:right w:val="single" w:sz="4" w:color="D9D9D9"/>
-            </w:tcBorders>
-          </w:tcPr>
-          <w:p>
-            <w:pPr>
-              <w:spacing w:after="20" w:before="20" w:line="247" w:lineRule="auto"/>
-            </w:pPr>
-            <w:r>
-              <w:rPr>
-                <w:rFonts w:ascii="Arial" w:hAnsi="Arial"/>
-                <w:sz w:val="18"/>
-              </w:rPr>
-              <w:t>D3B3E2F1-8D21-4A6B-9A40-440000000063</w:t>
-            </w:r>
-          </w:p>
-        </w:tc>
-      </w:tr>
-      <w:tr>
-        <w:trPr>
-          <w:cantSplit/>
-        </w:trPr>
-        <w:tc>
-          <w:tcPr>
-            <w:tcW w:type="dxa" w:w="2324"/>
-            <w:vAlign w:val="center"/>
-            <w:tcMar>
-              <w:top w:w="75" w:type="dxa"/>
-              <w:bottom w:w="75" w:type="dxa"/>
-              <w:left w:w="95" w:type="dxa"/>
-              <w:right w:w="95" w:type="dxa"/>
-            </w:tcMar>
-            <w:tcBorders>
-              <w:top w:val="single" w:sz="4" w:color="D9D9D9"/>
-              <w:left w:val="single" w:sz="4" w:color="D9D9D9"/>
-              <w:bottom w:val="single" w:sz="4" w:color="D9D9D9"/>
-              <w:right w:val="single" w:sz="4" w:color="D9D9D9"/>
-            </w:tcBorders>
-          </w:tcPr>
-          <w:p>
-            <w:pPr>
-              <w:spacing w:after="20" w:before="20" w:line="247" w:lineRule="auto"/>
-            </w:pPr>
-            <w:r>
-              <w:rPr>
-                <w:rFonts w:ascii="Arial" w:hAnsi="Arial"/>
-                <w:sz w:val="18"/>
-              </w:rPr>
-              <w:t>E</w:t>
-            </w:r>
-          </w:p>
-        </w:tc>
-        <w:tc>
-          <w:tcPr>
-            <w:tcW w:type="dxa" w:w="7313"/>
-            <w:vAlign w:val="center"/>
-            <w:tcMar>
-              <w:top w:w="75" w:type="dxa"/>
-              <w:bottom w:w="75" w:type="dxa"/>
-              <w:left w:w="95" w:type="dxa"/>
-              <w:right w:w="95" w:type="dxa"/>
-            </w:tcMar>
-            <w:tcBorders>
-              <w:top w:val="single" w:sz="4" w:color="D9D9D9"/>
-              <w:left w:val="single" w:sz="4" w:color="D9D9D9"/>
-              <w:bottom w:val="single" w:sz="4" w:color="D9D9D9"/>
-              <w:right w:val="single" w:sz="4" w:color="D9D9D9"/>
-            </w:tcBorders>
-          </w:tcPr>
-          <w:p>
-            <w:pPr>
-              <w:spacing w:after="20" w:before="20" w:line="247" w:lineRule="auto"/>
-            </w:pPr>
-            <w:r>
-              <w:rPr>
-                <w:rFonts w:ascii="Arial" w:hAnsi="Arial"/>
-                <w:sz w:val="18"/>
-              </w:rPr>
-              <w:t>D3B3E2F1-8D21-4A6B-9A40-440000000064</w:t>
-            </w:r>
-          </w:p>
-        </w:tc>
-      </w:tr>
-      <w:tr>
-        <w:trPr>
-          <w:cantSplit/>
-        </w:trPr>
-        <w:tc>
-          <w:tcPr>
-            <w:tcW w:type="dxa" w:w="2324"/>
-            <w:vAlign w:val="center"/>
-            <w:tcMar>
-              <w:top w:w="75" w:type="dxa"/>
-              <w:bottom w:w="75" w:type="dxa"/>
-              <w:left w:w="95" w:type="dxa"/>
-              <w:right w:w="95" w:type="dxa"/>
-            </w:tcMar>
-            <w:shd w:fill="F1F5F8"/>
-            <w:tcBorders>
-              <w:top w:val="single" w:sz="4" w:color="D9D9D9"/>
-              <w:left w:val="single" w:sz="4" w:color="D9D9D9"/>
-              <w:bottom w:val="single" w:sz="4" w:color="D9D9D9"/>
-              <w:right w:val="single" w:sz="4" w:color="D9D9D9"/>
-            </w:tcBorders>
-          </w:tcPr>
-          <w:p>
-            <w:pPr>
-              <w:spacing w:after="20" w:before="20" w:line="247" w:lineRule="auto"/>
-            </w:pPr>
-            <w:r>
-              <w:rPr>
-                <w:rFonts w:ascii="Arial" w:hAnsi="Arial"/>
-                <w:sz w:val="18"/>
-              </w:rPr>
-              <w:t>Eco.Lab2</w:t>
-            </w:r>
-          </w:p>
-        </w:tc>
-        <w:tc>
-          <w:tcPr>
-            <w:tcW w:type="dxa" w:w="7313"/>
-            <w:vAlign w:val="center"/>
-            <w:tcMar>
-              <w:top w:w="75" w:type="dxa"/>
-              <w:bottom w:w="75" w:type="dxa"/>
-              <w:left w:w="95" w:type="dxa"/>
-              <w:right w:w="95" w:type="dxa"/>
-            </w:tcMar>
-            <w:shd w:fill="F1F5F8"/>
-            <w:tcBorders>
-              <w:top w:val="single" w:sz="4" w:color="D9D9D9"/>
-              <w:left w:val="single" w:sz="4" w:color="D9D9D9"/>
-              <w:bottom w:val="single" w:sz="4" w:color="D9D9D9"/>
-              <w:right w:val="single" w:sz="4" w:color="D9D9D9"/>
-            </w:tcBorders>
           </w:tcPr>
           <w:p>
             <w:pPr>
@@ -2173,10 +1800,7 @@
         <w:pStyle w:val="Heading2"/>
       </w:pPr>
       <w:r>
-        <w:rPr>
-          <w:color w:val="000000"/>
-        </w:rPr>
-        <w:t>Ошибки и ограничения контракта</w:t>
+        <w:t>Безопасное деление и Horner</w:t>
       </w:r>
     </w:p>
     <w:p>
@@ -2184,10 +1808,7 @@
         <w:widowControl/>
       </w:pPr>
       <w:r>
-        <w:t>QueryInterface очищает выход до проверки me/riid, поддерживает IEcoUnknown и отвергает неизвестный IID. Для агрегированного создания outer допускается только с IID_IEcoUnknown. TryDivision сообщает об ошибке при b = 0 и обнуляет выход. Division при недопустимом вызове возвращает 0; статус ошибки следует получать через TryDivision.</w:t>
-      </w:r>
-      <w:r>
-        <w:t xml:space="preserve"> Если целочисленный вход нельзя точно преобразовать во внутренний long double, polyfit возвращает ERR__POLYFIT_PRECISION (1005) с нулевыми коэффициентами.</w:t>
+        <w:t>IEcoCalculatorSafe::TryDivision возвращает status и результат через int16*. При b = 0 выдаётся 1101, при −32768 / −1 — 1102; выход обнуляется. Обычный Division в этих случаях возвращает 0. Метод Safe не добавлен в официальную таблицу Y.</w:t>
       </w:r>
     </w:p>
     <w:p>
@@ -2195,10 +1816,15 @@
         <w:widowControl/>
       </w:pPr>
       <w:r>
-        <w:t>Заголовки и IDL находятся в SharedFiles. Контракт IDL обновлён; генерация межпроцессного маршалинга в данную лабораторную работу не входит. Численный и компонентный код компилируется как C89 без стандартных заголовков/прямых вызовов libc.</w:t>
+        <w:t>Horner принимает коэффициенты от старшей степени и возвращает status/int32 out. Перед передачей аргументов калькуляторам промежуточный аккумулятор и произведение проверяются на диапазон int16. Последнее сложение может дать int32, например 65534. Ошибка диапазона возвращает 1102 и нулевой выход. NULL, нулевая длина и переполнение размера отклоняются.</w:t>
       </w:r>
+    </w:p>
+    <w:p>
+      <w:pPr>
+        <w:widowControl/>
+      </w:pPr>
       <w:r>
-        <w:t xml:space="preserve"> На macOS arm64 long double имеет точность double; некоторые 64-битные long отклоняются этой проверкой. Полный диапазон long без потери точности здесь не заявляется.</w:t>
+        <w:t>Добавление Horner изменило IID Lab2 с …0053 на …0055. Заголовки и IDL согласованы; генерация межпроцессного маршалинга не входит в работу.</w:t>
       </w:r>
     </w:p>
     <w:p>
@@ -2211,10 +1837,7 @@
         <w:pStyle w:val="Heading1"/>
       </w:pPr>
       <w:r>
-        <w:rPr>
-          <w:color w:val="000000"/>
-        </w:rPr>
-        <w:t>4 Включение и управление агрегатом</w:t>
+        <w:t>4 Управление ссылками и временем жизни</w:t>
       </w:r>
     </w:p>
     <w:p>
@@ -2222,7 +1845,7 @@
         <w:widowControl/>
       </w:pPr>
       <w:r>
-        <w:t>При включении внешний объект владеет обычным дочерним интерфейсом и вызывает его Release при уничтожении. Публичный фасад внешнего объекта перенаправляет операции, сохраняя собственную identity. Дочерний объект сохраняет независимый IEcoUnknown.</w:t>
+        <w:t>При включении владелец хранит обычную дочернюю ссылку. Дочерний объект сохраняет собственный IEcoUnknown. Фасад владельца вызывает методы дочернего интерфейса и сохраняет identity владельца.</w:t>
       </w:r>
     </w:p>
     <w:p>
@@ -2230,7 +1853,7 @@
         <w:widowControl/>
       </w:pPr>
       <w:r>
-        <w:t>При агрегировании нужны два уровня unknown: публичный делегирует управляющему unknown владельца, приватный неделегирующий управляет внутренним временем жизни. Возврат совпадающего публичного unknown сам по себе недостаточен: требуется корректное освобождение через приватную ссылку.</w:t>
+        <w:t>Агрегирующая фабрика принимает внешний unknown только вместе с IID_IEcoUnknown. Она возвращает приватный неделегирующий unknown, управляющий внутренним временем жизни. Публичные QI/AddRef/Release делегируют controlling unknown внешнего объекта.</w:t>
       </w:r>
     </w:p>
     <w:p>
@@ -2242,7 +1865,7 @@
       <w:r>
         <w:drawing>
           <wp:inline xmlns:a="http://schemas.openxmlformats.org/drawingml/2006/main" xmlns:pic="http://schemas.openxmlformats.org/drawingml/2006/picture">
-            <wp:extent cx="6048000" cy="4147200"/>
+            <wp:extent cx="5832000" cy="3999086"/>
             <wp:docPr id="2" name="Picture 2"/>
             <wp:cNvGraphicFramePr>
               <a:graphicFrameLocks noChangeAspect="1"/>
@@ -2263,7 +1886,7 @@
                   <pic:spPr>
                     <a:xfrm>
                       <a:off x="0" y="0"/>
-                      <a:ext cx="6048000" cy="4147200"/>
+                      <a:ext cx="5832000" cy="3999086"/>
                     </a:xfrm>
                     <a:prstGeom prst="rect"/>
                   </pic:spPr>
@@ -2281,7 +1904,7 @@
         <w:jc w:val="center"/>
       </w:pPr>
       <w:r>
-        <w:t>Рисунок 2. Разделение публичных ссылок и приватного времени жизни</w:t>
+        <w:t>Рисунок 2. Публичные ссылки и приватное владение агрегатом</w:t>
       </w:r>
     </w:p>
     <w:p>
@@ -2289,7 +1912,7 @@
         <w:widowControl/>
       </w:pPr>
       <w:r>
-        <w:t>Lab2 создаёт Lab1 с outer = Lab2 и IID_IEcoUnknown. Полученную приватную ссылку хранит до разрушения. Когда клиент получает Lab1, X/Y или PolynomialMath, AddRef увеличивает внешний счётчик. Эти интерфейсы остаются рабочими после освобождения отдельной корневой ссылки клиента.</w:t>
+        <w:t>Lab2 создаёт Lab1 с outer = Lab2. Lab1 создаёт B с тем же controlling unknown. Поэтому B.X.QueryInterface(IEcoUnknown) возвращает identity Lab2, а AddRef/Release изменяют внешний счётчик. Независимый клиент освобождает исходную ссылку Lab2, продолжает вызывать B.X, получает Lab2 обратно через QI и завершает все ссылки.</w:t>
       </w:r>
     </w:p>
     <w:p>
@@ -2297,7 +1920,15 @@
         <w:widowControl/>
       </w:pPr>
       <w:r>
-        <w:t>Последний внешний Release сначала освобождает private unknown Lab1 и включённый E, затем system и allocator. E аналогично освобождает private unknown своего B. Внешний код не приводит интерфейсы к структурам чужих компонентов и не вызывает их конкретные destroy-функции.</w:t>
+        <w:t>Последний внешний Release освобождает приватный unknown Lab1 и включённые A/C и D. Lab1 освобождает private B и включённый E; E — private B своего экземпляра. Каждый объект освобождает дочерние ссылки раньше system/allocator. Внешний код не приводит чужие интерфейсы к concrete-структурам и не вызывает чужие destroy-функции.</w:t>
+      </w:r>
+    </w:p>
+    <w:p>
+      <w:pPr>
+        <w:widowControl/>
+      </w:pPr>
+      <w:r>
+        <w:t>Повторный Release уже уничтоженного объекта недопустим: проверки касаются баланса владеемых ссылок и отсутствия двойного освобождения, а не обращения к освобождённой памяти.</w:t>
       </w:r>
     </w:p>
     <w:p>
@@ -2310,10 +1941,7 @@
         <w:pStyle w:val="Heading1"/>
       </w:pPr>
       <w:r>
-        <w:rPr>
-          <w:color w:val="000000"/>
-        </w:rPr>
-        <w:t>5 Методика тестирования и результаты</w:t>
+        <w:t>5 Методика и результаты тестирования</w:t>
       </w:r>
     </w:p>
     <w:p>
@@ -2321,7 +1949,7 @@
         <w:widowControl/>
       </w:pPr>
       <w:r>
-        <w:t>Host-тест использует явно обозначенный тестовый allocator для локального численного и контрактного контроля. Eco-тест работает с настоящим Framework и шиной: фабрики и QueryInterface не подменяются. Тестовый наблюдатель allocator считает реальные выделения компонента и позволяет отказать на конкретном Alloc.</w:t>
+        <w:t>Результаты ниже получены 28 октября 2026. Host использует явно обозначенный тестовый allocator. Eco-клиент работает с настоящими Framework и Interface Bus; фабрики и QueryInterface не подменяются. Наблюдатель allocator считает выделения и позволяет вызвать детерминированный отказ Alloc.</w:t>
       </w:r>
     </w:p>
     <w:tbl>
@@ -2342,7 +1970,7 @@
         </w:trPr>
         <w:tc>
           <w:tcPr>
-            <w:tcW w:type="dxa" w:w="3515"/>
+            <w:tcW w:type="dxa" w:w="4535"/>
             <w:vAlign w:val="center"/>
             <w:tcMar>
               <w:top w:w="75" w:type="dxa"/>
@@ -2350,13 +1978,7 @@
               <w:left w:w="95" w:type="dxa"/>
               <w:right w:w="95" w:type="dxa"/>
             </w:tcMar>
-            <w:shd w:fill="24577A"/>
-            <w:tcBorders>
-              <w:top w:val="single" w:sz="4" w:color="D9D9D9"/>
-              <w:left w:val="single" w:sz="4" w:color="D9D9D9"/>
-              <w:bottom w:val="single" w:sz="4" w:color="D9D9D9"/>
-              <w:right w:val="single" w:sz="4" w:color="D9D9D9"/>
-            </w:tcBorders>
+            <w:shd w:fill="E6E6E6"/>
           </w:tcPr>
           <w:p>
             <w:pPr>
@@ -2366,7 +1988,7 @@
               <w:rPr>
                 <w:rFonts w:ascii="Arial" w:hAnsi="Arial"/>
                 <w:b/>
-                <w:color w:val="FFFFFF"/>
+                <w:color w:val="000000"/>
                 <w:sz w:val="19"/>
               </w:rPr>
               <w:t>Проверка</w:t>
@@ -2375,7 +1997,7 @@
         </w:tc>
         <w:tc>
           <w:tcPr>
-            <w:tcW w:type="dxa" w:w="6123"/>
+            <w:tcW w:type="dxa" w:w="5102"/>
             <w:vAlign w:val="center"/>
             <w:tcMar>
               <w:top w:w="75" w:type="dxa"/>
@@ -2383,13 +2005,7 @@
               <w:left w:w="95" w:type="dxa"/>
               <w:right w:w="95" w:type="dxa"/>
             </w:tcMar>
-            <w:shd w:fill="24577A"/>
-            <w:tcBorders>
-              <w:top w:val="single" w:sz="4" w:color="D9D9D9"/>
-              <w:left w:val="single" w:sz="4" w:color="D9D9D9"/>
-              <w:bottom w:val="single" w:sz="4" w:color="D9D9D9"/>
-              <w:right w:val="single" w:sz="4" w:color="D9D9D9"/>
-            </w:tcBorders>
+            <w:shd w:fill="E6E6E6"/>
           </w:tcPr>
           <w:p>
             <w:pPr>
@@ -2399,10 +2015,10 @@
               <w:rPr>
                 <w:rFonts w:ascii="Arial" w:hAnsi="Arial"/>
                 <w:b/>
-                <w:color w:val="FFFFFF"/>
+                <w:color w:val="000000"/>
                 <w:sz w:val="19"/>
               </w:rPr>
-              <w:t>Наблюдаемый результат</w:t>
+              <w:t>Фактический результат</w:t>
             </w:r>
           </w:p>
         </w:tc>
@@ -2413,7 +2029,7 @@
         </w:trPr>
         <w:tc>
           <w:tcPr>
-            <w:tcW w:type="dxa" w:w="3515"/>
+            <w:tcW w:type="dxa" w:w="4535"/>
             <w:vAlign w:val="center"/>
             <w:tcMar>
               <w:top w:w="75" w:type="dxa"/>
@@ -2421,12 +2037,6 @@
               <w:left w:w="95" w:type="dxa"/>
               <w:right w:w="95" w:type="dxa"/>
             </w:tcMar>
-            <w:tcBorders>
-              <w:top w:val="single" w:sz="4" w:color="D9D9D9"/>
-              <w:left w:val="single" w:sz="4" w:color="D9D9D9"/>
-              <w:bottom w:val="single" w:sz="4" w:color="D9D9D9"/>
-              <w:right w:val="single" w:sz="4" w:color="D9D9D9"/>
-            </w:tcBorders>
           </w:tcPr>
           <w:p>
             <w:pPr>
@@ -2437,13 +2047,13 @@
                 <w:rFonts w:ascii="Arial" w:hAnsi="Arial"/>
                 <w:sz w:val="19"/>
               </w:rPr>
-              <w:t>Host UnitTest</w:t>
+              <w:t>Host</w:t>
             </w:r>
           </w:p>
         </w:tc>
         <w:tc>
           <w:tcPr>
-            <w:tcW w:type="dxa" w:w="6123"/>
+            <w:tcW w:type="dxa" w:w="5102"/>
             <w:vAlign w:val="center"/>
             <w:tcMar>
               <w:top w:w="75" w:type="dxa"/>
@@ -2451,12 +2061,6 @@
               <w:left w:w="95" w:type="dxa"/>
               <w:right w:w="95" w:type="dxa"/>
             </w:tcMar>
-            <w:tcBorders>
-              <w:top w:val="single" w:sz="4" w:color="D9D9D9"/>
-              <w:left w:val="single" w:sz="4" w:color="D9D9D9"/>
-              <w:bottom w:val="single" w:sz="4" w:color="D9D9D9"/>
-              <w:right w:val="single" w:sz="4" w:color="D9D9D9"/>
-            </w:tcBorders>
           </w:tcPr>
           <w:p>
             <w:pPr>
@@ -2467,7 +2071,7 @@
                 <w:rFonts w:ascii="Arial" w:hAnsi="Arial"/>
                 <w:sz w:val="19"/>
               </w:rPr>
-              <w:t>183 проверок, ошибок 0</w:t>
+              <w:t>180 условий, 0 ошибок</w:t>
             </w:r>
           </w:p>
         </w:tc>
@@ -2478,7 +2082,7 @@
         </w:trPr>
         <w:tc>
           <w:tcPr>
-            <w:tcW w:type="dxa" w:w="3515"/>
+            <w:tcW w:type="dxa" w:w="4535"/>
             <w:vAlign w:val="center"/>
             <w:tcMar>
               <w:top w:w="75" w:type="dxa"/>
@@ -2486,13 +2090,7 @@
               <w:left w:w="95" w:type="dxa"/>
               <w:right w:w="95" w:type="dxa"/>
             </w:tcMar>
-            <w:shd w:fill="F1F5F8"/>
-            <w:tcBorders>
-              <w:top w:val="single" w:sz="4" w:color="D9D9D9"/>
-              <w:left w:val="single" w:sz="4" w:color="D9D9D9"/>
-              <w:bottom w:val="single" w:sz="4" w:color="D9D9D9"/>
-              <w:right w:val="single" w:sz="4" w:color="D9D9D9"/>
-            </w:tcBorders>
+            <w:shd w:fill="F7F7F7"/>
           </w:tcPr>
           <w:p>
             <w:pPr>
@@ -2503,13 +2101,13 @@
                 <w:rFonts w:ascii="Arial" w:hAnsi="Arial"/>
                 <w:sz w:val="19"/>
               </w:rPr>
-              <w:t>Eco integration</w:t>
+              <w:t>Eco с A / с C</w:t>
             </w:r>
           </w:p>
         </w:tc>
         <w:tc>
           <w:tcPr>
-            <w:tcW w:type="dxa" w:w="6123"/>
+            <w:tcW w:type="dxa" w:w="5102"/>
             <w:vAlign w:val="center"/>
             <w:tcMar>
               <w:top w:w="75" w:type="dxa"/>
@@ -2517,13 +2115,7 @@
               <w:left w:w="95" w:type="dxa"/>
               <w:right w:w="95" w:type="dxa"/>
             </w:tcMar>
-            <w:shd w:fill="F1F5F8"/>
-            <w:tcBorders>
-              <w:top w:val="single" w:sz="4" w:color="D9D9D9"/>
-              <w:left w:val="single" w:sz="4" w:color="D9D9D9"/>
-              <w:bottom w:val="single" w:sz="4" w:color="D9D9D9"/>
-              <w:right w:val="single" w:sz="4" w:color="D9D9D9"/>
-            </w:tcBorders>
+            <w:shd w:fill="F7F7F7"/>
           </w:tcPr>
           <w:p>
             <w:pPr>
@@ -2534,7 +2126,7 @@
                 <w:rFonts w:ascii="Arial" w:hAnsi="Arial"/>
                 <w:sz w:val="19"/>
               </w:rPr>
-              <w:t>977 проверки, ошибок 0</w:t>
+              <w:t>1062 / 1110 условий, 0 ошибок</w:t>
             </w:r>
           </w:p>
         </w:tc>
@@ -2545,7 +2137,7 @@
         </w:trPr>
         <w:tc>
           <w:tcPr>
-            <w:tcW w:type="dxa" w:w="3515"/>
+            <w:tcW w:type="dxa" w:w="4535"/>
             <w:vAlign w:val="center"/>
             <w:tcMar>
               <w:top w:w="75" w:type="dxa"/>
@@ -2553,12 +2145,6 @@
               <w:left w:w="95" w:type="dxa"/>
               <w:right w:w="95" w:type="dxa"/>
             </w:tcMar>
-            <w:tcBorders>
-              <w:top w:val="single" w:sz="4" w:color="D9D9D9"/>
-              <w:left w:val="single" w:sz="4" w:color="D9D9D9"/>
-              <w:bottom w:val="single" w:sz="4" w:color="D9D9D9"/>
-              <w:right w:val="single" w:sz="4" w:color="D9D9D9"/>
-            </w:tcBorders>
           </w:tcPr>
           <w:p>
             <w:pPr>
@@ -2569,13 +2155,13 @@
                 <w:rFonts w:ascii="Arial" w:hAnsi="Arial"/>
                 <w:sz w:val="19"/>
               </w:rPr>
-              <w:t>Баланс памяти Eco</w:t>
+              <w:t>Allocator в каждом Eco-варианте</w:t>
             </w:r>
           </w:p>
         </w:tc>
         <w:tc>
           <w:tcPr>
-            <w:tcW w:type="dxa" w:w="6123"/>
+            <w:tcW w:type="dxa" w:w="5102"/>
             <w:vAlign w:val="center"/>
             <w:tcMar>
               <w:top w:w="75" w:type="dxa"/>
@@ -2583,12 +2169,6 @@
               <w:left w:w="95" w:type="dxa"/>
               <w:right w:w="95" w:type="dxa"/>
             </w:tcMar>
-            <w:tcBorders>
-              <w:top w:val="single" w:sz="4" w:color="D9D9D9"/>
-              <w:left w:val="single" w:sz="4" w:color="D9D9D9"/>
-              <w:bottom w:val="single" w:sz="4" w:color="D9D9D9"/>
-              <w:right w:val="single" w:sz="4" w:color="D9D9D9"/>
-            </w:tcBorders>
           </w:tcPr>
           <w:p>
             <w:pPr>
@@ -2599,7 +2179,7 @@
                 <w:rFonts w:ascii="Arial" w:hAnsi="Arial"/>
                 <w:sz w:val="19"/>
               </w:rPr>
-              <w:t>Выделено 345; освобождено 345; живых блоков 0</w:t>
+              <w:t>267 выделений, 267 освобождений, live = 0</w:t>
             </w:r>
           </w:p>
         </w:tc>
@@ -2610,7 +2190,7 @@
         </w:trPr>
         <w:tc>
           <w:tcPr>
-            <w:tcW w:type="dxa" w:w="3515"/>
+            <w:tcW w:type="dxa" w:w="4535"/>
             <w:vAlign w:val="center"/>
             <w:tcMar>
               <w:top w:w="75" w:type="dxa"/>
@@ -2618,13 +2198,7 @@
               <w:left w:w="95" w:type="dxa"/>
               <w:right w:w="95" w:type="dxa"/>
             </w:tcMar>
-            <w:shd w:fill="F1F5F8"/>
-            <w:tcBorders>
-              <w:top w:val="single" w:sz="4" w:color="D9D9D9"/>
-              <w:left w:val="single" w:sz="4" w:color="D9D9D9"/>
-              <w:bottom w:val="single" w:sz="4" w:color="D9D9D9"/>
-              <w:right w:val="single" w:sz="4" w:color="D9D9D9"/>
-            </w:tcBorders>
+            <w:shd w:fill="F7F7F7"/>
           </w:tcPr>
           <w:p>
             <w:pPr>
@@ -2635,13 +2209,13 @@
                 <w:rFonts w:ascii="Arial" w:hAnsi="Arial"/>
                 <w:sz w:val="19"/>
               </w:rPr>
-              <w:t>Dynamic Debug</w:t>
+              <w:t>Независимый клиент Debug и Release</w:t>
             </w:r>
           </w:p>
         </w:tc>
         <w:tc>
           <w:tcPr>
-            <w:tcW w:type="dxa" w:w="6123"/>
+            <w:tcW w:type="dxa" w:w="5102"/>
             <w:vAlign w:val="center"/>
             <w:tcMar>
               <w:top w:w="75" w:type="dxa"/>
@@ -2649,13 +2223,7 @@
               <w:left w:w="95" w:type="dxa"/>
               <w:right w:w="95" w:type="dxa"/>
             </w:tcMar>
-            <w:shd w:fill="F1F5F8"/>
-            <w:tcBorders>
-              <w:top w:val="single" w:sz="4" w:color="D9D9D9"/>
-              <w:left w:val="single" w:sz="4" w:color="D9D9D9"/>
-              <w:bottom w:val="single" w:sz="4" w:color="D9D9D9"/>
-              <w:right w:val="single" w:sz="4" w:color="D9D9D9"/>
-            </w:tcBorders>
+            <w:shd w:fill="F7F7F7"/>
           </w:tcPr>
           <w:p>
             <w:pPr>
@@ -2666,7 +2234,7 @@
                 <w:rFonts w:ascii="Arial" w:hAnsi="Arial"/>
                 <w:sz w:val="19"/>
               </w:rPr>
-              <w:t>44 проверки, ошибок 0; загружены все 8 CID</w:t>
+              <w:t>A: 523 / 0; C: 559 / 0</w:t>
             </w:r>
           </w:p>
         </w:tc>
@@ -2677,7 +2245,7 @@
         </w:trPr>
         <w:tc>
           <w:tcPr>
-            <w:tcW w:type="dxa" w:w="3515"/>
+            <w:tcW w:type="dxa" w:w="4535"/>
             <w:vAlign w:val="center"/>
             <w:tcMar>
               <w:top w:w="75" w:type="dxa"/>
@@ -2685,12 +2253,6 @@
               <w:left w:w="95" w:type="dxa"/>
               <w:right w:w="95" w:type="dxa"/>
             </w:tcMar>
-            <w:tcBorders>
-              <w:top w:val="single" w:sz="4" w:color="D9D9D9"/>
-              <w:left w:val="single" w:sz="4" w:color="D9D9D9"/>
-              <w:bottom w:val="single" w:sz="4" w:color="D9D9D9"/>
-              <w:right w:val="single" w:sz="4" w:color="D9D9D9"/>
-            </w:tcBorders>
           </w:tcPr>
           <w:p>
             <w:pPr>
@@ -2701,13 +2263,13 @@
                 <w:rFonts w:ascii="Arial" w:hAnsi="Arial"/>
                 <w:sz w:val="19"/>
               </w:rPr>
-              <w:t>Dynamic Release</w:t>
+              <w:t>Dynamic Debug/Release × A/C</w:t>
             </w:r>
           </w:p>
         </w:tc>
         <w:tc>
           <w:tcPr>
-            <w:tcW w:type="dxa" w:w="6123"/>
+            <w:tcW w:type="dxa" w:w="5102"/>
             <w:vAlign w:val="center"/>
             <w:tcMar>
               <w:top w:w="75" w:type="dxa"/>
@@ -2715,12 +2277,6 @@
               <w:left w:w="95" w:type="dxa"/>
               <w:right w:w="95" w:type="dxa"/>
             </w:tcMar>
-            <w:tcBorders>
-              <w:top w:val="single" w:sz="4" w:color="D9D9D9"/>
-              <w:left w:val="single" w:sz="4" w:color="D9D9D9"/>
-              <w:bottom w:val="single" w:sz="4" w:color="D9D9D9"/>
-              <w:right w:val="single" w:sz="4" w:color="D9D9D9"/>
-            </w:tcBorders>
           </w:tcPr>
           <w:p>
             <w:pPr>
@@ -2731,7 +2287,7 @@
                 <w:rFonts w:ascii="Arial" w:hAnsi="Arial"/>
                 <w:sz w:val="19"/>
               </w:rPr>
-              <w:t>44 проверки, ошибок 0; загружены все 8 CID</w:t>
+              <w:t>Все 4 запуска: A 523 / 0, C 559 / 0</w:t>
             </w:r>
           </w:p>
         </w:tc>
@@ -2742,7 +2298,7 @@
         </w:trPr>
         <w:tc>
           <w:tcPr>
-            <w:tcW w:type="dxa" w:w="3515"/>
+            <w:tcW w:type="dxa" w:w="4535"/>
             <w:vAlign w:val="center"/>
             <w:tcMar>
               <w:top w:w="75" w:type="dxa"/>
@@ -2750,13 +2306,7 @@
               <w:left w:w="95" w:type="dxa"/>
               <w:right w:w="95" w:type="dxa"/>
             </w:tcMar>
-            <w:shd w:fill="F1F5F8"/>
-            <w:tcBorders>
-              <w:top w:val="single" w:sz="4" w:color="D9D9D9"/>
-              <w:left w:val="single" w:sz="4" w:color="D9D9D9"/>
-              <w:bottom w:val="single" w:sz="4" w:color="D9D9D9"/>
-              <w:right w:val="single" w:sz="4" w:color="D9D9D9"/>
-            </w:tcBorders>
+            <w:shd w:fill="F7F7F7"/>
           </w:tcPr>
           <w:p>
             <w:pPr>
@@ -2767,13 +2317,13 @@
                 <w:rFonts w:ascii="Arial" w:hAnsi="Arial"/>
                 <w:sz w:val="19"/>
               </w:rPr>
-              <w:t>Пустой Dynamic runtime</w:t>
+              <w:t>Xcode Static Debug и Release</w:t>
             </w:r>
           </w:p>
         </w:tc>
         <w:tc>
           <w:tcPr>
-            <w:tcW w:type="dxa" w:w="6123"/>
+            <w:tcW w:type="dxa" w:w="5102"/>
             <w:vAlign w:val="center"/>
             <w:tcMar>
               <w:top w:w="75" w:type="dxa"/>
@@ -2781,13 +2331,7 @@
               <w:left w:w="95" w:type="dxa"/>
               <w:right w:w="95" w:type="dxa"/>
             </w:tcMar>
-            <w:shd w:fill="F1F5F8"/>
-            <w:tcBorders>
-              <w:top w:val="single" w:sz="4" w:color="D9D9D9"/>
-              <w:left w:val="single" w:sz="4" w:color="D9D9D9"/>
-              <w:bottom w:val="single" w:sz="4" w:color="D9D9D9"/>
-              <w:right w:val="single" w:sz="4" w:color="D9D9D9"/>
-            </w:tcBorders>
+            <w:shd w:fill="F7F7F7"/>
           </w:tcPr>
           <w:p>
             <w:pPr>
@@ -2798,7 +2342,7 @@
                 <w:rFonts w:ascii="Arial" w:hAnsi="Arial"/>
                 <w:sz w:val="19"/>
               </w:rPr>
-              <w:t>Отдельный процесс завершился с ненулевым кодом</w:t>
+              <w:t>Компонент и UnitTest собраны; запуск: 1062 / 0</w:t>
             </w:r>
           </w:p>
         </w:tc>
@@ -2809,7 +2353,7 @@
         </w:trPr>
         <w:tc>
           <w:tcPr>
-            <w:tcW w:type="dxa" w:w="3515"/>
+            <w:tcW w:type="dxa" w:w="4535"/>
             <w:vAlign w:val="center"/>
             <w:tcMar>
               <w:top w:w="75" w:type="dxa"/>
@@ -2817,12 +2361,6 @@
               <w:left w:w="95" w:type="dxa"/>
               <w:right w:w="95" w:type="dxa"/>
             </w:tcMar>
-            <w:tcBorders>
-              <w:top w:val="single" w:sz="4" w:color="D9D9D9"/>
-              <w:left w:val="single" w:sz="4" w:color="D9D9D9"/>
-              <w:bottom w:val="single" w:sz="4" w:color="D9D9D9"/>
-              <w:right w:val="single" w:sz="4" w:color="D9D9D9"/>
-            </w:tcBorders>
           </w:tcPr>
           <w:p>
             <w:pPr>
@@ -2833,13 +2371,13 @@
                 <w:rFonts w:ascii="Arial" w:hAnsi="Arial"/>
                 <w:sz w:val="19"/>
               </w:rPr>
-              <w:t>C89 / отсутствие libc / ASan и UBSan</w:t>
+              <w:t>C89, libc, ASan/UBSan</w:t>
             </w:r>
           </w:p>
         </w:tc>
         <w:tc>
           <w:tcPr>
-            <w:tcW w:type="dxa" w:w="6123"/>
+            <w:tcW w:type="dxa" w:w="5102"/>
             <w:vAlign w:val="center"/>
             <w:tcMar>
               <w:top w:w="75" w:type="dxa"/>
@@ -2847,12 +2385,6 @@
               <w:left w:w="95" w:type="dxa"/>
               <w:right w:w="95" w:type="dxa"/>
             </w:tcMar>
-            <w:tcBorders>
-              <w:top w:val="single" w:sz="4" w:color="D9D9D9"/>
-              <w:left w:val="single" w:sz="4" w:color="D9D9D9"/>
-              <w:bottom w:val="single" w:sz="4" w:color="D9D9D9"/>
-              <w:right w:val="single" w:sz="4" w:color="D9D9D9"/>
-            </w:tcBorders>
           </w:tcPr>
           <w:p>
             <w:pPr>
@@ -2863,7 +2395,115 @@
                 <w:rFonts w:ascii="Arial" w:hAnsi="Arial"/>
                 <w:sz w:val="19"/>
               </w:rPr>
-              <w:t>Контрольные команды завершились успешно</w:t>
+              <w:t>Проверки пройдены, диагностик sanitizer нет</w:t>
+            </w:r>
+          </w:p>
+        </w:tc>
+      </w:tr>
+      <w:tr>
+        <w:trPr>
+          <w:cantSplit/>
+        </w:trPr>
+        <w:tc>
+          <w:tcPr>
+            <w:tcW w:type="dxa" w:w="4535"/>
+            <w:vAlign w:val="center"/>
+            <w:tcMar>
+              <w:top w:w="75" w:type="dxa"/>
+              <w:bottom w:w="75" w:type="dxa"/>
+              <w:left w:w="95" w:type="dxa"/>
+              <w:right w:w="95" w:type="dxa"/>
+            </w:tcMar>
+            <w:shd w:fill="F7F7F7"/>
+          </w:tcPr>
+          <w:p>
+            <w:pPr>
+              <w:spacing w:after="20" w:before="20" w:line="247" w:lineRule="auto"/>
+            </w:pPr>
+            <w:r>
+              <w:rPr>
+                <w:rFonts w:ascii="Arial" w:hAnsi="Arial"/>
+                <w:sz w:val="19"/>
+              </w:rPr>
+              <w:t>Отрицательные мутации и сборочные зависимости</w:t>
+            </w:r>
+          </w:p>
+        </w:tc>
+        <w:tc>
+          <w:tcPr>
+            <w:tcW w:type="dxa" w:w="5102"/>
+            <w:vAlign w:val="center"/>
+            <w:tcMar>
+              <w:top w:w="75" w:type="dxa"/>
+              <w:bottom w:w="75" w:type="dxa"/>
+              <w:left w:w="95" w:type="dxa"/>
+              <w:right w:w="95" w:type="dxa"/>
+            </w:tcMar>
+            <w:shd w:fill="F7F7F7"/>
+          </w:tcPr>
+          <w:p>
+            <w:pPr>
+              <w:spacing w:after="20" w:before="20" w:line="247" w:lineRule="auto"/>
+            </w:pPr>
+            <w:r>
+              <w:rPr>
+                <w:rFonts w:ascii="Arial" w:hAnsi="Arial"/>
+                <w:sz w:val="19"/>
+              </w:rPr>
+              <w:t>Ошибочная операция и abort() обнаружены</w:t>
+            </w:r>
+          </w:p>
+        </w:tc>
+      </w:tr>
+      <w:tr>
+        <w:trPr>
+          <w:cantSplit/>
+        </w:trPr>
+        <w:tc>
+          <w:tcPr>
+            <w:tcW w:type="dxa" w:w="4535"/>
+            <w:vAlign w:val="center"/>
+            <w:tcMar>
+              <w:top w:w="75" w:type="dxa"/>
+              <w:bottom w:w="75" w:type="dxa"/>
+              <w:left w:w="95" w:type="dxa"/>
+              <w:right w:w="95" w:type="dxa"/>
+            </w:tcMar>
+          </w:tcPr>
+          <w:p>
+            <w:pPr>
+              <w:spacing w:after="20" w:before="20" w:line="247" w:lineRule="auto"/>
+            </w:pPr>
+            <w:r>
+              <w:rPr>
+                <w:rFonts w:ascii="Arial" w:hAnsi="Arial"/>
+                <w:sz w:val="19"/>
+              </w:rPr>
+              <w:t>Валидатор численных эталонов</w:t>
+            </w:r>
+          </w:p>
+        </w:tc>
+        <w:tc>
+          <w:tcPr>
+            <w:tcW w:type="dxa" w:w="5102"/>
+            <w:vAlign w:val="center"/>
+            <w:tcMar>
+              <w:top w:w="75" w:type="dxa"/>
+              <w:bottom w:w="75" w:type="dxa"/>
+              <w:left w:w="95" w:type="dxa"/>
+              <w:right w:w="95" w:type="dxa"/>
+            </w:tcMar>
+          </w:tcPr>
+          <w:p>
+            <w:pPr>
+              <w:spacing w:after="20" w:before="20" w:line="247" w:lineRule="auto"/>
+            </w:pPr>
+            <w:r>
+              <w:rPr>
+                <w:rFonts w:ascii="Arial" w:hAnsi="Arial"/>
+                <w:sz w:val="19"/>
+              </w:rPr>
+              <w:t>8 проверок пройдены</w:t>
             </w:r>
           </w:p>
         </w:tc>
@@ -2880,7 +2520,7 @@
         <w:widowControl/>
       </w:pPr>
       <w:r>
-        <w:t>Счётчик обозначает проверенные условия, а не независимые тестовые сценарии или процент покрытия. Число проверок отказов может зависеть от внутреннего количества выделений Framework. Отдельный контракт обязательных сценариев контролирует их выполнение.</w:t>
+        <w:t>Счётчики отражают количество условий, а не процент покрытия. Тесты возвращают ненулевой код при ошибке или неполном плане. Полные логи сохранены в DesignFiles/Review/Verification_2026-10-28.</w:t>
       </w:r>
     </w:p>
     <w:p>
@@ -2888,46 +2528,7 @@
         <w:pStyle w:val="Heading2"/>
       </w:pPr>
       <w:r>
-        <w:rPr>
-          <w:color w:val="000000"/>
-        </w:rPr>
-        <w:t>Состав интеграционных сценариев</w:t>
-      </w:r>
-    </w:p>
-    <w:p>
-      <w:pPr>
-        <w:pStyle w:val="ListBullet"/>
-        <w:widowControl/>
-      </w:pPr>
-      <w:r>
-        <w:t>Восемь CID: матрицы QI, self-query, unknown, переходы в обе стороны, неизвестный IID и единая identity; отдельно C.X/C.Y и Lab2→Lab1→Lab2.</w:t>
-      </w:r>
-    </w:p>
-    <w:p>
-      <w:pPr>
-        <w:pStyle w:val="ListBullet"/>
-        <w:widowControl/>
-      </w:pPr>
-      <w:r>
-        <w:t>Восемь фабрик и восемь групп отказов allocator; для каждого ошибочного создания проверяются выходы, возврат счётчиков ссылок и живых блоков к исходному уровню.</w:t>
-      </w:r>
-    </w:p>
-    <w:p>
-      <w:pPr>
-        <w:pStyle w:val="ListBullet"/>
-        <w:widowControl/>
-      </w:pPr>
-      <w:r>
-        <w:t>Шесть сценариев отсутствующих зависимостей, два сценария сохранения интерфейса после Release корня и три численных пути: normal, QR, facade Lab2.</w:t>
-      </w:r>
-    </w:p>
-    <w:p>
-      <w:pPr>
-        <w:pStyle w:val="ListBullet"/>
-        <w:widowControl/>
-      </w:pPr>
-      <w:r>
-        <w:t>Положительные, отрицательные, дробные и нулевые аргументы; NULL, деление на ноль; обе реализации polyfit и объект результата.</w:t>
+        <w:t>Проверенные сценарии</w:t>
       </w:r>
     </w:p>
     <w:p>
@@ -2935,7 +2536,23 @@
         <w:widowControl/>
       </w:pPr>
       <w:r>
-        <w:t>AddressSanitizer и UndefinedBehaviorSanitizer запускаются для Host и реального Eco-клиента. LeakSanitizer на Darwin недоступен; поэтому отсутствие оставшихся блоков дополнительно подтверждается явным балансом allocator.</w:t>
+        <w:t>Для семи уникальных CID в каждом A/C-варианте выполнены матрицы QI, identity, счётчики ссылок и реальные операции. Отдельно проверены восемь фабрик, семь групп отказов Alloc, четыре случая отсутствующих зависимостей и два резервных пути. Агрегированные интерфейсы проверены после раннего освобождения корня.</w:t>
+      </w:r>
+    </w:p>
+    <w:p>
+      <w:pPr>
+        <w:widowControl/>
+      </w:pPr>
+      <w:r>
+        <w:t>Публичный клиент проверяет полином Horner в восьми точках по независимому арифметическому эталону, границы int16/int32, NULL и ошибочные размеры. Polyfit проверяется через Lab1, QR и Lab2; существующие численные тесты ЛР1 сохранены.</w:t>
+      </w:r>
+    </w:p>
+    <w:p>
+      <w:pPr>
+        <w:widowControl/>
+      </w:pPr>
+      <w:r>
+        <w:t>Мутации выполняются в временной копии проекта: неправильная реальная арифметика заставляет UnitTest завершиться ошибкой; добавленный abort() обнаруживается через nm. Изменение заголовков/флагов запускает пересборку, неверный путь Framework отклоняется.</w:t>
       </w:r>
     </w:p>
     <w:p>
@@ -2948,10 +2565,7 @@
         <w:pStyle w:val="Heading1"/>
       </w:pPr>
       <w:r>
-        <w:rPr>
-          <w:color w:val="000000"/>
-        </w:rPr>
-        <w:t>6 Сборка и настоящий Dynamic runtime</w:t>
+        <w:t>6 Сборка и независимый клиент</w:t>
       </w:r>
     </w:p>
     <w:p>
@@ -2959,7 +2573,7 @@
         <w:widowControl/>
       </w:pPr>
       <w:r>
-        <w:t>Окружение: macOS arm64, Xcode и официальный Eco.Framework из /Users/danial2006/Downloads/Eco.Framework. Команды запускаются из корня проекта. Сначала задаётся переменная окружения:</w:t>
+        <w:t>Среда проверки — macOS arm64, Xcode и распакованный официальный Eco.Framework. Команды выполняются из корня репозитория последовательно. Путь Framework должен указывать на существующий каталог.</w:t>
       </w:r>
     </w:p>
     <w:p>
@@ -2974,11 +2588,15 @@
           <w:rFonts w:ascii="Courier New" w:hAnsi="Courier New"/>
           <w:sz w:val="17"/>
         </w:rPr>
-        <w:t>export ECO_FRAMEWORK="/Users/danial2006/Downloads/Eco.Framework"</w:t>
+        <w:t>export ECO_FRAMEWORK="$HOME/Downloads/Eco.Framework"</w:t>
         <w:br/>
         <w:t>make ECO_FRAMEWORK="$ECO_FRAMEWORK" check</w:t>
         <w:br/>
-        <w:t>make ECO_FRAMEWORK="$ECO_FRAMEWORK" eco-test</w:t>
+        <w:t>make ECO_FRAMEWORK="$ECO_FRAMEWORK" eco-test-variants</w:t>
+        <w:br/>
+        <w:t>CONFIGURATION=Release make ECO_FRAMEWORK="$ECO_FRAMEWORK" component-clients</w:t>
+        <w:br/>
+        <w:t>make ECO_FRAMEWORK="$ECO_FRAMEWORK" validation-build</w:t>
       </w:r>
     </w:p>
     <w:p>
@@ -2986,7 +2604,56 @@
         <w:widowControl/>
       </w:pPr>
       <w:r>
-        <w:t>Static-компонент и консольный UnitTest собраны в Debug и Release. Сборка клиента отдельно от его запуска; выполненные клиентские процессы дали результат из таблицы проверок.</w:t>
+        <w:t>check запускает Host, C89, проверку libc, ASan/UBSan для Host и Eco в обоих вариантах, валидатор эталонов и отдельный клиент Debug. eco-test-variants отдельно запускает обычную Eco-интеграцию для A/C.</w:t>
+      </w:r>
+    </w:p>
+    <w:p>
+      <w:pPr>
+        <w:pStyle w:val="Heading2"/>
+      </w:pPr>
+      <w:r>
+        <w:t>Архивы и общий клиент</w:t>
+      </w:r>
+    </w:p>
+    <w:p>
+      <w:pPr>
+        <w:widowControl/>
+      </w:pPr>
+      <w:r>
+        <w:t>build_component_clients.py создаёт восемь отдельных архивов: A, B, C, D, E, Lab1, Lab1QR и Lab2. Компиляция Lab2Client.c использует ExternalContracts, SharedFiles и официальные заголовки Framework; закрытый HeaderFiles и C-файлы серверов исключены. Один Lab2Client.o линкуется с семью архивами: сначала A, затем C. SHA256 объекта после обоих запусков совпадает.</w:t>
+      </w:r>
+    </w:p>
+    <w:p>
+      <w:pPr>
+        <w:keepLines/>
+        <w:widowControl/>
+        <w:spacing w:after="160" w:line="252" w:lineRule="auto"/>
+        <w:shd w:fill="F2F5F7"/>
+      </w:pPr>
+      <w:r>
+        <w:rPr>
+          <w:rFonts w:ascii="Courier New" w:hAnsi="Courier New"/>
+          <w:sz w:val="17"/>
+        </w:rPr>
+        <w:t>ECO_EXPECT_CALCULATOR=A BuildFiles/Components/Debug/EcoLab2ClientA</w:t>
+        <w:br/>
+        <w:t>ECO_EXPECT_CALCULATOR=C BuildFiles/Components/Debug/EcoLab2ClientC</w:t>
+      </w:r>
+    </w:p>
+    <w:p>
+      <w:pPr>
+        <w:pStyle w:val="Heading2"/>
+      </w:pPr>
+      <w:r>
+        <w:t>Xcode Static</w:t>
+      </w:r>
+    </w:p>
+    <w:p>
+      <w:pPr>
+        <w:widowControl/>
+      </w:pPr>
+      <w:r>
+        <w:t>Схема Static компонента оставлена общим архивом ради совместимости проекта ЛР1. Отдельные архивы поставки проверяются предыдущим скриптом. Оба Xcode-проекта собираются в Debug/Release; после сборки UnitTest нужно запустить.</w:t>
       </w:r>
     </w:p>
     <w:p>
@@ -3007,7 +2674,7 @@
         <w:br/>
         <w:t xml:space="preserve">    -scheme Static -configuration "$configuration" -jobs 1 \</w:t>
         <w:br/>
-        <w:t xml:space="preserve">    -derivedDataPath "BuildFiles/XcodeComponentStatic$configuration" \</w:t>
+        <w:t xml:space="preserve">    -derivedDataPath "BuildFiles/XcodeStandardABI/Component$configuration" \</w:t>
         <w:br/>
         <w:t xml:space="preserve">    ECO_FRAMEWORK="$ECO_FRAMEWORK" CODE_SIGNING_ALLOWED=NO build</w:t>
         <w:br/>
@@ -3015,22 +2682,34 @@
         <w:br/>
         <w:t xml:space="preserve">    -scheme Static -configuration "$configuration" -jobs 1 \</w:t>
         <w:br/>
-        <w:t xml:space="preserve">    -derivedDataPath "BuildFiles/XcodeUnit$configuration" \</w:t>
+        <w:t xml:space="preserve">    -derivedDataPath "BuildFiles/XcodeStandardABI/Unit$configuration" \</w:t>
         <w:br/>
         <w:t xml:space="preserve">    ECO_FRAMEWORK="$ECO_FRAMEWORK" CODE_SIGNING_ALLOWED=NO build</w:t>
+        <w:br/>
+        <w:t xml:space="preserve">  "BuildFiles/XcodeStandardABI/Unit$configuration/Build/Products/$configuration/Static"</w:t>
         <w:br/>
         <w:t>done</w:t>
       </w:r>
     </w:p>
     <w:p>
       <w:pPr>
-        <w:pStyle w:val="Heading2"/>
+        <w:widowControl/>
       </w:pPr>
       <w:r>
-        <w:rPr>
-          <w:color w:val="000000"/>
-        </w:rPr>
-        <w:t>Восемь отдельных динамических фабрик</w:t>
+        <w:t>Нельзя запускать параллельные сборки в один derivedDataPath: это блокирует build.db. Сборки текущего прогона использовали отдельные каталоги для проекта и конфигурации.</w:t>
+      </w:r>
+    </w:p>
+    <w:p>
+      <w:r>
+        <w:br w:type="page"/>
+      </w:r>
+    </w:p>
+    <w:p>
+      <w:pPr>
+        <w:pStyle w:val="Heading1"/>
+      </w:pPr>
+      <w:r>
+        <w:t>7 Dynamic runtime и ограничения</w:t>
       </w:r>
     </w:p>
     <w:p>
@@ -3045,13 +2724,19 @@
           <w:rFonts w:ascii="Courier New" w:hAnsi="Courier New"/>
           <w:sz w:val="17"/>
         </w:rPr>
-        <w:t>ECO_FRAMEWORK="$ECO_FRAMEWORK" CONFIGURATION=Release \</w:t>
+        <w:t>for configuration in Debug Release; do</w:t>
         <w:br/>
-        <w:t xml:space="preserve">  DesignFiles/Report/build_dynamic_runtime_macos.sh</w:t>
+        <w:t xml:space="preserve">  for variant in A C; do</w:t>
         <w:br/>
-        <w:t>ECO_FRAMEWORK="$ECO_FRAMEWORK" CONFIGURATION=Debug \</w:t>
+        <w:t xml:space="preserve">    ECO_FRAMEWORK="$ECO_FRAMEWORK" CONFIGURATION="$configuration" \</w:t>
         <w:br/>
-        <w:t xml:space="preserve">  DesignFiles/Report/build_dynamic_runtime_macos.sh</w:t>
+        <w:t xml:space="preserve">      CALCULATOR_VARIANT="$variant" \</w:t>
+        <w:br/>
+        <w:t xml:space="preserve">      DesignFiles/Report/build_dynamic_runtime_macos.sh || break 2</w:t>
+        <w:br/>
+        <w:t xml:space="preserve">  done</w:t>
+        <w:br/>
+        <w:t>done</w:t>
       </w:r>
     </w:p>
     <w:p>
@@ -3059,7 +2744,7 @@
         <w:widowControl/>
       </w:pPr>
       <w:r>
-        <w:t>Скрипт собирает восемь dylib, названных реальными CID без дефисов. Селекторы фабрики: normal, POLYFIT_QR_ONLY, ECO_CALCULATOR_KIND=0..4 и ECO_LAB2_ONLY. Отдельный runtime-клиент линкует только официальные system/bus/memory/filesystem-библиотеки, без лабораторных исходников или статической лабораторной библиотеки.</w:t>
+        <w:t>На каждый запуск создаётся семь CID-named dylib: A либо C, B, D, E, Lab1 normal, Lab1 QR и Lab2. A/C имеют одно имя файла и размещаются в разных runtime-каталогах. Отдельный Dynamic-клиент использует те же публичные тесты, но линкует только Framework и не регистрирует лабораторные фабрики.</w:t>
       </w:r>
     </w:p>
     <w:p>
@@ -3067,7 +2752,15 @@
         <w:widowControl/>
       </w:pPr>
       <w:r>
-        <w:t>Клиент вызывает QueryComponent, а официальный загрузчик ищет файлы в ECO_FRAMEWORK_RT. Статическая регистрация лабораторных фабрик отсутствует. DYLD_PRINT_LIBRARIES подтверждает загрузку всех восьми файлов. В свежем процессе с пустым runtime тест завершается ошибкой. Для каждой dylib проверены nm -u и otool -L.</w:t>
+        <w:t>Официальный загрузчик получает библиотеки через ECO_FRAMEWORK_RT. DYLD trace подтверждает загрузку всех семи. Дополнительный процесс с пустым runtime обязан завершиться ошибкой. Для каждой dylib проверены nm -u и otool -L. Логи: BuildFiles/DynamicRuntimeLogs/&lt;Debug|Release&gt;/&lt;A|C&gt;.</w:t>
+      </w:r>
+    </w:p>
+    <w:p>
+      <w:pPr>
+        <w:pStyle w:val="Heading2"/>
+      </w:pPr>
+      <w:r>
+        <w:t>Численные эталоны ЛР1</w:t>
       </w:r>
     </w:p>
     <w:p>
@@ -3075,23 +2768,15 @@
         <w:widowControl/>
       </w:pPr>
       <w:r>
-        <w:t>Артефакты: BuildFiles/DynamicRuntime/{Debug,Release}. Полные логи Xcode, загрузчика, зависимостей и запуска: BuildFiles/DynamicRuntimeLogs/{Debug,Release}. Каждый CID использует отдельный derivedDataPath.</w:t>
-      </w:r>
-    </w:p>
-    <w:p>
-      <w:r>
-        <w:br w:type="page"/>
+        <w:t>Сохранённые прогоны от 25 октября 2026 сравнили 36 массивов коэффициентов SciPy/NumPy и 18 массивов MATLAB R2026b для девяти наборов и обоих алгоритмов. При текущей правке внешние MATLAB/SciPy не перезапускались; регрессионные Host/Eco-тесты выполнены заново. Повторные команды: make PYTHON=/opt/anaconda3/bin/python reference и matlab-reference.</w:t>
       </w:r>
     </w:p>
     <w:p>
       <w:pPr>
-        <w:pStyle w:val="Heading1"/>
+        <w:pStyle w:val="Heading2"/>
       </w:pPr>
       <w:r>
-        <w:rPr>
-          <w:color w:val="000000"/>
-        </w:rPr>
-        <w:t>7 Анализ результатов и ограничения</w:t>
+        <w:t>Ограничения</w:t>
       </w:r>
     </w:p>
     <w:p>
@@ -3099,7 +2784,7 @@
         <w:widowControl/>
       </w:pPr>
       <w:r>
-        <w:t>Матрицы интерфейсов проверяют свойство транзитивности QueryInterface и общую identity. Баланс 345/345 при живых блоках 0 подтверждает освобождение отслеживаемых выделений данного прогона, включая детерминированные отказы. Это сильнее проверки только нормального разрушения, но не является доказательством отсутствия всех возможных дефектов.</w:t>
+        <w:t>Проверена macOS arm64. Бинарные сборки Windows/Linux/EcoOS не выполнялись; отсутствие официального ECO_TOOLCHAIN обозначается SKIPPED. В архиве нет Eco.StdIO.C89 arm64, поэтому стандартный вывод используется только консольными клиентами. Компоненты не содержат StdIOShim и не вызывают libc; платформенная зависимость dylib от libSystem проверяется отдельно от собственных неопределённых символов.</w:t>
       </w:r>
     </w:p>
     <w:p>
@@ -3107,7 +2792,7 @@
         <w:widowControl/>
       </w:pPr>
       <w:r>
-        <w:t>Dynamic-клиент подтверждает дополнительный сценарий: реальные библиотеки загружаются официальной шиной без статических лабораторных фабрик. Пустой runtime служит отрицательным контролем — клиент не способен выдать успешный результат без файлов компонентов.</w:t>
+        <w:t>На macOS arm64 long double имеет точность double. Непредставимые точно long отклоняются численным API с 1005. Horner ограничен целочисленными аргументами учебных калькуляторов; полный диапазон произвольных полиномов не заявляется.</w:t>
       </w:r>
     </w:p>
     <w:p>
@@ -3115,74 +2800,6 @@
         <w:pStyle w:val="Heading2"/>
       </w:pPr>
       <w:r>
-        <w:rPr>
-          <w:color w:val="000000"/>
-        </w:rPr>
-        <w:t>Независимое сравнение полиномиальной аппроксимации</w:t>
-      </w:r>
-    </w:p>
-    <w:p>
-      <w:pPr>
-        <w:widowControl/>
-      </w:pPr>
-      <w:r>
-        <w:t>Регрессионные результаты Lab1 сверены с SciPy 1.15.3 (scipy.linalg.lstsq), NumPy 2.1.3 (numpy.linalg.lstsq) и фактическим запуском MATLAB R2026b. Используются девять наборов данных для двух алгоритмов; SciPy и NumPy дают 36 сравнений массивов коэффициентов. MATLAB отдельно проверяет 18 результатов компонента. Сохранённые JSON, вывод и сравнения находятся в DesignFiles/Reference.</w:t>
-      </w:r>
-    </w:p>
-    <w:p>
-      <w:pPr>
-        <w:widowControl/>
-      </w:pPr>
-      <w:r>
-        <w:t>Сравниваются все коэффициенты с заранее заданными абсолютным и относительным допусками для каждого набора. Общий протокол обусловливания входной задачи записан в reference_cases.py; независимые библиотеки решают подготовленную задачу МНК. Наборы включают точные полиномы, шумную линейную зависимость, постоянную функцию и крайние масштабы. Эти эталоны проверяют численную часть и дополняют контрактные тесты ACOM.</w:t>
-      </w:r>
-    </w:p>
-    <w:p>
-      <w:pPr>
-        <w:pStyle w:val="Heading2"/>
-      </w:pPr>
-      <w:r>
-        <w:rPr>
-          <w:color w:val="000000"/>
-        </w:rPr>
-        <w:t>Ограничения платформы и проверки</w:t>
-      </w:r>
-    </w:p>
-    <w:p>
-      <w:pPr>
-        <w:pStyle w:val="ListBullet"/>
-        <w:widowControl/>
-      </w:pPr>
-      <w:r>
-        <w:t>Windows/Linux/EcoOS: списки исходников исправлены, но сборки этих платформ не заявляются выполненными. Без официального ECO_TOOLCHAIN матрица возвращает SKIPPED.</w:t>
-      </w:r>
-    </w:p>
-    <w:p>
-      <w:pPr>
-        <w:pStyle w:val="ListBullet"/>
-        <w:widowControl/>
-      </w:pPr>
-      <w:r>
-        <w:t>Официальной Eco.StdIO.C89 arm64 в архиве нет. Консольные клиенты используют stdio; компонент остаётся без прямых вызовов libc. macOS добавляет платформенную libSystem; собственные обращения контролируются nm -u.</w:t>
-      </w:r>
-    </w:p>
-    <w:p>
-      <w:pPr>
-        <w:pStyle w:val="ListBullet"/>
-        <w:widowControl/>
-      </w:pPr>
-      <w:r>
-        <w:t>В поставленной шине учтён порядок снятия регистрации: компоненты снимаются в обратном порядке, после начала снятия новые запросы не выполняются. Framework не исправляется локально.</w:t>
-      </w:r>
-    </w:p>
-    <w:p>
-      <w:pPr>
-        <w:pStyle w:val="Heading2"/>
-      </w:pPr>
-      <w:r>
-        <w:rPr>
-          <w:color w:val="000000"/>
-        </w:rPr>
         <w:t>Вывод</w:t>
       </w:r>
     </w:p>
@@ -3191,7 +2808,7 @@
         <w:widowControl/>
       </w:pPr>
       <w:r>
-        <w:t>Реализованы включение A–E в реальный граф вызовов, агрегирование B и внешнее агрегирование Eco.Lab1. Публичные интерфейсы получают через QueryInterface, а частное время жизни агрегатов управляется через неделегирующий unknown. Функциональность polyfit сохранена и прошла регрессионное и независимое сравнение. Условия максимального варианта подтверждены описанными сценариями на macOS arm64; окончательную оценку выставляет преподаватель.</w:t>
+        <w:t>Реализация демонстрирует требуемые механизмы включения и агрегирования, вложенный controlling unknown и заменяемость A/C. Клиент проверен отдельно от реализации серверов, операции вызывают реальные дочерние интерфейсы, а отрицательные сценарии дают ошибку. Архитектурное сравнение не ограничивается именами папок: проверены ABI, владение ссылками, загрузка и наблюдаемое поведение.</w:t>
       </w:r>
     </w:p>
     <w:p>
@@ -3200,7 +2817,7 @@
         <w:widowControl/>
       </w:pPr>
       <w:r>
-        <w:t>Источники: Задание_2.pdf, стр. 1–4; Eco.Education / 001.InsideACOM, Lesson03 (B), Lesson06 (D), Lesson07 (E); официальные заголовки IEcoUnknown, IEcoComponentFactory, IEcoInterfaceBus1, IEcoMemoryAllocator1. Репозиторий материалов: https://github.com/peerf-eco/Eco.Education. Системный промпт хранится отдельно в DesignFiles/Prompt и в отчёт не включён.</w:t>
+        <w:t>Источники: Задание_2.pdf; peerf-eco/Eco.Education, 001.InsideACOM; Zzzpize/EcoLab1 (commit указан в разделе 1); официальные заголовки Eco.Framework; исходники и логи этого проекта. Текст системного промпта хранится отдельно в DesignFiles/Prompt.</w:t>
       </w:r>
     </w:p>
     <w:sectPr>
@@ -3631,9 +3248,6 @@
       </w:tabs>
       <w:spacing w:after="0" w:line="240" w:lineRule="auto"/>
     </w:pPr>
-    <w:rPr>
-      <w:color w:val="000000"/>
-    </w:rPr>
   </w:style>
   <w:style w:type="character" w:customStyle="1" w:styleId="HeaderChar">
     <w:name w:val="Header Char"/>
@@ -3730,7 +3344,7 @@
       <w:rFonts w:asciiTheme="majorHAnsi" w:eastAsiaTheme="majorEastAsia" w:hAnsiTheme="majorHAnsi" w:cstheme="majorBidi"/>
       <w:b/>
       <w:bCs/>
-      <w:color w:val="000000"/>
+      <w:color w:val="4F81BD" w:themeColor="accent1"/>
     </w:rPr>
   </w:style>
   <w:style w:type="paragraph" w:styleId="Heading4">
@@ -4007,7 +3621,7 @@
       <w:rFonts w:asciiTheme="majorHAnsi" w:eastAsiaTheme="majorEastAsia" w:hAnsiTheme="majorHAnsi" w:cstheme="majorBidi"/>
       <w:i/>
       <w:iCs/>
-      <w:color w:val="000000"/>
+      <w:color w:val="4F81BD" w:themeColor="accent1"/>
       <w:spacing w:val="15"/>
       <w:sz w:val="24"/>
       <w:szCs w:val="24"/>

</xml_diff>

<commit_message>
Clean report references and explain Python tooling
</commit_message>
<xml_diff>
--- a/DesignFiles/Report/EcoLab2_Report.docx
+++ b/DesignFiles/Report/EcoLab2_Report.docx
@@ -534,7 +534,7 @@
         <w:widowControl/>
       </w:pPr>
       <w:r>
-        <w:t>Контракты проверены по InsideACOM и репозиторию Zzzpize/EcoLab1, commit 57d07171c5c92b492ac3f1fd48b93ce2155dd67c. Применены официальные целочисленные X/Y и CID A–E. Клиент собирается по неизменённым учебным заголовкам; собственное безопасное деление вынесено в отдельный интерфейс.</w:t>
+        <w:t>Контракты проверены по учебным интерфейсам InsideACOM. Применены официальные целочисленные X/Y и CID A–E. Клиент собирается по неизменённым учебным заголовкам; собственное безопасное деление вынесено в отдельный интерфейс.</w:t>
       </w:r>
     </w:p>
     <w:p>
@@ -2808,7 +2808,7 @@
         <w:widowControl/>
       </w:pPr>
       <w:r>
-        <w:t>Реализация демонстрирует требуемые механизмы включения и агрегирования, вложенный controlling unknown и заменяемость A/C. Клиент проверен отдельно от реализации серверов, операции вызывают реальные дочерние интерфейсы, а отрицательные сценарии дают ошибку. Архитектурное сравнение не ограничивается именами папок: проверены ABI, владение ссылками, загрузка и наблюдаемое поведение.</w:t>
+        <w:t>Реализация демонстрирует требуемые механизмы включения и агрегирования, вложенный controlling unknown и заменяемость A/C. Клиент проверен отдельно от реализации серверов, операции вызывают реальные дочерние интерфейсы, а отрицательные сценарии дают ошибку. Проверены ABI, владение ссылками, загрузка компонентов и наблюдаемое поведение.</w:t>
       </w:r>
     </w:p>
     <w:p>
@@ -2817,7 +2817,7 @@
         <w:widowControl/>
       </w:pPr>
       <w:r>
-        <w:t>Источники: Задание_2.pdf; peerf-eco/Eco.Education, 001.InsideACOM; Zzzpize/EcoLab1 (commit указан в разделе 1); официальные заголовки Eco.Framework; исходники и логи этого проекта. Текст системного промпта хранится отдельно в DesignFiles/Prompt.</w:t>
+        <w:t>Источники: Задание_2.pdf; peerf-eco/Eco.Education, 001.InsideACOM; официальные заголовки Eco.Framework; исходники и логи этого проекта. Текст системного промпта хранится отдельно в DesignFiles/Prompt.</w:t>
       </w:r>
     </w:p>
     <w:sectPr>

</xml_diff>